<commit_message>
Adding Laravel Octane with concurrency example
</commit_message>
<xml_diff>
--- a/Laravel/Laravel-notes-from-docs/Laravel-Notes-03.docx
+++ b/Laravel/Laravel-notes-from-docs/Laravel-Notes-03.docx
@@ -6,6 +6,7 @@
       <w:r>
         <w:rPr>
           <w:rFonts w:ascii="Sakkal Majalla" w:hAnsi="Sakkal Majalla" w:cs="Sakkal Majalla"/>
+          <w:noProof/>
           <w:sz w:val="28"/>
           <w:szCs w:val="28"/>
         </w:rPr>
@@ -57,6 +58,9 @@
     </w:p>
     <w:p>
       <w:r>
+        <w:rPr>
+          <w:noProof/>
+        </w:rPr>
         <w:drawing>
           <wp:inline distT="0" distB="0" distL="0" distR="0" wp14:anchorId="13440398" wp14:editId="05BEAEE8">
             <wp:extent cx="5943600" cy="830580"/>
@@ -101,6 +105,1396 @@
       <w:r>
         <w:t>=========================================</w:t>
       </w:r>
+    </w:p>
+    <w:p>
+      <w:r>
+        <w:drawing>
+          <wp:inline distT="0" distB="0" distL="0" distR="0" wp14:anchorId="5188854B" wp14:editId="6564E67B">
+            <wp:extent cx="5943600" cy="1487170"/>
+            <wp:effectExtent l="0" t="0" r="0" b="0"/>
+            <wp:docPr id="927682346" name="Picture 1"/>
+            <wp:cNvGraphicFramePr>
+              <a:graphicFrameLocks xmlns:a="http://schemas.openxmlformats.org/drawingml/2006/main" noChangeAspect="1"/>
+            </wp:cNvGraphicFramePr>
+            <a:graphic xmlns:a="http://schemas.openxmlformats.org/drawingml/2006/main">
+              <a:graphicData uri="http://schemas.openxmlformats.org/drawingml/2006/picture">
+                <pic:pic xmlns:pic="http://schemas.openxmlformats.org/drawingml/2006/picture">
+                  <pic:nvPicPr>
+                    <pic:cNvPr id="927682346" name=""/>
+                    <pic:cNvPicPr/>
+                  </pic:nvPicPr>
+                  <pic:blipFill>
+                    <a:blip r:embed="rId6"/>
+                    <a:stretch>
+                      <a:fillRect/>
+                    </a:stretch>
+                  </pic:blipFill>
+                  <pic:spPr>
+                    <a:xfrm>
+                      <a:off x="0" y="0"/>
+                      <a:ext cx="5943600" cy="1487170"/>
+                    </a:xfrm>
+                    <a:prstGeom prst="rect">
+                      <a:avLst/>
+                    </a:prstGeom>
+                  </pic:spPr>
+                </pic:pic>
+              </a:graphicData>
+            </a:graphic>
+          </wp:inline>
+        </w:drawing>
+      </w:r>
+    </w:p>
+    <w:p>
+      <w:pPr>
+        <w:ind w:left="720" w:firstLine="720"/>
+      </w:pPr>
+      <w:r>
+        <w:t>=========================================</w:t>
+      </w:r>
+    </w:p>
+    <w:p>
+      <w:pPr>
+        <w:rPr>
+          <w:rFonts w:ascii="Sakkal Majalla" w:hAnsi="Sakkal Majalla" w:cs="Sakkal Majalla"/>
+          <w:sz w:val="28"/>
+          <w:szCs w:val="28"/>
+        </w:rPr>
+      </w:pPr>
+      <w:r>
+        <w:rPr>
+          <w:rFonts w:ascii="Sakkal Majalla" w:hAnsi="Sakkal Majalla" w:cs="Sakkal Majalla"/>
+          <w:sz w:val="28"/>
+          <w:szCs w:val="28"/>
+        </w:rPr>
+        <w:t>T</w:t>
+      </w:r>
+      <w:r>
+        <w:rPr>
+          <w:rFonts w:ascii="Sakkal Majalla" w:hAnsi="Sakkal Majalla" w:cs="Sakkal Majalla"/>
+          <w:sz w:val="28"/>
+          <w:szCs w:val="28"/>
+        </w:rPr>
+        <w:t>o track the execution time</w:t>
+      </w:r>
+      <w:r>
+        <w:rPr>
+          <w:rFonts w:ascii="Sakkal Majalla" w:hAnsi="Sakkal Majalla" w:cs="Sakkal Majalla"/>
+          <w:sz w:val="28"/>
+          <w:szCs w:val="28"/>
+        </w:rPr>
+        <w:t>,</w:t>
+      </w:r>
+      <w:r>
+        <w:rPr>
+          <w:rFonts w:ascii="Sakkal Majalla" w:hAnsi="Sakkal Majalla" w:cs="Sakkal Majalla"/>
+          <w:sz w:val="28"/>
+          <w:szCs w:val="28"/>
+        </w:rPr>
+        <w:t xml:space="preserve"> </w:t>
+      </w:r>
+      <w:r>
+        <w:rPr>
+          <w:rFonts w:ascii="Sakkal Majalla" w:hAnsi="Sakkal Majalla" w:cs="Sakkal Majalla"/>
+          <w:sz w:val="28"/>
+          <w:szCs w:val="28"/>
+        </w:rPr>
+        <w:t>we can</w:t>
+      </w:r>
+      <w:r>
+        <w:rPr>
+          <w:rFonts w:ascii="Sakkal Majalla" w:hAnsi="Sakkal Majalla" w:cs="Sakkal Majalla"/>
+          <w:sz w:val="28"/>
+          <w:szCs w:val="28"/>
+        </w:rPr>
+        <w:t xml:space="preserve"> </w:t>
+      </w:r>
+      <w:r>
+        <w:rPr>
+          <w:rFonts w:ascii="Sakkal Majalla" w:hAnsi="Sakkal Majalla" w:cs="Sakkal Majalla"/>
+          <w:sz w:val="28"/>
+          <w:szCs w:val="28"/>
+        </w:rPr>
+        <w:t xml:space="preserve">use </w:t>
+      </w:r>
+      <w:r>
+        <w:rPr>
+          <w:rFonts w:ascii="Sakkal Majalla" w:hAnsi="Sakkal Majalla" w:cs="Sakkal Majalla"/>
+          <w:sz w:val="28"/>
+          <w:szCs w:val="28"/>
+        </w:rPr>
+        <w:t xml:space="preserve">the </w:t>
+      </w:r>
+      <w:proofErr w:type="gramStart"/>
+      <w:r>
+        <w:rPr>
+          <w:rFonts w:ascii="Sakkal Majalla" w:hAnsi="Sakkal Majalla" w:cs="Sakkal Majalla"/>
+          <w:sz w:val="28"/>
+          <w:szCs w:val="28"/>
+        </w:rPr>
+        <w:t>hrtime(</w:t>
+      </w:r>
+      <w:proofErr w:type="gramEnd"/>
+      <w:r>
+        <w:rPr>
+          <w:rFonts w:ascii="Sakkal Majalla" w:hAnsi="Sakkal Majalla" w:cs="Sakkal Majalla"/>
+          <w:sz w:val="28"/>
+          <w:szCs w:val="28"/>
+        </w:rPr>
+        <w:t>) function.</w:t>
+      </w:r>
+    </w:p>
+    <w:p>
+      <w:pPr>
+        <w:rPr>
+          <w:rFonts w:ascii="Sakkal Majalla" w:hAnsi="Sakkal Majalla" w:cs="Sakkal Majalla"/>
+          <w:sz w:val="28"/>
+          <w:szCs w:val="28"/>
+        </w:rPr>
+      </w:pPr>
+      <w:r>
+        <w:rPr>
+          <w:rFonts w:ascii="Sakkal Majalla" w:hAnsi="Sakkal Majalla" w:cs="Sakkal Majalla"/>
+          <w:sz w:val="28"/>
+          <w:szCs w:val="28"/>
+        </w:rPr>
+        <w:drawing>
+          <wp:inline distT="0" distB="0" distL="0" distR="0" wp14:anchorId="21166C06" wp14:editId="6E3A961C">
+            <wp:extent cx="5943600" cy="1248410"/>
+            <wp:effectExtent l="0" t="0" r="0" b="8890"/>
+            <wp:docPr id="232498854" name="Picture 1"/>
+            <wp:cNvGraphicFramePr>
+              <a:graphicFrameLocks xmlns:a="http://schemas.openxmlformats.org/drawingml/2006/main" noChangeAspect="1"/>
+            </wp:cNvGraphicFramePr>
+            <a:graphic xmlns:a="http://schemas.openxmlformats.org/drawingml/2006/main">
+              <a:graphicData uri="http://schemas.openxmlformats.org/drawingml/2006/picture">
+                <pic:pic xmlns:pic="http://schemas.openxmlformats.org/drawingml/2006/picture">
+                  <pic:nvPicPr>
+                    <pic:cNvPr id="232498854" name=""/>
+                    <pic:cNvPicPr/>
+                  </pic:nvPicPr>
+                  <pic:blipFill>
+                    <a:blip r:embed="rId7"/>
+                    <a:stretch>
+                      <a:fillRect/>
+                    </a:stretch>
+                  </pic:blipFill>
+                  <pic:spPr>
+                    <a:xfrm>
+                      <a:off x="0" y="0"/>
+                      <a:ext cx="5943600" cy="1248410"/>
+                    </a:xfrm>
+                    <a:prstGeom prst="rect">
+                      <a:avLst/>
+                    </a:prstGeom>
+                  </pic:spPr>
+                </pic:pic>
+              </a:graphicData>
+            </a:graphic>
+          </wp:inline>
+        </w:drawing>
+      </w:r>
+    </w:p>
+    <w:p>
+      <w:pPr>
+        <w:ind w:left="720" w:firstLine="720"/>
+      </w:pPr>
+      <w:r>
+        <w:t>=========================================</w:t>
+      </w:r>
+    </w:p>
+    <w:p>
+      <w:pPr>
+        <w:rPr>
+          <w:rFonts w:ascii="Sakkal Majalla" w:hAnsi="Sakkal Majalla" w:cs="Sakkal Majalla"/>
+          <w:sz w:val="28"/>
+          <w:szCs w:val="28"/>
+        </w:rPr>
+      </w:pPr>
+    </w:p>
+    <w:p>
+      <w:pPr>
+        <w:rPr>
+          <w:rFonts w:ascii="Sakkal Majalla" w:hAnsi="Sakkal Majalla" w:cs="Sakkal Majalla"/>
+          <w:sz w:val="28"/>
+          <w:szCs w:val="28"/>
+        </w:rPr>
+      </w:pPr>
+      <w:r>
+        <w:rPr>
+          <w:rFonts w:ascii="Sakkal Majalla" w:hAnsi="Sakkal Majalla" w:cs="Sakkal Majalla"/>
+          <w:sz w:val="28"/>
+          <w:szCs w:val="28"/>
+        </w:rPr>
+        <w:lastRenderedPageBreak/>
+        <w:t>To use concurrency with tasks</w:t>
+      </w:r>
+    </w:p>
+    <w:p>
+      <w:pPr>
+        <w:shd w:val="clear" w:color="auto" w:fill="FFFFFF"/>
+        <w:spacing w:after="0" w:line="285" w:lineRule="atLeast"/>
+        <w:rPr>
+          <w:rFonts w:ascii="Consolas" w:eastAsia="Times New Roman" w:hAnsi="Consolas" w:cs="Times New Roman"/>
+          <w:color w:val="3B3B3B"/>
+          <w:kern w:val="0"/>
+          <w:sz w:val="21"/>
+          <w:szCs w:val="21"/>
+          <w14:ligatures w14:val="none"/>
+        </w:rPr>
+      </w:pPr>
+      <w:r>
+        <w:rPr>
+          <w:rFonts w:ascii="Consolas" w:eastAsia="Times New Roman" w:hAnsi="Consolas" w:cs="Times New Roman"/>
+          <w:color w:val="0000FF"/>
+          <w:kern w:val="0"/>
+          <w:sz w:val="21"/>
+          <w:szCs w:val="21"/>
+          <w14:ligatures w14:val="none"/>
+        </w:rPr>
+        <w:t>use</w:t>
+      </w:r>
+      <w:r>
+        <w:rPr>
+          <w:rFonts w:ascii="Consolas" w:eastAsia="Times New Roman" w:hAnsi="Consolas" w:cs="Times New Roman"/>
+          <w:color w:val="000000"/>
+          <w:kern w:val="0"/>
+          <w:sz w:val="21"/>
+          <w:szCs w:val="21"/>
+          <w14:ligatures w14:val="none"/>
+        </w:rPr>
+        <w:t xml:space="preserve"> Laravel\Octane\Facades\</w:t>
+      </w:r>
+      <w:r>
+        <w:rPr>
+          <w:rFonts w:ascii="Consolas" w:eastAsia="Times New Roman" w:hAnsi="Consolas" w:cs="Times New Roman"/>
+          <w:color w:val="267F99"/>
+          <w:kern w:val="0"/>
+          <w:sz w:val="21"/>
+          <w:szCs w:val="21"/>
+          <w14:ligatures w14:val="none"/>
+        </w:rPr>
+        <w:t>Octane</w:t>
+      </w:r>
+      <w:r>
+        <w:rPr>
+          <w:rFonts w:ascii="Consolas" w:eastAsia="Times New Roman" w:hAnsi="Consolas" w:cs="Times New Roman"/>
+          <w:color w:val="000000"/>
+          <w:kern w:val="0"/>
+          <w:sz w:val="21"/>
+          <w:szCs w:val="21"/>
+          <w14:ligatures w14:val="none"/>
+        </w:rPr>
+        <w:t>;</w:t>
+      </w:r>
+    </w:p>
+    <w:p>
+      <w:pPr>
+        <w:shd w:val="clear" w:color="auto" w:fill="FFFFFF"/>
+        <w:spacing w:after="0" w:line="285" w:lineRule="atLeast"/>
+        <w:rPr>
+          <w:rFonts w:ascii="Consolas" w:eastAsia="Times New Roman" w:hAnsi="Consolas" w:cs="Times New Roman"/>
+          <w:color w:val="3B3B3B"/>
+          <w:kern w:val="0"/>
+          <w:sz w:val="21"/>
+          <w:szCs w:val="21"/>
+          <w14:ligatures w14:val="none"/>
+        </w:rPr>
+      </w:pPr>
+      <w:proofErr w:type="gramStart"/>
+      <w:r>
+        <w:rPr>
+          <w:rFonts w:ascii="Consolas" w:eastAsia="Times New Roman" w:hAnsi="Consolas" w:cs="Times New Roman"/>
+          <w:color w:val="267F99"/>
+          <w:kern w:val="0"/>
+          <w:sz w:val="21"/>
+          <w:szCs w:val="21"/>
+          <w14:ligatures w14:val="none"/>
+        </w:rPr>
+        <w:t>Route</w:t>
+      </w:r>
+      <w:r>
+        <w:rPr>
+          <w:rFonts w:ascii="Consolas" w:eastAsia="Times New Roman" w:hAnsi="Consolas" w:cs="Times New Roman"/>
+          <w:color w:val="000000"/>
+          <w:kern w:val="0"/>
+          <w:sz w:val="21"/>
+          <w:szCs w:val="21"/>
+          <w14:ligatures w14:val="none"/>
+        </w:rPr>
+        <w:t>::</w:t>
+      </w:r>
+      <w:r>
+        <w:rPr>
+          <w:rFonts w:ascii="Consolas" w:eastAsia="Times New Roman" w:hAnsi="Consolas" w:cs="Times New Roman"/>
+          <w:color w:val="795E26"/>
+          <w:kern w:val="0"/>
+          <w:sz w:val="21"/>
+          <w:szCs w:val="21"/>
+          <w14:ligatures w14:val="none"/>
+        </w:rPr>
+        <w:t>get</w:t>
+      </w:r>
+      <w:r>
+        <w:rPr>
+          <w:rFonts w:ascii="Consolas" w:eastAsia="Times New Roman" w:hAnsi="Consolas" w:cs="Times New Roman"/>
+          <w:color w:val="000000"/>
+          <w:kern w:val="0"/>
+          <w:sz w:val="21"/>
+          <w:szCs w:val="21"/>
+          <w14:ligatures w14:val="none"/>
+        </w:rPr>
+        <w:t>(</w:t>
+      </w:r>
+      <w:proofErr w:type="gramEnd"/>
+      <w:r>
+        <w:rPr>
+          <w:rFonts w:ascii="Consolas" w:eastAsia="Times New Roman" w:hAnsi="Consolas" w:cs="Times New Roman"/>
+          <w:color w:val="A31515"/>
+          <w:kern w:val="0"/>
+          <w:sz w:val="21"/>
+          <w:szCs w:val="21"/>
+          <w14:ligatures w14:val="none"/>
+        </w:rPr>
+        <w:t>'/concurrent-task'</w:t>
+      </w:r>
+      <w:r>
+        <w:rPr>
+          <w:rFonts w:ascii="Consolas" w:eastAsia="Times New Roman" w:hAnsi="Consolas" w:cs="Times New Roman"/>
+          <w:color w:val="000000"/>
+          <w:kern w:val="0"/>
+          <w:sz w:val="21"/>
+          <w:szCs w:val="21"/>
+          <w14:ligatures w14:val="none"/>
+        </w:rPr>
+        <w:t xml:space="preserve">, </w:t>
+      </w:r>
+      <w:r>
+        <w:rPr>
+          <w:rFonts w:ascii="Consolas" w:eastAsia="Times New Roman" w:hAnsi="Consolas" w:cs="Times New Roman"/>
+          <w:color w:val="0000FF"/>
+          <w:kern w:val="0"/>
+          <w:sz w:val="21"/>
+          <w:szCs w:val="21"/>
+          <w14:ligatures w14:val="none"/>
+        </w:rPr>
+        <w:t>function</w:t>
+      </w:r>
+      <w:r>
+        <w:rPr>
+          <w:rFonts w:ascii="Consolas" w:eastAsia="Times New Roman" w:hAnsi="Consolas" w:cs="Times New Roman"/>
+          <w:color w:val="000000"/>
+          <w:kern w:val="0"/>
+          <w:sz w:val="21"/>
+          <w:szCs w:val="21"/>
+          <w14:ligatures w14:val="none"/>
+        </w:rPr>
+        <w:t xml:space="preserve"> () {</w:t>
+      </w:r>
+    </w:p>
+    <w:p>
+      <w:pPr>
+        <w:shd w:val="clear" w:color="auto" w:fill="FFFFFF"/>
+        <w:spacing w:after="0" w:line="285" w:lineRule="atLeast"/>
+        <w:rPr>
+          <w:rFonts w:ascii="Consolas" w:eastAsia="Times New Roman" w:hAnsi="Consolas" w:cs="Times New Roman"/>
+          <w:color w:val="3B3B3B"/>
+          <w:kern w:val="0"/>
+          <w:sz w:val="21"/>
+          <w:szCs w:val="21"/>
+          <w14:ligatures w14:val="none"/>
+        </w:rPr>
+      </w:pPr>
+      <w:r>
+        <w:rPr>
+          <w:rFonts w:ascii="Consolas" w:eastAsia="Times New Roman" w:hAnsi="Consolas" w:cs="Times New Roman"/>
+          <w:color w:val="000000"/>
+          <w:kern w:val="0"/>
+          <w:sz w:val="21"/>
+          <w:szCs w:val="21"/>
+          <w14:ligatures w14:val="none"/>
+        </w:rPr>
+        <w:t xml:space="preserve">    </w:t>
+      </w:r>
+      <w:r>
+        <w:rPr>
+          <w:rFonts w:ascii="Consolas" w:eastAsia="Times New Roman" w:hAnsi="Consolas" w:cs="Times New Roman"/>
+          <w:color w:val="001080"/>
+          <w:kern w:val="0"/>
+          <w:sz w:val="21"/>
+          <w:szCs w:val="21"/>
+          <w14:ligatures w14:val="none"/>
+        </w:rPr>
+        <w:t>$start</w:t>
+      </w:r>
+      <w:r>
+        <w:rPr>
+          <w:rFonts w:ascii="Consolas" w:eastAsia="Times New Roman" w:hAnsi="Consolas" w:cs="Times New Roman"/>
+          <w:color w:val="000000"/>
+          <w:kern w:val="0"/>
+          <w:sz w:val="21"/>
+          <w:szCs w:val="21"/>
+          <w14:ligatures w14:val="none"/>
+        </w:rPr>
+        <w:t xml:space="preserve"> = </w:t>
+      </w:r>
+      <w:r>
+        <w:rPr>
+          <w:rFonts w:ascii="Consolas" w:eastAsia="Times New Roman" w:hAnsi="Consolas" w:cs="Times New Roman"/>
+          <w:color w:val="795E26"/>
+          <w:kern w:val="0"/>
+          <w:sz w:val="21"/>
+          <w:szCs w:val="21"/>
+          <w14:ligatures w14:val="none"/>
+        </w:rPr>
+        <w:t>hrtime</w:t>
+      </w:r>
+      <w:r>
+        <w:rPr>
+          <w:rFonts w:ascii="Consolas" w:eastAsia="Times New Roman" w:hAnsi="Consolas" w:cs="Times New Roman"/>
+          <w:color w:val="000000"/>
+          <w:kern w:val="0"/>
+          <w:sz w:val="21"/>
+          <w:szCs w:val="21"/>
+          <w14:ligatures w14:val="none"/>
+        </w:rPr>
+        <w:t>(</w:t>
+      </w:r>
+      <w:r>
+        <w:rPr>
+          <w:rFonts w:ascii="Consolas" w:eastAsia="Times New Roman" w:hAnsi="Consolas" w:cs="Times New Roman"/>
+          <w:color w:val="0000FF"/>
+          <w:kern w:val="0"/>
+          <w:sz w:val="21"/>
+          <w:szCs w:val="21"/>
+          <w14:ligatures w14:val="none"/>
+        </w:rPr>
+        <w:t>true</w:t>
+      </w:r>
+      <w:r>
+        <w:rPr>
+          <w:rFonts w:ascii="Consolas" w:eastAsia="Times New Roman" w:hAnsi="Consolas" w:cs="Times New Roman"/>
+          <w:color w:val="000000"/>
+          <w:kern w:val="0"/>
+          <w:sz w:val="21"/>
+          <w:szCs w:val="21"/>
+          <w14:ligatures w14:val="none"/>
+        </w:rPr>
+        <w:t>);</w:t>
+      </w:r>
+    </w:p>
+    <w:p>
+      <w:pPr>
+        <w:shd w:val="clear" w:color="auto" w:fill="FFFFFF"/>
+        <w:spacing w:after="0" w:line="285" w:lineRule="atLeast"/>
+        <w:rPr>
+          <w:rFonts w:ascii="Consolas" w:eastAsia="Times New Roman" w:hAnsi="Consolas" w:cs="Times New Roman"/>
+          <w:color w:val="3B3B3B"/>
+          <w:kern w:val="0"/>
+          <w:sz w:val="21"/>
+          <w:szCs w:val="21"/>
+          <w14:ligatures w14:val="none"/>
+        </w:rPr>
+      </w:pPr>
+      <w:r>
+        <w:rPr>
+          <w:rFonts w:ascii="Consolas" w:eastAsia="Times New Roman" w:hAnsi="Consolas" w:cs="Times New Roman"/>
+          <w:color w:val="000000"/>
+          <w:kern w:val="0"/>
+          <w:sz w:val="21"/>
+          <w:szCs w:val="21"/>
+          <w14:ligatures w14:val="none"/>
+        </w:rPr>
+        <w:t>    [</w:t>
+      </w:r>
+      <w:r>
+        <w:rPr>
+          <w:rFonts w:ascii="Consolas" w:eastAsia="Times New Roman" w:hAnsi="Consolas" w:cs="Times New Roman"/>
+          <w:color w:val="001080"/>
+          <w:kern w:val="0"/>
+          <w:sz w:val="21"/>
+          <w:szCs w:val="21"/>
+          <w14:ligatures w14:val="none"/>
+        </w:rPr>
+        <w:t>$result1</w:t>
+      </w:r>
+      <w:r>
+        <w:rPr>
+          <w:rFonts w:ascii="Consolas" w:eastAsia="Times New Roman" w:hAnsi="Consolas" w:cs="Times New Roman"/>
+          <w:color w:val="000000"/>
+          <w:kern w:val="0"/>
+          <w:sz w:val="21"/>
+          <w:szCs w:val="21"/>
+          <w14:ligatures w14:val="none"/>
+        </w:rPr>
+        <w:t xml:space="preserve">, </w:t>
+      </w:r>
+      <w:r>
+        <w:rPr>
+          <w:rFonts w:ascii="Consolas" w:eastAsia="Times New Roman" w:hAnsi="Consolas" w:cs="Times New Roman"/>
+          <w:color w:val="001080"/>
+          <w:kern w:val="0"/>
+          <w:sz w:val="21"/>
+          <w:szCs w:val="21"/>
+          <w14:ligatures w14:val="none"/>
+        </w:rPr>
+        <w:t>$result2</w:t>
+      </w:r>
+      <w:r>
+        <w:rPr>
+          <w:rFonts w:ascii="Consolas" w:eastAsia="Times New Roman" w:hAnsi="Consolas" w:cs="Times New Roman"/>
+          <w:color w:val="000000"/>
+          <w:kern w:val="0"/>
+          <w:sz w:val="21"/>
+          <w:szCs w:val="21"/>
+          <w14:ligatures w14:val="none"/>
+        </w:rPr>
+        <w:t xml:space="preserve">] = </w:t>
+      </w:r>
+      <w:proofErr w:type="gramStart"/>
+      <w:r>
+        <w:rPr>
+          <w:rFonts w:ascii="Consolas" w:eastAsia="Times New Roman" w:hAnsi="Consolas" w:cs="Times New Roman"/>
+          <w:color w:val="267F99"/>
+          <w:kern w:val="0"/>
+          <w:sz w:val="21"/>
+          <w:szCs w:val="21"/>
+          <w14:ligatures w14:val="none"/>
+        </w:rPr>
+        <w:t>Octane</w:t>
+      </w:r>
+      <w:r>
+        <w:rPr>
+          <w:rFonts w:ascii="Consolas" w:eastAsia="Times New Roman" w:hAnsi="Consolas" w:cs="Times New Roman"/>
+          <w:color w:val="000000"/>
+          <w:kern w:val="0"/>
+          <w:sz w:val="21"/>
+          <w:szCs w:val="21"/>
+          <w14:ligatures w14:val="none"/>
+        </w:rPr>
+        <w:t>::</w:t>
+      </w:r>
+      <w:r>
+        <w:rPr>
+          <w:rFonts w:ascii="Consolas" w:eastAsia="Times New Roman" w:hAnsi="Consolas" w:cs="Times New Roman"/>
+          <w:color w:val="795E26"/>
+          <w:kern w:val="0"/>
+          <w:sz w:val="21"/>
+          <w:szCs w:val="21"/>
+          <w14:ligatures w14:val="none"/>
+        </w:rPr>
+        <w:t>concurrently</w:t>
+      </w:r>
+      <w:r>
+        <w:rPr>
+          <w:rFonts w:ascii="Consolas" w:eastAsia="Times New Roman" w:hAnsi="Consolas" w:cs="Times New Roman"/>
+          <w:color w:val="000000"/>
+          <w:kern w:val="0"/>
+          <w:sz w:val="21"/>
+          <w:szCs w:val="21"/>
+          <w14:ligatures w14:val="none"/>
+        </w:rPr>
+        <w:t>(</w:t>
+      </w:r>
+      <w:proofErr w:type="gramEnd"/>
+      <w:r>
+        <w:rPr>
+          <w:rFonts w:ascii="Consolas" w:eastAsia="Times New Roman" w:hAnsi="Consolas" w:cs="Times New Roman"/>
+          <w:color w:val="000000"/>
+          <w:kern w:val="0"/>
+          <w:sz w:val="21"/>
+          <w:szCs w:val="21"/>
+          <w14:ligatures w14:val="none"/>
+        </w:rPr>
+        <w:t>[</w:t>
+      </w:r>
+    </w:p>
+    <w:p>
+      <w:pPr>
+        <w:shd w:val="clear" w:color="auto" w:fill="FFFFFF"/>
+        <w:spacing w:after="0" w:line="285" w:lineRule="atLeast"/>
+        <w:rPr>
+          <w:rFonts w:ascii="Consolas" w:eastAsia="Times New Roman" w:hAnsi="Consolas" w:cs="Times New Roman"/>
+          <w:color w:val="3B3B3B"/>
+          <w:kern w:val="0"/>
+          <w:sz w:val="21"/>
+          <w:szCs w:val="21"/>
+          <w14:ligatures w14:val="none"/>
+        </w:rPr>
+      </w:pPr>
+      <w:r>
+        <w:rPr>
+          <w:rFonts w:ascii="Consolas" w:eastAsia="Times New Roman" w:hAnsi="Consolas" w:cs="Times New Roman"/>
+          <w:color w:val="000000"/>
+          <w:kern w:val="0"/>
+          <w:sz w:val="21"/>
+          <w:szCs w:val="21"/>
+          <w14:ligatures w14:val="none"/>
+        </w:rPr>
+        <w:t xml:space="preserve">        </w:t>
+      </w:r>
+      <w:r>
+        <w:rPr>
+          <w:rFonts w:ascii="Consolas" w:eastAsia="Times New Roman" w:hAnsi="Consolas" w:cs="Times New Roman"/>
+          <w:color w:val="0000FF"/>
+          <w:kern w:val="0"/>
+          <w:sz w:val="21"/>
+          <w:szCs w:val="21"/>
+          <w14:ligatures w14:val="none"/>
+        </w:rPr>
+        <w:t>function</w:t>
+      </w:r>
+      <w:r>
+        <w:rPr>
+          <w:rFonts w:ascii="Consolas" w:eastAsia="Times New Roman" w:hAnsi="Consolas" w:cs="Times New Roman"/>
+          <w:color w:val="000000"/>
+          <w:kern w:val="0"/>
+          <w:sz w:val="21"/>
+          <w:szCs w:val="21"/>
+          <w14:ligatures w14:val="none"/>
+        </w:rPr>
+        <w:t xml:space="preserve"> () {</w:t>
+      </w:r>
+    </w:p>
+    <w:p>
+      <w:pPr>
+        <w:shd w:val="clear" w:color="auto" w:fill="FFFFFF"/>
+        <w:spacing w:after="0" w:line="285" w:lineRule="atLeast"/>
+        <w:rPr>
+          <w:rFonts w:ascii="Consolas" w:eastAsia="Times New Roman" w:hAnsi="Consolas" w:cs="Times New Roman"/>
+          <w:color w:val="3B3B3B"/>
+          <w:kern w:val="0"/>
+          <w:sz w:val="21"/>
+          <w:szCs w:val="21"/>
+          <w14:ligatures w14:val="none"/>
+        </w:rPr>
+      </w:pPr>
+      <w:r>
+        <w:rPr>
+          <w:rFonts w:ascii="Consolas" w:eastAsia="Times New Roman" w:hAnsi="Consolas" w:cs="Times New Roman"/>
+          <w:color w:val="000000"/>
+          <w:kern w:val="0"/>
+          <w:sz w:val="21"/>
+          <w:szCs w:val="21"/>
+          <w14:ligatures w14:val="none"/>
+        </w:rPr>
+        <w:t xml:space="preserve">            </w:t>
+      </w:r>
+      <w:proofErr w:type="gramStart"/>
+      <w:r>
+        <w:rPr>
+          <w:rFonts w:ascii="Consolas" w:eastAsia="Times New Roman" w:hAnsi="Consolas" w:cs="Times New Roman"/>
+          <w:color w:val="795E26"/>
+          <w:kern w:val="0"/>
+          <w:sz w:val="21"/>
+          <w:szCs w:val="21"/>
+          <w14:ligatures w14:val="none"/>
+        </w:rPr>
+        <w:t>sleep</w:t>
+      </w:r>
+      <w:r>
+        <w:rPr>
+          <w:rFonts w:ascii="Consolas" w:eastAsia="Times New Roman" w:hAnsi="Consolas" w:cs="Times New Roman"/>
+          <w:color w:val="000000"/>
+          <w:kern w:val="0"/>
+          <w:sz w:val="21"/>
+          <w:szCs w:val="21"/>
+          <w14:ligatures w14:val="none"/>
+        </w:rPr>
+        <w:t>(</w:t>
+      </w:r>
+      <w:proofErr w:type="gramEnd"/>
+      <w:r>
+        <w:rPr>
+          <w:rFonts w:ascii="Consolas" w:eastAsia="Times New Roman" w:hAnsi="Consolas" w:cs="Times New Roman"/>
+          <w:color w:val="098658"/>
+          <w:kern w:val="0"/>
+          <w:sz w:val="21"/>
+          <w:szCs w:val="21"/>
+          <w14:ligatures w14:val="none"/>
+        </w:rPr>
+        <w:t>2</w:t>
+      </w:r>
+      <w:r>
+        <w:rPr>
+          <w:rFonts w:ascii="Consolas" w:eastAsia="Times New Roman" w:hAnsi="Consolas" w:cs="Times New Roman"/>
+          <w:color w:val="000000"/>
+          <w:kern w:val="0"/>
+          <w:sz w:val="21"/>
+          <w:szCs w:val="21"/>
+          <w14:ligatures w14:val="none"/>
+        </w:rPr>
+        <w:t>);</w:t>
+      </w:r>
+    </w:p>
+    <w:p>
+      <w:pPr>
+        <w:shd w:val="clear" w:color="auto" w:fill="FFFFFF"/>
+        <w:spacing w:after="0" w:line="285" w:lineRule="atLeast"/>
+        <w:rPr>
+          <w:rFonts w:ascii="Consolas" w:eastAsia="Times New Roman" w:hAnsi="Consolas" w:cs="Times New Roman"/>
+          <w:color w:val="3B3B3B"/>
+          <w:kern w:val="0"/>
+          <w:sz w:val="21"/>
+          <w:szCs w:val="21"/>
+          <w14:ligatures w14:val="none"/>
+        </w:rPr>
+      </w:pPr>
+      <w:r>
+        <w:rPr>
+          <w:rFonts w:ascii="Consolas" w:eastAsia="Times New Roman" w:hAnsi="Consolas" w:cs="Times New Roman"/>
+          <w:color w:val="000000"/>
+          <w:kern w:val="0"/>
+          <w:sz w:val="21"/>
+          <w:szCs w:val="21"/>
+          <w14:ligatures w14:val="none"/>
+        </w:rPr>
+        <w:t xml:space="preserve">            </w:t>
+      </w:r>
+      <w:r>
+        <w:rPr>
+          <w:rFonts w:ascii="Consolas" w:eastAsia="Times New Roman" w:hAnsi="Consolas" w:cs="Times New Roman"/>
+          <w:color w:val="AF00DB"/>
+          <w:kern w:val="0"/>
+          <w:sz w:val="21"/>
+          <w:szCs w:val="21"/>
+          <w14:ligatures w14:val="none"/>
+        </w:rPr>
+        <w:t>return</w:t>
+      </w:r>
+      <w:r>
+        <w:rPr>
+          <w:rFonts w:ascii="Consolas" w:eastAsia="Times New Roman" w:hAnsi="Consolas" w:cs="Times New Roman"/>
+          <w:color w:val="000000"/>
+          <w:kern w:val="0"/>
+          <w:sz w:val="21"/>
+          <w:szCs w:val="21"/>
+          <w14:ligatures w14:val="none"/>
+        </w:rPr>
+        <w:t xml:space="preserve"> </w:t>
+      </w:r>
+      <w:r>
+        <w:rPr>
+          <w:rFonts w:ascii="Consolas" w:eastAsia="Times New Roman" w:hAnsi="Consolas" w:cs="Times New Roman"/>
+          <w:color w:val="A31515"/>
+          <w:kern w:val="0"/>
+          <w:sz w:val="21"/>
+          <w:szCs w:val="21"/>
+          <w14:ligatures w14:val="none"/>
+        </w:rPr>
+        <w:t>'Hello'</w:t>
+      </w:r>
+      <w:r>
+        <w:rPr>
+          <w:rFonts w:ascii="Consolas" w:eastAsia="Times New Roman" w:hAnsi="Consolas" w:cs="Times New Roman"/>
+          <w:color w:val="000000"/>
+          <w:kern w:val="0"/>
+          <w:sz w:val="21"/>
+          <w:szCs w:val="21"/>
+          <w14:ligatures w14:val="none"/>
+        </w:rPr>
+        <w:t>;</w:t>
+      </w:r>
+    </w:p>
+    <w:p>
+      <w:pPr>
+        <w:shd w:val="clear" w:color="auto" w:fill="FFFFFF"/>
+        <w:spacing w:after="0" w:line="285" w:lineRule="atLeast"/>
+        <w:rPr>
+          <w:rFonts w:ascii="Consolas" w:eastAsia="Times New Roman" w:hAnsi="Consolas" w:cs="Times New Roman"/>
+          <w:color w:val="3B3B3B"/>
+          <w:kern w:val="0"/>
+          <w:sz w:val="21"/>
+          <w:szCs w:val="21"/>
+          <w14:ligatures w14:val="none"/>
+        </w:rPr>
+      </w:pPr>
+      <w:r>
+        <w:rPr>
+          <w:rFonts w:ascii="Consolas" w:eastAsia="Times New Roman" w:hAnsi="Consolas" w:cs="Times New Roman"/>
+          <w:color w:val="000000"/>
+          <w:kern w:val="0"/>
+          <w:sz w:val="21"/>
+          <w:szCs w:val="21"/>
+          <w14:ligatures w14:val="none"/>
+        </w:rPr>
+        <w:t>        },</w:t>
+      </w:r>
+    </w:p>
+    <w:p>
+      <w:pPr>
+        <w:shd w:val="clear" w:color="auto" w:fill="FFFFFF"/>
+        <w:spacing w:after="0" w:line="285" w:lineRule="atLeast"/>
+        <w:rPr>
+          <w:rFonts w:ascii="Consolas" w:eastAsia="Times New Roman" w:hAnsi="Consolas" w:cs="Times New Roman"/>
+          <w:color w:val="3B3B3B"/>
+          <w:kern w:val="0"/>
+          <w:sz w:val="21"/>
+          <w:szCs w:val="21"/>
+          <w14:ligatures w14:val="none"/>
+        </w:rPr>
+      </w:pPr>
+      <w:r>
+        <w:rPr>
+          <w:rFonts w:ascii="Consolas" w:eastAsia="Times New Roman" w:hAnsi="Consolas" w:cs="Times New Roman"/>
+          <w:color w:val="000000"/>
+          <w:kern w:val="0"/>
+          <w:sz w:val="21"/>
+          <w:szCs w:val="21"/>
+          <w14:ligatures w14:val="none"/>
+        </w:rPr>
+        <w:t xml:space="preserve">        </w:t>
+      </w:r>
+      <w:r>
+        <w:rPr>
+          <w:rFonts w:ascii="Consolas" w:eastAsia="Times New Roman" w:hAnsi="Consolas" w:cs="Times New Roman"/>
+          <w:color w:val="0000FF"/>
+          <w:kern w:val="0"/>
+          <w:sz w:val="21"/>
+          <w:szCs w:val="21"/>
+          <w14:ligatures w14:val="none"/>
+        </w:rPr>
+        <w:t>function</w:t>
+      </w:r>
+      <w:r>
+        <w:rPr>
+          <w:rFonts w:ascii="Consolas" w:eastAsia="Times New Roman" w:hAnsi="Consolas" w:cs="Times New Roman"/>
+          <w:color w:val="000000"/>
+          <w:kern w:val="0"/>
+          <w:sz w:val="21"/>
+          <w:szCs w:val="21"/>
+          <w14:ligatures w14:val="none"/>
+        </w:rPr>
+        <w:t xml:space="preserve"> () {</w:t>
+      </w:r>
+    </w:p>
+    <w:p>
+      <w:pPr>
+        <w:shd w:val="clear" w:color="auto" w:fill="FFFFFF"/>
+        <w:spacing w:after="0" w:line="285" w:lineRule="atLeast"/>
+        <w:rPr>
+          <w:rFonts w:ascii="Consolas" w:eastAsia="Times New Roman" w:hAnsi="Consolas" w:cs="Times New Roman"/>
+          <w:color w:val="3B3B3B"/>
+          <w:kern w:val="0"/>
+          <w:sz w:val="21"/>
+          <w:szCs w:val="21"/>
+          <w14:ligatures w14:val="none"/>
+        </w:rPr>
+      </w:pPr>
+      <w:r>
+        <w:rPr>
+          <w:rFonts w:ascii="Consolas" w:eastAsia="Times New Roman" w:hAnsi="Consolas" w:cs="Times New Roman"/>
+          <w:color w:val="000000"/>
+          <w:kern w:val="0"/>
+          <w:sz w:val="21"/>
+          <w:szCs w:val="21"/>
+          <w14:ligatures w14:val="none"/>
+        </w:rPr>
+        <w:t xml:space="preserve">            </w:t>
+      </w:r>
+      <w:proofErr w:type="gramStart"/>
+      <w:r>
+        <w:rPr>
+          <w:rFonts w:ascii="Consolas" w:eastAsia="Times New Roman" w:hAnsi="Consolas" w:cs="Times New Roman"/>
+          <w:color w:val="795E26"/>
+          <w:kern w:val="0"/>
+          <w:sz w:val="21"/>
+          <w:szCs w:val="21"/>
+          <w14:ligatures w14:val="none"/>
+        </w:rPr>
+        <w:t>sleep</w:t>
+      </w:r>
+      <w:r>
+        <w:rPr>
+          <w:rFonts w:ascii="Consolas" w:eastAsia="Times New Roman" w:hAnsi="Consolas" w:cs="Times New Roman"/>
+          <w:color w:val="000000"/>
+          <w:kern w:val="0"/>
+          <w:sz w:val="21"/>
+          <w:szCs w:val="21"/>
+          <w14:ligatures w14:val="none"/>
+        </w:rPr>
+        <w:t>(</w:t>
+      </w:r>
+      <w:proofErr w:type="gramEnd"/>
+      <w:r>
+        <w:rPr>
+          <w:rFonts w:ascii="Consolas" w:eastAsia="Times New Roman" w:hAnsi="Consolas" w:cs="Times New Roman"/>
+          <w:color w:val="098658"/>
+          <w:kern w:val="0"/>
+          <w:sz w:val="21"/>
+          <w:szCs w:val="21"/>
+          <w14:ligatures w14:val="none"/>
+        </w:rPr>
+        <w:t>2</w:t>
+      </w:r>
+      <w:r>
+        <w:rPr>
+          <w:rFonts w:ascii="Consolas" w:eastAsia="Times New Roman" w:hAnsi="Consolas" w:cs="Times New Roman"/>
+          <w:color w:val="000000"/>
+          <w:kern w:val="0"/>
+          <w:sz w:val="21"/>
+          <w:szCs w:val="21"/>
+          <w14:ligatures w14:val="none"/>
+        </w:rPr>
+        <w:t>);</w:t>
+      </w:r>
+    </w:p>
+    <w:p>
+      <w:pPr>
+        <w:shd w:val="clear" w:color="auto" w:fill="FFFFFF"/>
+        <w:spacing w:after="0" w:line="285" w:lineRule="atLeast"/>
+        <w:rPr>
+          <w:rFonts w:ascii="Consolas" w:eastAsia="Times New Roman" w:hAnsi="Consolas" w:cs="Times New Roman"/>
+          <w:color w:val="3B3B3B"/>
+          <w:kern w:val="0"/>
+          <w:sz w:val="21"/>
+          <w:szCs w:val="21"/>
+          <w14:ligatures w14:val="none"/>
+        </w:rPr>
+      </w:pPr>
+      <w:r>
+        <w:rPr>
+          <w:rFonts w:ascii="Consolas" w:eastAsia="Times New Roman" w:hAnsi="Consolas" w:cs="Times New Roman"/>
+          <w:color w:val="000000"/>
+          <w:kern w:val="0"/>
+          <w:sz w:val="21"/>
+          <w:szCs w:val="21"/>
+          <w14:ligatures w14:val="none"/>
+        </w:rPr>
+        <w:t xml:space="preserve">            </w:t>
+      </w:r>
+      <w:r>
+        <w:rPr>
+          <w:rFonts w:ascii="Consolas" w:eastAsia="Times New Roman" w:hAnsi="Consolas" w:cs="Times New Roman"/>
+          <w:color w:val="AF00DB"/>
+          <w:kern w:val="0"/>
+          <w:sz w:val="21"/>
+          <w:szCs w:val="21"/>
+          <w14:ligatures w14:val="none"/>
+        </w:rPr>
+        <w:t>return</w:t>
+      </w:r>
+      <w:r>
+        <w:rPr>
+          <w:rFonts w:ascii="Consolas" w:eastAsia="Times New Roman" w:hAnsi="Consolas" w:cs="Times New Roman"/>
+          <w:color w:val="000000"/>
+          <w:kern w:val="0"/>
+          <w:sz w:val="21"/>
+          <w:szCs w:val="21"/>
+          <w14:ligatures w14:val="none"/>
+        </w:rPr>
+        <w:t xml:space="preserve"> </w:t>
+      </w:r>
+      <w:r>
+        <w:rPr>
+          <w:rFonts w:ascii="Consolas" w:eastAsia="Times New Roman" w:hAnsi="Consolas" w:cs="Times New Roman"/>
+          <w:color w:val="A31515"/>
+          <w:kern w:val="0"/>
+          <w:sz w:val="21"/>
+          <w:szCs w:val="21"/>
+          <w14:ligatures w14:val="none"/>
+        </w:rPr>
+        <w:t>'World'</w:t>
+      </w:r>
+      <w:r>
+        <w:rPr>
+          <w:rFonts w:ascii="Consolas" w:eastAsia="Times New Roman" w:hAnsi="Consolas" w:cs="Times New Roman"/>
+          <w:color w:val="000000"/>
+          <w:kern w:val="0"/>
+          <w:sz w:val="21"/>
+          <w:szCs w:val="21"/>
+          <w14:ligatures w14:val="none"/>
+        </w:rPr>
+        <w:t>;</w:t>
+      </w:r>
+    </w:p>
+    <w:p>
+      <w:pPr>
+        <w:shd w:val="clear" w:color="auto" w:fill="FFFFFF"/>
+        <w:spacing w:after="0" w:line="285" w:lineRule="atLeast"/>
+        <w:rPr>
+          <w:rFonts w:ascii="Consolas" w:eastAsia="Times New Roman" w:hAnsi="Consolas" w:cs="Times New Roman"/>
+          <w:color w:val="3B3B3B"/>
+          <w:kern w:val="0"/>
+          <w:sz w:val="21"/>
+          <w:szCs w:val="21"/>
+          <w14:ligatures w14:val="none"/>
+        </w:rPr>
+      </w:pPr>
+      <w:r>
+        <w:rPr>
+          <w:rFonts w:ascii="Consolas" w:eastAsia="Times New Roman" w:hAnsi="Consolas" w:cs="Times New Roman"/>
+          <w:color w:val="000000"/>
+          <w:kern w:val="0"/>
+          <w:sz w:val="21"/>
+          <w:szCs w:val="21"/>
+          <w14:ligatures w14:val="none"/>
+        </w:rPr>
+        <w:t>        },</w:t>
+      </w:r>
+    </w:p>
+    <w:p>
+      <w:pPr>
+        <w:shd w:val="clear" w:color="auto" w:fill="FFFFFF"/>
+        <w:spacing w:after="0" w:line="285" w:lineRule="atLeast"/>
+        <w:rPr>
+          <w:rFonts w:ascii="Consolas" w:eastAsia="Times New Roman" w:hAnsi="Consolas" w:cs="Times New Roman"/>
+          <w:color w:val="3B3B3B"/>
+          <w:kern w:val="0"/>
+          <w:sz w:val="21"/>
+          <w:szCs w:val="21"/>
+          <w14:ligatures w14:val="none"/>
+        </w:rPr>
+      </w:pPr>
+      <w:r>
+        <w:rPr>
+          <w:rFonts w:ascii="Consolas" w:eastAsia="Times New Roman" w:hAnsi="Consolas" w:cs="Times New Roman"/>
+          <w:color w:val="000000"/>
+          <w:kern w:val="0"/>
+          <w:sz w:val="21"/>
+          <w:szCs w:val="21"/>
+          <w14:ligatures w14:val="none"/>
+        </w:rPr>
+        <w:t>    ]);</w:t>
+      </w:r>
+    </w:p>
+    <w:p>
+      <w:pPr>
+        <w:shd w:val="clear" w:color="auto" w:fill="FFFFFF"/>
+        <w:spacing w:after="0" w:line="285" w:lineRule="atLeast"/>
+        <w:rPr>
+          <w:rFonts w:ascii="Consolas" w:eastAsia="Times New Roman" w:hAnsi="Consolas" w:cs="Times New Roman"/>
+          <w:color w:val="3B3B3B"/>
+          <w:kern w:val="0"/>
+          <w:sz w:val="21"/>
+          <w:szCs w:val="21"/>
+          <w14:ligatures w14:val="none"/>
+        </w:rPr>
+      </w:pPr>
+      <w:r>
+        <w:rPr>
+          <w:rFonts w:ascii="Consolas" w:eastAsia="Times New Roman" w:hAnsi="Consolas" w:cs="Times New Roman"/>
+          <w:color w:val="000000"/>
+          <w:kern w:val="0"/>
+          <w:sz w:val="21"/>
+          <w:szCs w:val="21"/>
+          <w14:ligatures w14:val="none"/>
+        </w:rPr>
+        <w:t xml:space="preserve">    </w:t>
+      </w:r>
+      <w:r>
+        <w:rPr>
+          <w:rFonts w:ascii="Consolas" w:eastAsia="Times New Roman" w:hAnsi="Consolas" w:cs="Times New Roman"/>
+          <w:color w:val="001080"/>
+          <w:kern w:val="0"/>
+          <w:sz w:val="21"/>
+          <w:szCs w:val="21"/>
+          <w14:ligatures w14:val="none"/>
+        </w:rPr>
+        <w:t>$end</w:t>
+      </w:r>
+      <w:r>
+        <w:rPr>
+          <w:rFonts w:ascii="Consolas" w:eastAsia="Times New Roman" w:hAnsi="Consolas" w:cs="Times New Roman"/>
+          <w:color w:val="000000"/>
+          <w:kern w:val="0"/>
+          <w:sz w:val="21"/>
+          <w:szCs w:val="21"/>
+          <w14:ligatures w14:val="none"/>
+        </w:rPr>
+        <w:t xml:space="preserve"> = </w:t>
+      </w:r>
+      <w:r>
+        <w:rPr>
+          <w:rFonts w:ascii="Consolas" w:eastAsia="Times New Roman" w:hAnsi="Consolas" w:cs="Times New Roman"/>
+          <w:color w:val="795E26"/>
+          <w:kern w:val="0"/>
+          <w:sz w:val="21"/>
+          <w:szCs w:val="21"/>
+          <w14:ligatures w14:val="none"/>
+        </w:rPr>
+        <w:t>hrtime</w:t>
+      </w:r>
+      <w:r>
+        <w:rPr>
+          <w:rFonts w:ascii="Consolas" w:eastAsia="Times New Roman" w:hAnsi="Consolas" w:cs="Times New Roman"/>
+          <w:color w:val="000000"/>
+          <w:kern w:val="0"/>
+          <w:sz w:val="21"/>
+          <w:szCs w:val="21"/>
+          <w14:ligatures w14:val="none"/>
+        </w:rPr>
+        <w:t>(</w:t>
+      </w:r>
+      <w:r>
+        <w:rPr>
+          <w:rFonts w:ascii="Consolas" w:eastAsia="Times New Roman" w:hAnsi="Consolas" w:cs="Times New Roman"/>
+          <w:color w:val="0000FF"/>
+          <w:kern w:val="0"/>
+          <w:sz w:val="21"/>
+          <w:szCs w:val="21"/>
+          <w14:ligatures w14:val="none"/>
+        </w:rPr>
+        <w:t>true</w:t>
+      </w:r>
+      <w:r>
+        <w:rPr>
+          <w:rFonts w:ascii="Consolas" w:eastAsia="Times New Roman" w:hAnsi="Consolas" w:cs="Times New Roman"/>
+          <w:color w:val="000000"/>
+          <w:kern w:val="0"/>
+          <w:sz w:val="21"/>
+          <w:szCs w:val="21"/>
+          <w14:ligatures w14:val="none"/>
+        </w:rPr>
+        <w:t>);</w:t>
+      </w:r>
+    </w:p>
+    <w:p>
+      <w:pPr>
+        <w:shd w:val="clear" w:color="auto" w:fill="FFFFFF"/>
+        <w:spacing w:after="0" w:line="285" w:lineRule="atLeast"/>
+        <w:rPr>
+          <w:rFonts w:ascii="Consolas" w:eastAsia="Times New Roman" w:hAnsi="Consolas" w:cs="Times New Roman"/>
+          <w:color w:val="3B3B3B"/>
+          <w:kern w:val="0"/>
+          <w:sz w:val="21"/>
+          <w:szCs w:val="21"/>
+          <w14:ligatures w14:val="none"/>
+        </w:rPr>
+      </w:pPr>
+      <w:r>
+        <w:rPr>
+          <w:rFonts w:ascii="Consolas" w:eastAsia="Times New Roman" w:hAnsi="Consolas" w:cs="Times New Roman"/>
+          <w:color w:val="000000"/>
+          <w:kern w:val="0"/>
+          <w:sz w:val="21"/>
+          <w:szCs w:val="21"/>
+          <w14:ligatures w14:val="none"/>
+        </w:rPr>
+        <w:t xml:space="preserve">    </w:t>
+      </w:r>
+      <w:r>
+        <w:rPr>
+          <w:rFonts w:ascii="Consolas" w:eastAsia="Times New Roman" w:hAnsi="Consolas" w:cs="Times New Roman"/>
+          <w:color w:val="AF00DB"/>
+          <w:kern w:val="0"/>
+          <w:sz w:val="21"/>
+          <w:szCs w:val="21"/>
+          <w14:ligatures w14:val="none"/>
+        </w:rPr>
+        <w:t>return</w:t>
+      </w:r>
+      <w:r>
+        <w:rPr>
+          <w:rFonts w:ascii="Consolas" w:eastAsia="Times New Roman" w:hAnsi="Consolas" w:cs="Times New Roman"/>
+          <w:color w:val="000000"/>
+          <w:kern w:val="0"/>
+          <w:sz w:val="21"/>
+          <w:szCs w:val="21"/>
+          <w14:ligatures w14:val="none"/>
+        </w:rPr>
+        <w:t xml:space="preserve"> </w:t>
+      </w:r>
+      <w:r>
+        <w:rPr>
+          <w:rFonts w:ascii="Consolas" w:eastAsia="Times New Roman" w:hAnsi="Consolas" w:cs="Times New Roman"/>
+          <w:color w:val="A31515"/>
+          <w:kern w:val="0"/>
+          <w:sz w:val="21"/>
+          <w:szCs w:val="21"/>
+          <w14:ligatures w14:val="none"/>
+        </w:rPr>
+        <w:t>"{</w:t>
+      </w:r>
+      <w:r>
+        <w:rPr>
+          <w:rFonts w:ascii="Consolas" w:eastAsia="Times New Roman" w:hAnsi="Consolas" w:cs="Times New Roman"/>
+          <w:color w:val="001080"/>
+          <w:kern w:val="0"/>
+          <w:sz w:val="21"/>
+          <w:szCs w:val="21"/>
+          <w14:ligatures w14:val="none"/>
+        </w:rPr>
+        <w:t>$result1</w:t>
+      </w:r>
+      <w:r>
+        <w:rPr>
+          <w:rFonts w:ascii="Consolas" w:eastAsia="Times New Roman" w:hAnsi="Consolas" w:cs="Times New Roman"/>
+          <w:color w:val="A31515"/>
+          <w:kern w:val="0"/>
+          <w:sz w:val="21"/>
+          <w:szCs w:val="21"/>
+          <w14:ligatures w14:val="none"/>
+        </w:rPr>
+        <w:t>} {</w:t>
+      </w:r>
+      <w:r>
+        <w:rPr>
+          <w:rFonts w:ascii="Consolas" w:eastAsia="Times New Roman" w:hAnsi="Consolas" w:cs="Times New Roman"/>
+          <w:color w:val="001080"/>
+          <w:kern w:val="0"/>
+          <w:sz w:val="21"/>
+          <w:szCs w:val="21"/>
+          <w14:ligatures w14:val="none"/>
+        </w:rPr>
+        <w:t>$result2</w:t>
+      </w:r>
+      <w:r>
+        <w:rPr>
+          <w:rFonts w:ascii="Consolas" w:eastAsia="Times New Roman" w:hAnsi="Consolas" w:cs="Times New Roman"/>
+          <w:color w:val="A31515"/>
+          <w:kern w:val="0"/>
+          <w:sz w:val="21"/>
+          <w:szCs w:val="21"/>
+          <w14:ligatures w14:val="none"/>
+        </w:rPr>
+        <w:t xml:space="preserve">} in </w:t>
+      </w:r>
+      <w:proofErr w:type="gramStart"/>
+      <w:r>
+        <w:rPr>
+          <w:rFonts w:ascii="Consolas" w:eastAsia="Times New Roman" w:hAnsi="Consolas" w:cs="Times New Roman"/>
+          <w:color w:val="A31515"/>
+          <w:kern w:val="0"/>
+          <w:sz w:val="21"/>
+          <w:szCs w:val="21"/>
+          <w14:ligatures w14:val="none"/>
+        </w:rPr>
+        <w:t>"</w:t>
+      </w:r>
+      <w:r>
+        <w:rPr>
+          <w:rFonts w:ascii="Consolas" w:eastAsia="Times New Roman" w:hAnsi="Consolas" w:cs="Times New Roman"/>
+          <w:color w:val="000000"/>
+          <w:kern w:val="0"/>
+          <w:sz w:val="21"/>
+          <w:szCs w:val="21"/>
+          <w14:ligatures w14:val="none"/>
+        </w:rPr>
+        <w:t>.(</w:t>
+      </w:r>
+      <w:proofErr w:type="gramEnd"/>
+      <w:r>
+        <w:rPr>
+          <w:rFonts w:ascii="Consolas" w:eastAsia="Times New Roman" w:hAnsi="Consolas" w:cs="Times New Roman"/>
+          <w:color w:val="001080"/>
+          <w:kern w:val="0"/>
+          <w:sz w:val="21"/>
+          <w:szCs w:val="21"/>
+          <w14:ligatures w14:val="none"/>
+        </w:rPr>
+        <w:t>$end</w:t>
+      </w:r>
+      <w:r>
+        <w:rPr>
+          <w:rFonts w:ascii="Consolas" w:eastAsia="Times New Roman" w:hAnsi="Consolas" w:cs="Times New Roman"/>
+          <w:color w:val="000000"/>
+          <w:kern w:val="0"/>
+          <w:sz w:val="21"/>
+          <w:szCs w:val="21"/>
+          <w14:ligatures w14:val="none"/>
+        </w:rPr>
+        <w:t xml:space="preserve"> - </w:t>
+      </w:r>
+      <w:r>
+        <w:rPr>
+          <w:rFonts w:ascii="Consolas" w:eastAsia="Times New Roman" w:hAnsi="Consolas" w:cs="Times New Roman"/>
+          <w:color w:val="001080"/>
+          <w:kern w:val="0"/>
+          <w:sz w:val="21"/>
+          <w:szCs w:val="21"/>
+          <w14:ligatures w14:val="none"/>
+        </w:rPr>
+        <w:t>$start</w:t>
+      </w:r>
+      <w:r>
+        <w:rPr>
+          <w:rFonts w:ascii="Consolas" w:eastAsia="Times New Roman" w:hAnsi="Consolas" w:cs="Times New Roman"/>
+          <w:color w:val="000000"/>
+          <w:kern w:val="0"/>
+          <w:sz w:val="21"/>
+          <w:szCs w:val="21"/>
+          <w14:ligatures w14:val="none"/>
+        </w:rPr>
+        <w:t>) /.</w:t>
+      </w:r>
+      <w:r>
+        <w:rPr>
+          <w:rFonts w:ascii="Consolas" w:eastAsia="Times New Roman" w:hAnsi="Consolas" w:cs="Times New Roman"/>
+          <w:color w:val="A31515"/>
+          <w:kern w:val="0"/>
+          <w:sz w:val="21"/>
+          <w:szCs w:val="21"/>
+          <w14:ligatures w14:val="none"/>
+        </w:rPr>
+        <w:t xml:space="preserve">' </w:t>
+      </w:r>
+      <w:proofErr w:type="gramStart"/>
+      <w:r>
+        <w:rPr>
+          <w:rFonts w:ascii="Consolas" w:eastAsia="Times New Roman" w:hAnsi="Consolas" w:cs="Times New Roman"/>
+          <w:color w:val="A31515"/>
+          <w:kern w:val="0"/>
+          <w:sz w:val="21"/>
+          <w:szCs w:val="21"/>
+          <w14:ligatures w14:val="none"/>
+        </w:rPr>
+        <w:t>seconds'</w:t>
+      </w:r>
+      <w:proofErr w:type="gramEnd"/>
+      <w:r>
+        <w:rPr>
+          <w:rFonts w:ascii="Consolas" w:eastAsia="Times New Roman" w:hAnsi="Consolas" w:cs="Times New Roman"/>
+          <w:color w:val="000000"/>
+          <w:kern w:val="0"/>
+          <w:sz w:val="21"/>
+          <w:szCs w:val="21"/>
+          <w14:ligatures w14:val="none"/>
+        </w:rPr>
+        <w:t>;</w:t>
+      </w:r>
+    </w:p>
+    <w:p>
+      <w:pPr>
+        <w:shd w:val="clear" w:color="auto" w:fill="FFFFFF"/>
+        <w:spacing w:after="0" w:line="285" w:lineRule="atLeast"/>
+        <w:rPr>
+          <w:rFonts w:ascii="Consolas" w:eastAsia="Times New Roman" w:hAnsi="Consolas" w:cs="Times New Roman"/>
+          <w:color w:val="3B3B3B"/>
+          <w:kern w:val="0"/>
+          <w:sz w:val="21"/>
+          <w:szCs w:val="21"/>
+          <w14:ligatures w14:val="none"/>
+        </w:rPr>
+      </w:pPr>
+      <w:r>
+        <w:rPr>
+          <w:rFonts w:ascii="Consolas" w:eastAsia="Times New Roman" w:hAnsi="Consolas" w:cs="Times New Roman"/>
+          <w:color w:val="000000"/>
+          <w:kern w:val="0"/>
+          <w:sz w:val="21"/>
+          <w:szCs w:val="21"/>
+          <w14:ligatures w14:val="none"/>
+        </w:rPr>
+        <w:t>});</w:t>
+      </w:r>
+    </w:p>
+    <w:p>
+      <w:pPr>
+        <w:ind w:left="720" w:firstLine="720"/>
+      </w:pPr>
+      <w:r>
+        <w:t>=========================================</w:t>
+      </w:r>
+    </w:p>
+    <w:p>
+      <w:pPr>
+        <w:rPr>
+          <w:rFonts w:ascii="Sakkal Majalla" w:hAnsi="Sakkal Majalla" w:cs="Sakkal Majalla"/>
+          <w:sz w:val="28"/>
+          <w:szCs w:val="28"/>
+        </w:rPr>
+      </w:pPr>
     </w:p>
     <w:sectPr>
       <w:pgSz w:w="12240" w:h="15840"/>
@@ -512,6 +1906,7 @@
   <w:style w:type="paragraph" w:default="1" w:styleId="Normal">
     <w:name w:val="Normal"/>
     <w:qFormat/>
+    <w:rsid w:val="00C2729D"/>
   </w:style>
   <w:style w:type="paragraph" w:styleId="Heading1">
     <w:name w:val="heading 1"/>
@@ -715,7 +2110,6 @@
   <w:style w:type="character" w:default="1" w:styleId="DefaultParagraphFont">
     <w:name w:val="Default Paragraph Font"/>
     <w:uiPriority w:val="1"/>
-    <w:semiHidden/>
     <w:unhideWhenUsed/>
   </w:style>
   <w:style w:type="table" w:default="1" w:styleId="TableNormal">

</xml_diff>

<commit_message>
Adding Laravel Notes for routes caching with Octane
</commit_message>
<xml_diff>
--- a/Laravel/Laravel-notes-from-docs/Laravel-Notes-03.docx
+++ b/Laravel/Laravel-notes-from-docs/Laravel-Notes-03.docx
@@ -226,7 +226,25 @@
           <w:sz w:val="28"/>
           <w:szCs w:val="28"/>
         </w:rPr>
-        <w:t>the hrtime() function.</w:t>
+        <w:t xml:space="preserve">the </w:t>
+      </w:r>
+      <w:proofErr w:type="gramStart"/>
+      <w:r>
+        <w:rPr>
+          <w:rFonts w:ascii="Sakkal Majalla" w:hAnsi="Sakkal Majalla" w:cs="Sakkal Majalla"/>
+          <w:sz w:val="28"/>
+          <w:szCs w:val="28"/>
+        </w:rPr>
+        <w:t>hrtime(</w:t>
+      </w:r>
+      <w:proofErr w:type="gramEnd"/>
+      <w:r>
+        <w:rPr>
+          <w:rFonts w:ascii="Sakkal Majalla" w:hAnsi="Sakkal Majalla" w:cs="Sakkal Majalla"/>
+          <w:sz w:val="28"/>
+          <w:szCs w:val="28"/>
+        </w:rPr>
+        <w:t>) function.</w:t>
       </w:r>
     </w:p>
     <w:p>
@@ -387,6 +405,7 @@
           <w14:ligatures w14:val="none"/>
         </w:rPr>
       </w:pPr>
+      <w:proofErr w:type="gramStart"/>
       <w:r>
         <w:rPr>
           <w:rFonts w:ascii="Consolas" w:eastAsia="Times New Roman" w:hAnsi="Consolas" w:cs="Times New Roman"/>
@@ -431,6 +450,7 @@
         </w:rPr>
         <w:t>(</w:t>
       </w:r>
+      <w:proofErr w:type="gramEnd"/>
       <w:r>
         <w:rPr>
           <w:rFonts w:ascii="Consolas" w:eastAsia="Times New Roman" w:hAnsi="Consolas" w:cs="Times New Roman"/>
@@ -635,6 +655,7 @@
         </w:rPr>
         <w:t xml:space="preserve">] = </w:t>
       </w:r>
+      <w:proofErr w:type="gramStart"/>
       <w:r>
         <w:rPr>
           <w:rFonts w:ascii="Consolas" w:eastAsia="Times New Roman" w:hAnsi="Consolas" w:cs="Times New Roman"/>
@@ -677,7 +698,19 @@
           <w:szCs w:val="21"/>
           <w14:ligatures w14:val="none"/>
         </w:rPr>
-        <w:t>([</w:t>
+        <w:t>(</w:t>
+      </w:r>
+      <w:proofErr w:type="gramEnd"/>
+      <w:r>
+        <w:rPr>
+          <w:rFonts w:ascii="Consolas" w:eastAsia="Times New Roman" w:hAnsi="Consolas" w:cs="Times New Roman"/>
+          <w:color w:val="000000"/>
+          <w:kern w:val="0"/>
+          <w:sz w:val="21"/>
+          <w:szCs w:val="21"/>
+          <w14:ligatures w14:val="none"/>
+        </w:rPr>
+        <w:t>[</w:t>
       </w:r>
     </w:p>
     <w:p>
@@ -751,6 +784,7 @@
         </w:rPr>
         <w:t xml:space="preserve">            </w:t>
       </w:r>
+      <w:proofErr w:type="gramStart"/>
       <w:r>
         <w:rPr>
           <w:rFonts w:ascii="Consolas" w:eastAsia="Times New Roman" w:hAnsi="Consolas" w:cs="Times New Roman"/>
@@ -773,6 +807,7 @@
         </w:rPr>
         <w:t>(</w:t>
       </w:r>
+      <w:proofErr w:type="gramEnd"/>
       <w:r>
         <w:rPr>
           <w:rFonts w:ascii="Consolas" w:eastAsia="Times New Roman" w:hAnsi="Consolas" w:cs="Times New Roman"/>
@@ -961,6 +996,7 @@
         </w:rPr>
         <w:t xml:space="preserve">            </w:t>
       </w:r>
+      <w:proofErr w:type="gramStart"/>
       <w:r>
         <w:rPr>
           <w:rFonts w:ascii="Consolas" w:eastAsia="Times New Roman" w:hAnsi="Consolas" w:cs="Times New Roman"/>
@@ -983,6 +1019,7 @@
         </w:rPr>
         <w:t>(</w:t>
       </w:r>
+      <w:proofErr w:type="gramEnd"/>
       <w:r>
         <w:rPr>
           <w:rFonts w:ascii="Consolas" w:eastAsia="Times New Roman" w:hAnsi="Consolas" w:cs="Times New Roman"/>
@@ -1315,7 +1352,19 @@
           <w:szCs w:val="21"/>
           <w14:ligatures w14:val="none"/>
         </w:rPr>
-        <w:t>} in "</w:t>
+        <w:t xml:space="preserve">} in </w:t>
+      </w:r>
+      <w:proofErr w:type="gramStart"/>
+      <w:r>
+        <w:rPr>
+          <w:rFonts w:ascii="Consolas" w:eastAsia="Times New Roman" w:hAnsi="Consolas" w:cs="Times New Roman"/>
+          <w:color w:val="A31515"/>
+          <w:kern w:val="0"/>
+          <w:sz w:val="21"/>
+          <w:szCs w:val="21"/>
+          <w14:ligatures w14:val="none"/>
+        </w:rPr>
+        <w:t>"</w:t>
       </w:r>
       <w:r>
         <w:rPr>
@@ -1328,6 +1377,7 @@
         </w:rPr>
         <w:t>.(</w:t>
       </w:r>
+      <w:proofErr w:type="gramEnd"/>
       <w:r>
         <w:rPr>
           <w:rFonts w:ascii="Consolas" w:eastAsia="Times New Roman" w:hAnsi="Consolas" w:cs="Times New Roman"/>
@@ -1381,8 +1431,21 @@
           <w:szCs w:val="21"/>
           <w14:ligatures w14:val="none"/>
         </w:rPr>
-        <w:t>' seconds'</w:t>
-      </w:r>
+        <w:t xml:space="preserve">' </w:t>
+      </w:r>
+      <w:proofErr w:type="gramStart"/>
+      <w:r>
+        <w:rPr>
+          <w:rFonts w:ascii="Consolas" w:eastAsia="Times New Roman" w:hAnsi="Consolas" w:cs="Times New Roman"/>
+          <w:color w:val="A31515"/>
+          <w:kern w:val="0"/>
+          <w:sz w:val="21"/>
+          <w:szCs w:val="21"/>
+          <w14:ligatures w14:val="none"/>
+        </w:rPr>
+        <w:t>seconds'</w:t>
+      </w:r>
+      <w:proofErr w:type="gramEnd"/>
       <w:r>
         <w:rPr>
           <w:rFonts w:ascii="Consolas" w:eastAsia="Times New Roman" w:hAnsi="Consolas" w:cs="Times New Roman"/>
@@ -1444,6 +1507,7 @@
         </w:rPr>
         <w:t xml:space="preserve">With Swoole, you can use the </w:t>
       </w:r>
+      <w:proofErr w:type="gramStart"/>
       <w:r>
         <w:rPr>
           <w:rFonts w:ascii="Sakkal Majalla" w:hAnsi="Sakkal Majalla" w:cs="Sakkal Majalla"/>
@@ -1480,7 +1544,16 @@
           <w:sz w:val="28"/>
           <w:szCs w:val="28"/>
         </w:rPr>
-        <w:t>() function, where you can provide a name (</w:t>
+        <w:t>(</w:t>
+      </w:r>
+      <w:proofErr w:type="gramEnd"/>
+      <w:r>
+        <w:rPr>
+          <w:rFonts w:ascii="Sakkal Majalla" w:hAnsi="Sakkal Majalla" w:cs="Sakkal Majalla"/>
+          <w:sz w:val="28"/>
+          <w:szCs w:val="28"/>
+        </w:rPr>
+        <w:t>) function, where you can provide a name (</w:t>
       </w:r>
       <w:r>
         <w:rPr>
@@ -1863,6 +1936,7 @@
         </w:rPr>
         <w:t xml:space="preserve"> </w:t>
       </w:r>
+      <w:proofErr w:type="gramStart"/>
       <w:r>
         <w:rPr>
           <w:rFonts w:ascii="Consolas" w:eastAsia="Times New Roman" w:hAnsi="Consolas" w:cs="Times New Roman"/>
@@ -1883,7 +1957,19 @@
           <w:szCs w:val="21"/>
           <w14:ligatures w14:val="none"/>
         </w:rPr>
-        <w:t xml:space="preserve">(): </w:t>
+        <w:t>(</w:t>
+      </w:r>
+      <w:proofErr w:type="gramEnd"/>
+      <w:r>
+        <w:rPr>
+          <w:rFonts w:ascii="Consolas" w:eastAsia="Times New Roman" w:hAnsi="Consolas" w:cs="Times New Roman"/>
+          <w:color w:val="000000"/>
+          <w:kern w:val="0"/>
+          <w:sz w:val="21"/>
+          <w:szCs w:val="21"/>
+          <w14:ligatures w14:val="none"/>
+        </w:rPr>
+        <w:t xml:space="preserve">): </w:t>
       </w:r>
       <w:r>
         <w:rPr>
@@ -1946,6 +2032,7 @@
         </w:rPr>
         <w:t xml:space="preserve">        </w:t>
       </w:r>
+      <w:proofErr w:type="gramStart"/>
       <w:r>
         <w:rPr>
           <w:rFonts w:ascii="Consolas" w:eastAsia="Times New Roman" w:hAnsi="Consolas" w:cs="Times New Roman"/>
@@ -1990,6 +2077,7 @@
         </w:rPr>
         <w:t>(</w:t>
       </w:r>
+      <w:proofErr w:type="gramEnd"/>
     </w:p>
     <w:p>
       <w:pPr>
@@ -2024,7 +2112,31 @@
           <w:szCs w:val="21"/>
           <w14:ligatures w14:val="none"/>
         </w:rPr>
-        <w:t>'simple-ticker'</w:t>
+        <w:t>'</w:t>
+      </w:r>
+      <w:proofErr w:type="gramStart"/>
+      <w:r>
+        <w:rPr>
+          <w:rFonts w:ascii="Consolas" w:eastAsia="Times New Roman" w:hAnsi="Consolas" w:cs="Times New Roman"/>
+          <w:color w:val="A31515"/>
+          <w:kern w:val="0"/>
+          <w:sz w:val="21"/>
+          <w:szCs w:val="21"/>
+          <w14:ligatures w14:val="none"/>
+        </w:rPr>
+        <w:t>simple</w:t>
+      </w:r>
+      <w:proofErr w:type="gramEnd"/>
+      <w:r>
+        <w:rPr>
+          <w:rFonts w:ascii="Consolas" w:eastAsia="Times New Roman" w:hAnsi="Consolas" w:cs="Times New Roman"/>
+          <w:color w:val="A31515"/>
+          <w:kern w:val="0"/>
+          <w:sz w:val="21"/>
+          <w:szCs w:val="21"/>
+          <w14:ligatures w14:val="none"/>
+        </w:rPr>
+        <w:t>-ticker'</w:t>
       </w:r>
       <w:r>
         <w:rPr>
@@ -2059,6 +2171,7 @@
         </w:rPr>
         <w:t xml:space="preserve"> () =&gt; </w:t>
       </w:r>
+      <w:proofErr w:type="gramStart"/>
       <w:r>
         <w:rPr>
           <w:rFonts w:ascii="Consolas" w:eastAsia="Times New Roman" w:hAnsi="Consolas" w:cs="Times New Roman"/>
@@ -2103,6 +2216,7 @@
         </w:rPr>
         <w:t>(</w:t>
       </w:r>
+      <w:proofErr w:type="gramEnd"/>
       <w:r>
         <w:rPr>
           <w:rFonts w:ascii="Consolas" w:eastAsia="Times New Roman" w:hAnsi="Consolas" w:cs="Times New Roman"/>
@@ -2147,6 +2261,7 @@
         </w:rPr>
         <w:t xml:space="preserve"> =&gt; </w:t>
       </w:r>
+      <w:proofErr w:type="gramStart"/>
       <w:r>
         <w:rPr>
           <w:rFonts w:ascii="Consolas" w:eastAsia="Times New Roman" w:hAnsi="Consolas" w:cs="Times New Roman"/>
@@ -2167,7 +2282,19 @@
           <w:szCs w:val="21"/>
           <w14:ligatures w14:val="none"/>
         </w:rPr>
-        <w:t>()])</w:t>
+        <w:t>(</w:t>
+      </w:r>
+      <w:proofErr w:type="gramEnd"/>
+      <w:r>
+        <w:rPr>
+          <w:rFonts w:ascii="Consolas" w:eastAsia="Times New Roman" w:hAnsi="Consolas" w:cs="Times New Roman"/>
+          <w:color w:val="000000"/>
+          <w:kern w:val="0"/>
+          <w:sz w:val="21"/>
+          <w:szCs w:val="21"/>
+          <w14:ligatures w14:val="none"/>
+        </w:rPr>
+        <w:t>)])</w:t>
       </w:r>
     </w:p>
     <w:p>
@@ -2194,6 +2321,7 @@
         </w:rPr>
         <w:t>        ) -&gt;</w:t>
       </w:r>
+      <w:proofErr w:type="gramStart"/>
       <w:r>
         <w:rPr>
           <w:rFonts w:ascii="Consolas" w:eastAsia="Times New Roman" w:hAnsi="Consolas" w:cs="Times New Roman"/>
@@ -2216,6 +2344,7 @@
         </w:rPr>
         <w:t>(</w:t>
       </w:r>
+      <w:proofErr w:type="gramEnd"/>
       <w:r>
         <w:rPr>
           <w:rFonts w:ascii="Consolas" w:eastAsia="Times New Roman" w:hAnsi="Consolas" w:cs="Times New Roman"/>
@@ -2238,6 +2367,7 @@
         </w:rPr>
         <w:t>) -&gt;</w:t>
       </w:r>
+      <w:proofErr w:type="gramStart"/>
       <w:r>
         <w:rPr>
           <w:rFonts w:ascii="Consolas" w:eastAsia="Times New Roman" w:hAnsi="Consolas" w:cs="Times New Roman"/>
@@ -2258,7 +2388,19 @@
           <w:szCs w:val="21"/>
           <w14:ligatures w14:val="none"/>
         </w:rPr>
-        <w:t>();</w:t>
+        <w:t>(</w:t>
+      </w:r>
+      <w:proofErr w:type="gramEnd"/>
+      <w:r>
+        <w:rPr>
+          <w:rFonts w:ascii="Consolas" w:eastAsia="Times New Roman" w:hAnsi="Consolas" w:cs="Times New Roman"/>
+          <w:color w:val="000000"/>
+          <w:kern w:val="0"/>
+          <w:sz w:val="21"/>
+          <w:szCs w:val="21"/>
+          <w14:ligatures w14:val="none"/>
+        </w:rPr>
+        <w:t>);</w:t>
       </w:r>
     </w:p>
     <w:p>
@@ -2368,6 +2510,7 @@
         <w:lastRenderedPageBreak/>
         <w:t xml:space="preserve">The </w:t>
       </w:r>
+      <w:proofErr w:type="gramStart"/>
       <w:r>
         <w:rPr>
           <w:rFonts w:ascii="Sakkal Majalla" w:hAnsi="Sakkal Majalla" w:cs="Sakkal Majalla"/>
@@ -2404,7 +2547,16 @@
           <w:sz w:val="28"/>
           <w:szCs w:val="28"/>
         </w:rPr>
-        <w:t xml:space="preserve">() method returns the InvokeTickCallable object that implements a few methods: </w:t>
+        <w:t>(</w:t>
+      </w:r>
+      <w:proofErr w:type="gramEnd"/>
+      <w:r>
+        <w:rPr>
+          <w:rFonts w:ascii="Sakkal Majalla" w:hAnsi="Sakkal Majalla" w:cs="Sakkal Majalla"/>
+          <w:sz w:val="28"/>
+          <w:szCs w:val="28"/>
+        </w:rPr>
+        <w:t xml:space="preserve">) method returns the InvokeTickCallable object that implements a few methods: </w:t>
       </w:r>
     </w:p>
     <w:p>
@@ -2661,6 +2813,7 @@
         </w:rPr>
         <w:t xml:space="preserve"> you can use </w:t>
       </w:r>
+      <w:proofErr w:type="gramStart"/>
       <w:r>
         <w:rPr>
           <w:rFonts w:ascii="Sakkal Majalla" w:hAnsi="Sakkal Majalla" w:cs="Sakkal Majalla"/>
@@ -2680,6 +2833,7 @@
         </w:rPr>
         <w:t>::</w:t>
       </w:r>
+      <w:proofErr w:type="gramEnd"/>
       <w:r>
         <w:rPr>
           <w:rFonts w:ascii="Sakkal Majalla" w:hAnsi="Sakkal Majalla" w:cs="Sakkal Majalla"/>
@@ -2718,6 +2872,7 @@
         </w:rPr>
         <w:t xml:space="preserve">). Once you have the instance, you can use the </w:t>
       </w:r>
+      <w:proofErr w:type="gramStart"/>
       <w:r>
         <w:rPr>
           <w:rFonts w:ascii="Sakkal Majalla" w:hAnsi="Sakkal Majalla" w:cs="Sakkal Majalla"/>
@@ -2735,31 +2890,40 @@
           <w:sz w:val="28"/>
           <w:szCs w:val="28"/>
         </w:rPr>
-        <w:t>() method to store the new value.</w:t>
-      </w:r>
-    </w:p>
-    <w:p>
-      <w:pPr>
-        <w:ind w:left="720" w:firstLine="720"/>
-      </w:pPr>
-      <w:r>
-        <w:t>=========================================</w:t>
-      </w:r>
-    </w:p>
-    <w:p>
-      <w:pPr>
+        <w:t>(</w:t>
+      </w:r>
+      <w:proofErr w:type="gramEnd"/>
+      <w:r>
         <w:rPr>
           <w:rFonts w:ascii="Sakkal Majalla" w:hAnsi="Sakkal Majalla" w:cs="Sakkal Majalla"/>
           <w:sz w:val="28"/>
           <w:szCs w:val="28"/>
         </w:rPr>
-      </w:pPr>
-      <w:r>
+        <w:t>) method to store the new value.</w:t>
+      </w:r>
+    </w:p>
+    <w:p>
+      <w:pPr>
+        <w:ind w:left="720" w:firstLine="720"/>
+      </w:pPr>
+      <w:r>
+        <w:t>=========================================</w:t>
+      </w:r>
+    </w:p>
+    <w:p>
+      <w:pPr>
         <w:rPr>
           <w:rFonts w:ascii="Sakkal Majalla" w:hAnsi="Sakkal Majalla" w:cs="Sakkal Majalla"/>
           <w:sz w:val="28"/>
           <w:szCs w:val="28"/>
         </w:rPr>
+      </w:pPr>
+      <w:r>
+        <w:rPr>
+          <w:rFonts w:ascii="Sakkal Majalla" w:hAnsi="Sakkal Majalla" w:cs="Sakkal Majalla"/>
+          <w:sz w:val="28"/>
+          <w:szCs w:val="28"/>
+        </w:rPr>
         <w:t>For using caching with Octane using the Swoole Tables:</w:t>
       </w:r>
     </w:p>
@@ -3193,6 +3357,7 @@
         </w:rPr>
         <w:t xml:space="preserve"> </w:t>
       </w:r>
+      <w:proofErr w:type="gramStart"/>
       <w:r>
         <w:rPr>
           <w:rFonts w:ascii="Consolas" w:eastAsia="Times New Roman" w:hAnsi="Consolas" w:cs="Times New Roman"/>
@@ -3213,7 +3378,19 @@
           <w:szCs w:val="21"/>
           <w14:ligatures w14:val="none"/>
         </w:rPr>
-        <w:t xml:space="preserve">(): </w:t>
+        <w:t>(</w:t>
+      </w:r>
+      <w:proofErr w:type="gramEnd"/>
+      <w:r>
+        <w:rPr>
+          <w:rFonts w:ascii="Consolas" w:eastAsia="Times New Roman" w:hAnsi="Consolas" w:cs="Times New Roman"/>
+          <w:color w:val="000000"/>
+          <w:kern w:val="0"/>
+          <w:sz w:val="21"/>
+          <w:szCs w:val="21"/>
+          <w14:ligatures w14:val="none"/>
+        </w:rPr>
+        <w:t xml:space="preserve">): </w:t>
       </w:r>
       <w:r>
         <w:rPr>
@@ -3276,6 +3453,7 @@
         </w:rPr>
         <w:t xml:space="preserve">        </w:t>
       </w:r>
+      <w:proofErr w:type="gramStart"/>
       <w:r>
         <w:rPr>
           <w:rFonts w:ascii="Consolas" w:eastAsia="Times New Roman" w:hAnsi="Consolas" w:cs="Times New Roman"/>
@@ -3320,6 +3498,7 @@
         </w:rPr>
         <w:t>(</w:t>
       </w:r>
+      <w:proofErr w:type="gramEnd"/>
       <w:r>
         <w:rPr>
           <w:rFonts w:ascii="Consolas" w:eastAsia="Times New Roman" w:hAnsi="Consolas" w:cs="Times New Roman"/>
@@ -3342,6 +3521,7 @@
         </w:rPr>
         <w:t xml:space="preserve">, </w:t>
       </w:r>
+      <w:proofErr w:type="gramStart"/>
       <w:r>
         <w:rPr>
           <w:rFonts w:ascii="Consolas" w:eastAsia="Times New Roman" w:hAnsi="Consolas" w:cs="Times New Roman"/>
@@ -3362,7 +3542,19 @@
           <w:szCs w:val="21"/>
           <w14:ligatures w14:val="none"/>
         </w:rPr>
-        <w:t>() {</w:t>
+        <w:t>(</w:t>
+      </w:r>
+      <w:proofErr w:type="gramEnd"/>
+      <w:r>
+        <w:rPr>
+          <w:rFonts w:ascii="Consolas" w:eastAsia="Times New Roman" w:hAnsi="Consolas" w:cs="Times New Roman"/>
+          <w:color w:val="000000"/>
+          <w:kern w:val="0"/>
+          <w:sz w:val="21"/>
+          <w:szCs w:val="21"/>
+          <w14:ligatures w14:val="none"/>
+        </w:rPr>
+        <w:t>) {</w:t>
       </w:r>
     </w:p>
     <w:p>
@@ -3411,6 +3603,7 @@
         </w:rPr>
         <w:t xml:space="preserve"> = </w:t>
       </w:r>
+      <w:proofErr w:type="gramStart"/>
       <w:r>
         <w:rPr>
           <w:rFonts w:ascii="Consolas" w:eastAsia="Times New Roman" w:hAnsi="Consolas" w:cs="Times New Roman"/>
@@ -3433,6 +3626,7 @@
         </w:rPr>
         <w:t>(</w:t>
       </w:r>
+      <w:proofErr w:type="gramEnd"/>
       <w:r>
         <w:rPr>
           <w:rFonts w:ascii="Consolas" w:eastAsia="Times New Roman" w:hAnsi="Consolas" w:cs="Times New Roman"/>
@@ -3502,6 +3696,7 @@
         </w:rPr>
         <w:t xml:space="preserve">            </w:t>
       </w:r>
+      <w:proofErr w:type="gramStart"/>
       <w:r>
         <w:rPr>
           <w:rFonts w:ascii="Consolas" w:eastAsia="Times New Roman" w:hAnsi="Consolas" w:cs="Times New Roman"/>
@@ -3524,6 +3719,7 @@
         </w:rPr>
         <w:t>::</w:t>
       </w:r>
+      <w:proofErr w:type="gramEnd"/>
       <w:r>
         <w:rPr>
           <w:rFonts w:ascii="Consolas" w:eastAsia="Times New Roman" w:hAnsi="Consolas" w:cs="Times New Roman"/>
@@ -3568,6 +3764,7 @@
         </w:rPr>
         <w:t>)-&gt;</w:t>
       </w:r>
+      <w:proofErr w:type="gramStart"/>
       <w:r>
         <w:rPr>
           <w:rFonts w:ascii="Consolas" w:eastAsia="Times New Roman" w:hAnsi="Consolas" w:cs="Times New Roman"/>
@@ -3590,6 +3787,7 @@
         </w:rPr>
         <w:t>(</w:t>
       </w:r>
+      <w:proofErr w:type="gramEnd"/>
       <w:r>
         <w:rPr>
           <w:rFonts w:ascii="Consolas" w:eastAsia="Times New Roman" w:hAnsi="Consolas" w:cs="Times New Roman"/>
@@ -3659,6 +3857,7 @@
         </w:rPr>
         <w:t xml:space="preserve">            </w:t>
       </w:r>
+      <w:proofErr w:type="gramStart"/>
       <w:r>
         <w:rPr>
           <w:rFonts w:ascii="Consolas" w:eastAsia="Times New Roman" w:hAnsi="Consolas" w:cs="Times New Roman"/>
@@ -3703,6 +3902,7 @@
         </w:rPr>
         <w:t>(</w:t>
       </w:r>
+      <w:proofErr w:type="gramEnd"/>
       <w:r>
         <w:rPr>
           <w:rFonts w:ascii="Consolas" w:eastAsia="Times New Roman" w:hAnsi="Consolas" w:cs="Times New Roman"/>
@@ -3712,18 +3912,42 @@
           <w:szCs w:val="21"/>
           <w14:ligatures w14:val="none"/>
         </w:rPr>
-        <w:t>"New number in cache: "</w:t>
-      </w:r>
-      <w:r>
-        <w:rPr>
-          <w:rFonts w:ascii="Consolas" w:eastAsia="Times New Roman" w:hAnsi="Consolas" w:cs="Times New Roman"/>
-          <w:color w:val="000000"/>
-          <w:kern w:val="0"/>
-          <w:sz w:val="21"/>
-          <w:szCs w:val="21"/>
-          <w14:ligatures w14:val="none"/>
-        </w:rPr>
-        <w:t xml:space="preserve"> . </w:t>
+        <w:t xml:space="preserve">"New number in cache: </w:t>
+      </w:r>
+      <w:proofErr w:type="gramStart"/>
+      <w:r>
+        <w:rPr>
+          <w:rFonts w:ascii="Consolas" w:eastAsia="Times New Roman" w:hAnsi="Consolas" w:cs="Times New Roman"/>
+          <w:color w:val="A31515"/>
+          <w:kern w:val="0"/>
+          <w:sz w:val="21"/>
+          <w:szCs w:val="21"/>
+          <w14:ligatures w14:val="none"/>
+        </w:rPr>
+        <w:t>"</w:t>
+      </w:r>
+      <w:r>
+        <w:rPr>
+          <w:rFonts w:ascii="Consolas" w:eastAsia="Times New Roman" w:hAnsi="Consolas" w:cs="Times New Roman"/>
+          <w:color w:val="000000"/>
+          <w:kern w:val="0"/>
+          <w:sz w:val="21"/>
+          <w:szCs w:val="21"/>
+          <w14:ligatures w14:val="none"/>
+        </w:rPr>
+        <w:t xml:space="preserve"> .</w:t>
+      </w:r>
+      <w:proofErr w:type="gramEnd"/>
+      <w:r>
+        <w:rPr>
+          <w:rFonts w:ascii="Consolas" w:eastAsia="Times New Roman" w:hAnsi="Consolas" w:cs="Times New Roman"/>
+          <w:color w:val="000000"/>
+          <w:kern w:val="0"/>
+          <w:sz w:val="21"/>
+          <w:szCs w:val="21"/>
+          <w14:ligatures w14:val="none"/>
+        </w:rPr>
+        <w:t xml:space="preserve"> </w:t>
       </w:r>
       <w:r>
         <w:rPr>
@@ -3769,6 +3993,7 @@
         </w:rPr>
         <w:t xml:space="preserve"> =&gt; </w:t>
       </w:r>
+      <w:proofErr w:type="gramStart"/>
       <w:r>
         <w:rPr>
           <w:rFonts w:ascii="Consolas" w:eastAsia="Times New Roman" w:hAnsi="Consolas" w:cs="Times New Roman"/>
@@ -3789,7 +4014,19 @@
           <w:szCs w:val="21"/>
           <w14:ligatures w14:val="none"/>
         </w:rPr>
-        <w:t>()]);</w:t>
+        <w:t>(</w:t>
+      </w:r>
+      <w:proofErr w:type="gramEnd"/>
+      <w:r>
+        <w:rPr>
+          <w:rFonts w:ascii="Consolas" w:eastAsia="Times New Roman" w:hAnsi="Consolas" w:cs="Times New Roman"/>
+          <w:color w:val="000000"/>
+          <w:kern w:val="0"/>
+          <w:sz w:val="21"/>
+          <w:szCs w:val="21"/>
+          <w14:ligatures w14:val="none"/>
+        </w:rPr>
+        <w:t>)]);</w:t>
       </w:r>
     </w:p>
     <w:p>
@@ -3907,6 +4144,7 @@
         </w:rPr>
         <w:t>)-&gt;</w:t>
       </w:r>
+      <w:proofErr w:type="gramStart"/>
       <w:r>
         <w:rPr>
           <w:rFonts w:ascii="Consolas" w:eastAsia="Times New Roman" w:hAnsi="Consolas" w:cs="Times New Roman"/>
@@ -3927,7 +4165,19 @@
           <w:szCs w:val="21"/>
           <w14:ligatures w14:val="none"/>
         </w:rPr>
-        <w:t>();</w:t>
+        <w:t>(</w:t>
+      </w:r>
+      <w:proofErr w:type="gramEnd"/>
+      <w:r>
+        <w:rPr>
+          <w:rFonts w:ascii="Consolas" w:eastAsia="Times New Roman" w:hAnsi="Consolas" w:cs="Times New Roman"/>
+          <w:color w:val="000000"/>
+          <w:kern w:val="0"/>
+          <w:sz w:val="21"/>
+          <w:szCs w:val="21"/>
+          <w14:ligatures w14:val="none"/>
+        </w:rPr>
+        <w:t>);</w:t>
       </w:r>
     </w:p>
     <w:p>
@@ -4150,6 +4400,7 @@
           <w14:ligatures w14:val="none"/>
         </w:rPr>
       </w:pPr>
+      <w:proofErr w:type="gramStart"/>
       <w:r>
         <w:rPr>
           <w:rFonts w:ascii="Consolas" w:eastAsia="Times New Roman" w:hAnsi="Consolas" w:cs="Times New Roman"/>
@@ -4194,6 +4445,7 @@
         </w:rPr>
         <w:t>(</w:t>
       </w:r>
+      <w:proofErr w:type="gramEnd"/>
       <w:r>
         <w:rPr>
           <w:rFonts w:ascii="Consolas" w:eastAsia="Times New Roman" w:hAnsi="Consolas" w:cs="Times New Roman"/>
@@ -4285,6 +4537,7 @@
         </w:rPr>
         <w:t xml:space="preserve"> = </w:t>
       </w:r>
+      <w:proofErr w:type="gramStart"/>
       <w:r>
         <w:rPr>
           <w:rFonts w:ascii="Consolas" w:eastAsia="Times New Roman" w:hAnsi="Consolas" w:cs="Times New Roman"/>
@@ -4307,6 +4560,7 @@
         </w:rPr>
         <w:t>::</w:t>
       </w:r>
+      <w:proofErr w:type="gramEnd"/>
       <w:r>
         <w:rPr>
           <w:rFonts w:ascii="Consolas" w:eastAsia="Times New Roman" w:hAnsi="Consolas" w:cs="Times New Roman"/>
@@ -4351,6 +4605,7 @@
         </w:rPr>
         <w:t>)-&gt;</w:t>
       </w:r>
+      <w:proofErr w:type="gramStart"/>
       <w:r>
         <w:rPr>
           <w:rFonts w:ascii="Consolas" w:eastAsia="Times New Roman" w:hAnsi="Consolas" w:cs="Times New Roman"/>
@@ -4373,6 +4628,7 @@
         </w:rPr>
         <w:t>(</w:t>
       </w:r>
+      <w:proofErr w:type="gramEnd"/>
       <w:r>
         <w:rPr>
           <w:rFonts w:ascii="Consolas" w:eastAsia="Times New Roman" w:hAnsi="Consolas" w:cs="Times New Roman"/>
@@ -4539,6 +4795,7 @@
           <w14:ligatures w14:val="none"/>
         </w:rPr>
       </w:pPr>
+      <w:proofErr w:type="gramStart"/>
       <w:r>
         <w:rPr>
           <w:rFonts w:ascii="Consolas" w:eastAsia="Times New Roman" w:hAnsi="Consolas" w:cs="Times New Roman"/>
@@ -4583,6 +4840,7 @@
         </w:rPr>
         <w:t>(</w:t>
       </w:r>
+      <w:proofErr w:type="gramEnd"/>
       <w:r>
         <w:rPr>
           <w:rFonts w:ascii="Consolas" w:eastAsia="Times New Roman" w:hAnsi="Consolas" w:cs="Times New Roman"/>
@@ -4699,6 +4957,7 @@
         </w:rPr>
         <w:t xml:space="preserve">      </w:t>
       </w:r>
+      <w:proofErr w:type="gramStart"/>
       <w:r>
         <w:rPr>
           <w:rFonts w:ascii="Consolas" w:eastAsia="Times New Roman" w:hAnsi="Consolas" w:cs="Times New Roman"/>
@@ -4721,6 +4980,7 @@
         </w:rPr>
         <w:t>::</w:t>
       </w:r>
+      <w:proofErr w:type="gramEnd"/>
       <w:r>
         <w:rPr>
           <w:rFonts w:ascii="Consolas" w:eastAsia="Times New Roman" w:hAnsi="Consolas" w:cs="Times New Roman"/>
@@ -4931,6 +5191,7 @@
           <w14:ligatures w14:val="none"/>
         </w:rPr>
       </w:pPr>
+      <w:proofErr w:type="gramStart"/>
       <w:r>
         <w:rPr>
           <w:rFonts w:ascii="Consolas" w:eastAsia="Times New Roman" w:hAnsi="Consolas" w:cs="Times New Roman"/>
@@ -4975,6 +5236,7 @@
         </w:rPr>
         <w:t>(</w:t>
       </w:r>
+      <w:proofErr w:type="gramEnd"/>
       <w:r>
         <w:rPr>
           <w:rFonts w:ascii="Consolas" w:eastAsia="Times New Roman" w:hAnsi="Consolas" w:cs="Times New Roman"/>
@@ -5091,6 +5353,7 @@
         </w:rPr>
         <w:t xml:space="preserve">      </w:t>
       </w:r>
+      <w:proofErr w:type="gramStart"/>
       <w:r>
         <w:rPr>
           <w:rFonts w:ascii="Consolas" w:eastAsia="Times New Roman" w:hAnsi="Consolas" w:cs="Times New Roman"/>
@@ -5113,6 +5376,7 @@
         </w:rPr>
         <w:t>::</w:t>
       </w:r>
+      <w:proofErr w:type="gramEnd"/>
       <w:r>
         <w:rPr>
           <w:rFonts w:ascii="Consolas" w:eastAsia="Times New Roman" w:hAnsi="Consolas" w:cs="Times New Roman"/>
@@ -5323,6 +5587,7 @@
           <w14:ligatures w14:val="none"/>
         </w:rPr>
       </w:pPr>
+      <w:proofErr w:type="gramStart"/>
       <w:r>
         <w:rPr>
           <w:rFonts w:ascii="Consolas" w:eastAsia="Times New Roman" w:hAnsi="Consolas" w:cs="Times New Roman"/>
@@ -5367,6 +5632,7 @@
         </w:rPr>
         <w:t>(</w:t>
       </w:r>
+      <w:proofErr w:type="gramEnd"/>
       <w:r>
         <w:rPr>
           <w:rFonts w:ascii="Consolas" w:eastAsia="Times New Roman" w:hAnsi="Consolas" w:cs="Times New Roman"/>
@@ -5436,6 +5702,7 @@
         </w:rPr>
         <w:t xml:space="preserve">    </w:t>
       </w:r>
+      <w:proofErr w:type="gramStart"/>
       <w:r>
         <w:rPr>
           <w:rFonts w:ascii="Consolas" w:eastAsia="Times New Roman" w:hAnsi="Consolas" w:cs="Times New Roman"/>
@@ -5458,6 +5725,7 @@
         </w:rPr>
         <w:t>::</w:t>
       </w:r>
+      <w:proofErr w:type="gramEnd"/>
       <w:r>
         <w:rPr>
           <w:rFonts w:ascii="Consolas" w:eastAsia="Times New Roman" w:hAnsi="Consolas" w:cs="Times New Roman"/>
@@ -5502,6 +5770,7 @@
         </w:rPr>
         <w:t>)-&gt;</w:t>
       </w:r>
+      <w:proofErr w:type="gramStart"/>
       <w:r>
         <w:rPr>
           <w:rFonts w:ascii="Consolas" w:eastAsia="Times New Roman" w:hAnsi="Consolas" w:cs="Times New Roman"/>
@@ -5522,7 +5791,19 @@
           <w:szCs w:val="21"/>
           <w14:ligatures w14:val="none"/>
         </w:rPr>
-        <w:t>([</w:t>
+        <w:t>(</w:t>
+      </w:r>
+      <w:proofErr w:type="gramEnd"/>
+      <w:r>
+        <w:rPr>
+          <w:rFonts w:ascii="Consolas" w:eastAsia="Times New Roman" w:hAnsi="Consolas" w:cs="Times New Roman"/>
+          <w:color w:val="000000"/>
+          <w:kern w:val="0"/>
+          <w:sz w:val="21"/>
+          <w:szCs w:val="21"/>
+          <w14:ligatures w14:val="none"/>
+        </w:rPr>
+        <w:t>[</w:t>
       </w:r>
     </w:p>
     <w:p>
@@ -5558,7 +5839,31 @@
           <w:szCs w:val="21"/>
           <w14:ligatures w14:val="none"/>
         </w:rPr>
-        <w:t>'my-number'</w:t>
+        <w:t>'</w:t>
+      </w:r>
+      <w:proofErr w:type="gramStart"/>
+      <w:r>
+        <w:rPr>
+          <w:rFonts w:ascii="Consolas" w:eastAsia="Times New Roman" w:hAnsi="Consolas" w:cs="Times New Roman"/>
+          <w:color w:val="A31515"/>
+          <w:kern w:val="0"/>
+          <w:sz w:val="21"/>
+          <w:szCs w:val="21"/>
+          <w14:ligatures w14:val="none"/>
+        </w:rPr>
+        <w:t>my</w:t>
+      </w:r>
+      <w:proofErr w:type="gramEnd"/>
+      <w:r>
+        <w:rPr>
+          <w:rFonts w:ascii="Consolas" w:eastAsia="Times New Roman" w:hAnsi="Consolas" w:cs="Times New Roman"/>
+          <w:color w:val="A31515"/>
+          <w:kern w:val="0"/>
+          <w:sz w:val="21"/>
+          <w:szCs w:val="21"/>
+          <w14:ligatures w14:val="none"/>
+        </w:rPr>
+        <w:t>-number'</w:t>
       </w:r>
       <w:r>
         <w:rPr>
@@ -5627,7 +5932,31 @@
           <w:szCs w:val="21"/>
           <w14:ligatures w14:val="none"/>
         </w:rPr>
-        <w:t>'my-string'</w:t>
+        <w:t>'</w:t>
+      </w:r>
+      <w:proofErr w:type="gramStart"/>
+      <w:r>
+        <w:rPr>
+          <w:rFonts w:ascii="Consolas" w:eastAsia="Times New Roman" w:hAnsi="Consolas" w:cs="Times New Roman"/>
+          <w:color w:val="A31515"/>
+          <w:kern w:val="0"/>
+          <w:sz w:val="21"/>
+          <w:szCs w:val="21"/>
+          <w14:ligatures w14:val="none"/>
+        </w:rPr>
+        <w:t>my</w:t>
+      </w:r>
+      <w:proofErr w:type="gramEnd"/>
+      <w:r>
+        <w:rPr>
+          <w:rFonts w:ascii="Consolas" w:eastAsia="Times New Roman" w:hAnsi="Consolas" w:cs="Times New Roman"/>
+          <w:color w:val="A31515"/>
+          <w:kern w:val="0"/>
+          <w:sz w:val="21"/>
+          <w:szCs w:val="21"/>
+          <w14:ligatures w14:val="none"/>
+        </w:rPr>
+        <w:t>-string'</w:t>
       </w:r>
       <w:r>
         <w:rPr>
@@ -5696,7 +6025,31 @@
           <w:szCs w:val="21"/>
           <w14:ligatures w14:val="none"/>
         </w:rPr>
-        <w:t>'my-array'</w:t>
+        <w:t>'</w:t>
+      </w:r>
+      <w:proofErr w:type="gramStart"/>
+      <w:r>
+        <w:rPr>
+          <w:rFonts w:ascii="Consolas" w:eastAsia="Times New Roman" w:hAnsi="Consolas" w:cs="Times New Roman"/>
+          <w:color w:val="A31515"/>
+          <w:kern w:val="0"/>
+          <w:sz w:val="21"/>
+          <w:szCs w:val="21"/>
+          <w14:ligatures w14:val="none"/>
+        </w:rPr>
+        <w:t>my</w:t>
+      </w:r>
+      <w:proofErr w:type="gramEnd"/>
+      <w:r>
+        <w:rPr>
+          <w:rFonts w:ascii="Consolas" w:eastAsia="Times New Roman" w:hAnsi="Consolas" w:cs="Times New Roman"/>
+          <w:color w:val="A31515"/>
+          <w:kern w:val="0"/>
+          <w:sz w:val="21"/>
+          <w:szCs w:val="21"/>
+          <w14:ligatures w14:val="none"/>
+        </w:rPr>
+        <w:t>-array'</w:t>
       </w:r>
       <w:r>
         <w:rPr>
@@ -5922,6 +6275,7 @@
           <w14:ligatures w14:val="none"/>
         </w:rPr>
       </w:pPr>
+      <w:proofErr w:type="gramStart"/>
       <w:r>
         <w:rPr>
           <w:rFonts w:ascii="Consolas" w:eastAsia="Times New Roman" w:hAnsi="Consolas" w:cs="Times New Roman"/>
@@ -5966,6 +6320,7 @@
         </w:rPr>
         <w:t>(</w:t>
       </w:r>
+      <w:proofErr w:type="gramEnd"/>
       <w:r>
         <w:rPr>
           <w:rFonts w:ascii="Consolas" w:eastAsia="Times New Roman" w:hAnsi="Consolas" w:cs="Times New Roman"/>
@@ -6057,6 +6412,7 @@
         </w:rPr>
         <w:t xml:space="preserve"> = </w:t>
       </w:r>
+      <w:proofErr w:type="gramStart"/>
       <w:r>
         <w:rPr>
           <w:rFonts w:ascii="Consolas" w:eastAsia="Times New Roman" w:hAnsi="Consolas" w:cs="Times New Roman"/>
@@ -6079,6 +6435,7 @@
         </w:rPr>
         <w:t>::</w:t>
       </w:r>
+      <w:proofErr w:type="gramEnd"/>
       <w:r>
         <w:rPr>
           <w:rFonts w:ascii="Consolas" w:eastAsia="Times New Roman" w:hAnsi="Consolas" w:cs="Times New Roman"/>
@@ -6123,6 +6480,7 @@
         </w:rPr>
         <w:t>)-&gt;</w:t>
       </w:r>
+      <w:proofErr w:type="gramStart"/>
       <w:r>
         <w:rPr>
           <w:rFonts w:ascii="Consolas" w:eastAsia="Times New Roman" w:hAnsi="Consolas" w:cs="Times New Roman"/>
@@ -6143,7 +6501,19 @@
           <w:szCs w:val="21"/>
           <w14:ligatures w14:val="none"/>
         </w:rPr>
-        <w:t>([</w:t>
+        <w:t>(</w:t>
+      </w:r>
+      <w:proofErr w:type="gramEnd"/>
+      <w:r>
+        <w:rPr>
+          <w:rFonts w:ascii="Consolas" w:eastAsia="Times New Roman" w:hAnsi="Consolas" w:cs="Times New Roman"/>
+          <w:color w:val="000000"/>
+          <w:kern w:val="0"/>
+          <w:sz w:val="21"/>
+          <w:szCs w:val="21"/>
+          <w14:ligatures w14:val="none"/>
+        </w:rPr>
+        <w:t>[</w:t>
       </w:r>
     </w:p>
     <w:p>
@@ -6179,7 +6549,31 @@
           <w:szCs w:val="21"/>
           <w14:ligatures w14:val="none"/>
         </w:rPr>
-        <w:t>'my-number'</w:t>
+        <w:t>'</w:t>
+      </w:r>
+      <w:proofErr w:type="gramStart"/>
+      <w:r>
+        <w:rPr>
+          <w:rFonts w:ascii="Consolas" w:eastAsia="Times New Roman" w:hAnsi="Consolas" w:cs="Times New Roman"/>
+          <w:color w:val="A31515"/>
+          <w:kern w:val="0"/>
+          <w:sz w:val="21"/>
+          <w:szCs w:val="21"/>
+          <w14:ligatures w14:val="none"/>
+        </w:rPr>
+        <w:t>my</w:t>
+      </w:r>
+      <w:proofErr w:type="gramEnd"/>
+      <w:r>
+        <w:rPr>
+          <w:rFonts w:ascii="Consolas" w:eastAsia="Times New Roman" w:hAnsi="Consolas" w:cs="Times New Roman"/>
+          <w:color w:val="A31515"/>
+          <w:kern w:val="0"/>
+          <w:sz w:val="21"/>
+          <w:szCs w:val="21"/>
+          <w14:ligatures w14:val="none"/>
+        </w:rPr>
+        <w:t>-number'</w:t>
       </w:r>
       <w:r>
         <w:rPr>
@@ -6226,7 +6620,31 @@
           <w:szCs w:val="21"/>
           <w14:ligatures w14:val="none"/>
         </w:rPr>
-        <w:t>'my-string'</w:t>
+        <w:t>'</w:t>
+      </w:r>
+      <w:proofErr w:type="gramStart"/>
+      <w:r>
+        <w:rPr>
+          <w:rFonts w:ascii="Consolas" w:eastAsia="Times New Roman" w:hAnsi="Consolas" w:cs="Times New Roman"/>
+          <w:color w:val="A31515"/>
+          <w:kern w:val="0"/>
+          <w:sz w:val="21"/>
+          <w:szCs w:val="21"/>
+          <w14:ligatures w14:val="none"/>
+        </w:rPr>
+        <w:t>my</w:t>
+      </w:r>
+      <w:proofErr w:type="gramEnd"/>
+      <w:r>
+        <w:rPr>
+          <w:rFonts w:ascii="Consolas" w:eastAsia="Times New Roman" w:hAnsi="Consolas" w:cs="Times New Roman"/>
+          <w:color w:val="A31515"/>
+          <w:kern w:val="0"/>
+          <w:sz w:val="21"/>
+          <w:szCs w:val="21"/>
+          <w14:ligatures w14:val="none"/>
+        </w:rPr>
+        <w:t>-string'</w:t>
       </w:r>
       <w:r>
         <w:rPr>
@@ -6273,7 +6691,31 @@
           <w:szCs w:val="21"/>
           <w14:ligatures w14:val="none"/>
         </w:rPr>
-        <w:t>'my-array'</w:t>
+        <w:t>'</w:t>
+      </w:r>
+      <w:proofErr w:type="gramStart"/>
+      <w:r>
+        <w:rPr>
+          <w:rFonts w:ascii="Consolas" w:eastAsia="Times New Roman" w:hAnsi="Consolas" w:cs="Times New Roman"/>
+          <w:color w:val="A31515"/>
+          <w:kern w:val="0"/>
+          <w:sz w:val="21"/>
+          <w:szCs w:val="21"/>
+          <w14:ligatures w14:val="none"/>
+        </w:rPr>
+        <w:t>my</w:t>
+      </w:r>
+      <w:proofErr w:type="gramEnd"/>
+      <w:r>
+        <w:rPr>
+          <w:rFonts w:ascii="Consolas" w:eastAsia="Times New Roman" w:hAnsi="Consolas" w:cs="Times New Roman"/>
+          <w:color w:val="A31515"/>
+          <w:kern w:val="0"/>
+          <w:sz w:val="21"/>
+          <w:szCs w:val="21"/>
+          <w14:ligatures w14:val="none"/>
+        </w:rPr>
+        <w:t>-array'</w:t>
       </w:r>
       <w:r>
         <w:rPr>
@@ -6440,6 +6882,7 @@
           <w14:ligatures w14:val="none"/>
         </w:rPr>
       </w:pPr>
+      <w:proofErr w:type="gramStart"/>
       <w:r>
         <w:rPr>
           <w:rFonts w:ascii="Consolas" w:eastAsia="Times New Roman" w:hAnsi="Consolas" w:cs="Times New Roman"/>
@@ -6463,6 +6906,7 @@
         </w:rPr>
         <w:t>::</w:t>
       </w:r>
+      <w:proofErr w:type="gramEnd"/>
       <w:r>
         <w:rPr>
           <w:rFonts w:ascii="Consolas" w:eastAsia="Times New Roman" w:hAnsi="Consolas" w:cs="Times New Roman"/>
@@ -6620,6 +7064,7 @@
         </w:rPr>
         <w:t xml:space="preserve"> </w:t>
       </w:r>
+      <w:proofErr w:type="gramStart"/>
       <w:r>
         <w:rPr>
           <w:rFonts w:ascii="Consolas" w:eastAsia="Times New Roman" w:hAnsi="Consolas" w:cs="Times New Roman"/>
@@ -6642,6 +7087,7 @@
         </w:rPr>
         <w:t>::</w:t>
       </w:r>
+      <w:proofErr w:type="gramEnd"/>
       <w:r>
         <w:rPr>
           <w:rFonts w:ascii="Consolas" w:eastAsia="Times New Roman" w:hAnsi="Consolas" w:cs="Times New Roman"/>
@@ -7182,7 +7628,31 @@
           <w:szCs w:val="21"/>
           <w14:ligatures w14:val="none"/>
         </w:rPr>
-        <w:t>'example:1000'</w:t>
+        <w:t>'</w:t>
+      </w:r>
+      <w:proofErr w:type="gramStart"/>
+      <w:r>
+        <w:rPr>
+          <w:rFonts w:ascii="Consolas" w:eastAsia="Times New Roman" w:hAnsi="Consolas" w:cs="Times New Roman"/>
+          <w:color w:val="A31515"/>
+          <w:kern w:val="0"/>
+          <w:sz w:val="21"/>
+          <w:szCs w:val="21"/>
+          <w14:ligatures w14:val="none"/>
+        </w:rPr>
+        <w:t>example</w:t>
+      </w:r>
+      <w:proofErr w:type="gramEnd"/>
+      <w:r>
+        <w:rPr>
+          <w:rFonts w:ascii="Consolas" w:eastAsia="Times New Roman" w:hAnsi="Consolas" w:cs="Times New Roman"/>
+          <w:color w:val="A31515"/>
+          <w:kern w:val="0"/>
+          <w:sz w:val="21"/>
+          <w:szCs w:val="21"/>
+          <w14:ligatures w14:val="none"/>
+        </w:rPr>
+        <w:t>:1000'</w:t>
       </w:r>
       <w:r>
         <w:rPr>
@@ -7495,7 +7965,31 @@
           <w:szCs w:val="21"/>
           <w14:ligatures w14:val="none"/>
         </w:rPr>
-        <w:t>'example:1000'</w:t>
+        <w:t>'</w:t>
+      </w:r>
+      <w:proofErr w:type="gramStart"/>
+      <w:r>
+        <w:rPr>
+          <w:rFonts w:ascii="Consolas" w:eastAsia="Times New Roman" w:hAnsi="Consolas" w:cs="Times New Roman"/>
+          <w:color w:val="A31515"/>
+          <w:kern w:val="0"/>
+          <w:sz w:val="21"/>
+          <w:szCs w:val="21"/>
+          <w14:ligatures w14:val="none"/>
+        </w:rPr>
+        <w:t>example</w:t>
+      </w:r>
+      <w:proofErr w:type="gramEnd"/>
+      <w:r>
+        <w:rPr>
+          <w:rFonts w:ascii="Consolas" w:eastAsia="Times New Roman" w:hAnsi="Consolas" w:cs="Times New Roman"/>
+          <w:color w:val="A31515"/>
+          <w:kern w:val="0"/>
+          <w:sz w:val="21"/>
+          <w:szCs w:val="21"/>
+          <w14:ligatures w14:val="none"/>
+        </w:rPr>
+        <w:t>:1000'</w:t>
       </w:r>
       <w:r>
         <w:rPr>
@@ -7719,7 +8213,31 @@
           <w:szCs w:val="21"/>
           <w14:ligatures w14:val="none"/>
         </w:rPr>
-        <w:t>'my-table:100'</w:t>
+        <w:t>'</w:t>
+      </w:r>
+      <w:proofErr w:type="gramStart"/>
+      <w:r>
+        <w:rPr>
+          <w:rFonts w:ascii="Consolas" w:eastAsia="Times New Roman" w:hAnsi="Consolas" w:cs="Times New Roman"/>
+          <w:color w:val="A31515"/>
+          <w:kern w:val="0"/>
+          <w:sz w:val="21"/>
+          <w:szCs w:val="21"/>
+          <w14:ligatures w14:val="none"/>
+        </w:rPr>
+        <w:t>my</w:t>
+      </w:r>
+      <w:proofErr w:type="gramEnd"/>
+      <w:r>
+        <w:rPr>
+          <w:rFonts w:ascii="Consolas" w:eastAsia="Times New Roman" w:hAnsi="Consolas" w:cs="Times New Roman"/>
+          <w:color w:val="A31515"/>
+          <w:kern w:val="0"/>
+          <w:sz w:val="21"/>
+          <w:szCs w:val="21"/>
+          <w14:ligatures w14:val="none"/>
+        </w:rPr>
+        <w:t>-table:100'</w:t>
       </w:r>
       <w:r>
         <w:rPr>
@@ -8086,6 +8604,7 @@
           <w14:ligatures w14:val="none"/>
         </w:rPr>
       </w:pPr>
+      <w:proofErr w:type="gramStart"/>
       <w:r>
         <w:rPr>
           <w:rFonts w:ascii="Consolas" w:eastAsia="Times New Roman" w:hAnsi="Consolas" w:cs="Times New Roman"/>
@@ -8131,6 +8650,7 @@
         </w:rPr>
         <w:t>(</w:t>
       </w:r>
+      <w:proofErr w:type="gramEnd"/>
       <w:r>
         <w:rPr>
           <w:rFonts w:ascii="Consolas" w:eastAsia="Times New Roman" w:hAnsi="Consolas" w:cs="Times New Roman"/>
@@ -8258,6 +8778,7 @@
         </w:rPr>
         <w:t xml:space="preserve"> = </w:t>
       </w:r>
+      <w:proofErr w:type="gramStart"/>
       <w:r>
         <w:rPr>
           <w:rFonts w:ascii="Consolas" w:eastAsia="Times New Roman" w:hAnsi="Consolas" w:cs="Times New Roman"/>
@@ -8280,6 +8801,7 @@
         </w:rPr>
         <w:t>::</w:t>
       </w:r>
+      <w:proofErr w:type="gramEnd"/>
       <w:r>
         <w:rPr>
           <w:rFonts w:ascii="Consolas" w:eastAsia="Times New Roman" w:hAnsi="Consolas" w:cs="Times New Roman"/>
@@ -8358,7 +8880,55 @@
           <w:szCs w:val="21"/>
           <w14:ligatures w14:val="none"/>
         </w:rPr>
-        <w:t>// looping 1..90 creating rows with fake() helper</w:t>
+        <w:t xml:space="preserve">// looping </w:t>
+      </w:r>
+      <w:proofErr w:type="gramStart"/>
+      <w:r>
+        <w:rPr>
+          <w:rFonts w:ascii="Consolas" w:eastAsia="Times New Roman" w:hAnsi="Consolas" w:cs="Times New Roman"/>
+          <w:color w:val="008000"/>
+          <w:kern w:val="0"/>
+          <w:sz w:val="21"/>
+          <w:szCs w:val="21"/>
+          <w14:ligatures w14:val="none"/>
+        </w:rPr>
+        <w:t>1..</w:t>
+      </w:r>
+      <w:proofErr w:type="gramEnd"/>
+      <w:r>
+        <w:rPr>
+          <w:rFonts w:ascii="Consolas" w:eastAsia="Times New Roman" w:hAnsi="Consolas" w:cs="Times New Roman"/>
+          <w:color w:val="008000"/>
+          <w:kern w:val="0"/>
+          <w:sz w:val="21"/>
+          <w:szCs w:val="21"/>
+          <w14:ligatures w14:val="none"/>
+        </w:rPr>
+        <w:t xml:space="preserve">90 creating rows with </w:t>
+      </w:r>
+      <w:proofErr w:type="gramStart"/>
+      <w:r>
+        <w:rPr>
+          <w:rFonts w:ascii="Consolas" w:eastAsia="Times New Roman" w:hAnsi="Consolas" w:cs="Times New Roman"/>
+          <w:color w:val="008000"/>
+          <w:kern w:val="0"/>
+          <w:sz w:val="21"/>
+          <w:szCs w:val="21"/>
+          <w14:ligatures w14:val="none"/>
+        </w:rPr>
+        <w:t>fake(</w:t>
+      </w:r>
+      <w:proofErr w:type="gramEnd"/>
+      <w:r>
+        <w:rPr>
+          <w:rFonts w:ascii="Consolas" w:eastAsia="Times New Roman" w:hAnsi="Consolas" w:cs="Times New Roman"/>
+          <w:color w:val="008000"/>
+          <w:kern w:val="0"/>
+          <w:sz w:val="21"/>
+          <w:szCs w:val="21"/>
+          <w14:ligatures w14:val="none"/>
+        </w:rPr>
+        <w:t>) helper</w:t>
       </w:r>
     </w:p>
     <w:p>
@@ -8416,8 +8986,21 @@
           <w:szCs w:val="21"/>
           <w14:ligatures w14:val="none"/>
         </w:rPr>
-        <w:t>$i</w:t>
-      </w:r>
+        <w:t>$</w:t>
+      </w:r>
+      <w:proofErr w:type="spellStart"/>
+      <w:r>
+        <w:rPr>
+          <w:rFonts w:ascii="Consolas" w:eastAsia="Times New Roman" w:hAnsi="Consolas" w:cs="Times New Roman"/>
+          <w:color w:val="001080"/>
+          <w:kern w:val="0"/>
+          <w:sz w:val="21"/>
+          <w:szCs w:val="21"/>
+          <w14:ligatures w14:val="none"/>
+        </w:rPr>
+        <w:t>i</w:t>
+      </w:r>
+      <w:proofErr w:type="spellEnd"/>
       <w:r>
         <w:rPr>
           <w:rFonts w:ascii="Consolas" w:eastAsia="Times New Roman" w:hAnsi="Consolas" w:cs="Times New Roman"/>
@@ -8460,8 +9043,21 @@
           <w:szCs w:val="21"/>
           <w14:ligatures w14:val="none"/>
         </w:rPr>
-        <w:t>$i</w:t>
-      </w:r>
+        <w:t>$</w:t>
+      </w:r>
+      <w:proofErr w:type="spellStart"/>
+      <w:r>
+        <w:rPr>
+          <w:rFonts w:ascii="Consolas" w:eastAsia="Times New Roman" w:hAnsi="Consolas" w:cs="Times New Roman"/>
+          <w:color w:val="001080"/>
+          <w:kern w:val="0"/>
+          <w:sz w:val="21"/>
+          <w:szCs w:val="21"/>
+          <w14:ligatures w14:val="none"/>
+        </w:rPr>
+        <w:t>i</w:t>
+      </w:r>
+      <w:proofErr w:type="spellEnd"/>
       <w:r>
         <w:rPr>
           <w:rFonts w:ascii="Consolas" w:eastAsia="Times New Roman" w:hAnsi="Consolas" w:cs="Times New Roman"/>
@@ -8504,8 +9100,21 @@
           <w:szCs w:val="21"/>
           <w14:ligatures w14:val="none"/>
         </w:rPr>
-        <w:t>$i</w:t>
-      </w:r>
+        <w:t>$</w:t>
+      </w:r>
+      <w:proofErr w:type="spellStart"/>
+      <w:r>
+        <w:rPr>
+          <w:rFonts w:ascii="Consolas" w:eastAsia="Times New Roman" w:hAnsi="Consolas" w:cs="Times New Roman"/>
+          <w:color w:val="001080"/>
+          <w:kern w:val="0"/>
+          <w:sz w:val="21"/>
+          <w:szCs w:val="21"/>
+          <w14:ligatures w14:val="none"/>
+        </w:rPr>
+        <w:t>i</w:t>
+      </w:r>
+      <w:proofErr w:type="spellEnd"/>
       <w:r>
         <w:rPr>
           <w:rFonts w:ascii="Consolas" w:eastAsia="Times New Roman" w:hAnsi="Consolas" w:cs="Times New Roman"/>
@@ -8564,6 +9173,7 @@
         </w:rPr>
         <w:t>-&gt;</w:t>
       </w:r>
+      <w:proofErr w:type="gramStart"/>
       <w:r>
         <w:rPr>
           <w:rFonts w:ascii="Consolas" w:eastAsia="Times New Roman" w:hAnsi="Consolas" w:cs="Times New Roman"/>
@@ -8586,6 +9196,7 @@
         </w:rPr>
         <w:t>(</w:t>
       </w:r>
+      <w:proofErr w:type="gramEnd"/>
       <w:r>
         <w:rPr>
           <w:rFonts w:ascii="Consolas" w:eastAsia="Times New Roman" w:hAnsi="Consolas" w:cs="Times New Roman"/>
@@ -8595,8 +9206,21 @@
           <w:szCs w:val="21"/>
           <w14:ligatures w14:val="none"/>
         </w:rPr>
-        <w:t>$i</w:t>
-      </w:r>
+        <w:t>$</w:t>
+      </w:r>
+      <w:proofErr w:type="spellStart"/>
+      <w:r>
+        <w:rPr>
+          <w:rFonts w:ascii="Consolas" w:eastAsia="Times New Roman" w:hAnsi="Consolas" w:cs="Times New Roman"/>
+          <w:color w:val="001080"/>
+          <w:kern w:val="0"/>
+          <w:sz w:val="21"/>
+          <w:szCs w:val="21"/>
+          <w14:ligatures w14:val="none"/>
+        </w:rPr>
+        <w:t>i</w:t>
+      </w:r>
+      <w:proofErr w:type="spellEnd"/>
       <w:r>
         <w:rPr>
           <w:rFonts w:ascii="Consolas" w:eastAsia="Times New Roman" w:hAnsi="Consolas" w:cs="Times New Roman"/>
@@ -8702,6 +9326,7 @@
         </w:rPr>
         <w:t>()-&gt;</w:t>
       </w:r>
+      <w:proofErr w:type="gramStart"/>
       <w:r>
         <w:rPr>
           <w:rFonts w:ascii="Consolas" w:eastAsia="Times New Roman" w:hAnsi="Consolas" w:cs="Times New Roman"/>
@@ -8722,7 +9347,19 @@
           <w:szCs w:val="21"/>
           <w14:ligatures w14:val="none"/>
         </w:rPr>
-        <w:t>(),</w:t>
+        <w:t>(</w:t>
+      </w:r>
+      <w:proofErr w:type="gramEnd"/>
+      <w:r>
+        <w:rPr>
+          <w:rFonts w:ascii="Consolas" w:eastAsia="Times New Roman" w:hAnsi="Consolas" w:cs="Times New Roman"/>
+          <w:color w:val="000000"/>
+          <w:kern w:val="0"/>
+          <w:sz w:val="21"/>
+          <w:szCs w:val="21"/>
+          <w14:ligatures w14:val="none"/>
+        </w:rPr>
+        <w:t>),</w:t>
       </w:r>
     </w:p>
     <w:p>
@@ -8793,6 +9430,7 @@
         </w:rPr>
         <w:t>()-&gt;</w:t>
       </w:r>
+      <w:proofErr w:type="gramStart"/>
       <w:r>
         <w:rPr>
           <w:rFonts w:ascii="Consolas" w:eastAsia="Times New Roman" w:hAnsi="Consolas" w:cs="Times New Roman"/>
@@ -8813,7 +9451,19 @@
           <w:szCs w:val="21"/>
           <w14:ligatures w14:val="none"/>
         </w:rPr>
-        <w:t>(),</w:t>
+        <w:t>(</w:t>
+      </w:r>
+      <w:proofErr w:type="gramEnd"/>
+      <w:r>
+        <w:rPr>
+          <w:rFonts w:ascii="Consolas" w:eastAsia="Times New Roman" w:hAnsi="Consolas" w:cs="Times New Roman"/>
+          <w:color w:val="000000"/>
+          <w:kern w:val="0"/>
+          <w:sz w:val="21"/>
+          <w:szCs w:val="21"/>
+          <w14:ligatures w14:val="none"/>
+        </w:rPr>
+        <w:t>),</w:t>
       </w:r>
     </w:p>
     <w:p>
@@ -8862,6 +9512,7 @@
         </w:rPr>
         <w:t xml:space="preserve"> =&gt; </w:t>
       </w:r>
+      <w:proofErr w:type="gramStart"/>
       <w:r>
         <w:rPr>
           <w:rFonts w:ascii="Consolas" w:eastAsia="Times New Roman" w:hAnsi="Consolas" w:cs="Times New Roman"/>
@@ -8882,8 +9533,21 @@
           <w:szCs w:val="21"/>
           <w14:ligatures w14:val="none"/>
         </w:rPr>
-        <w:t>()-&gt;</w:t>
-      </w:r>
+        <w:t>(</w:t>
+      </w:r>
+      <w:proofErr w:type="gramEnd"/>
+      <w:r>
+        <w:rPr>
+          <w:rFonts w:ascii="Consolas" w:eastAsia="Times New Roman" w:hAnsi="Consolas" w:cs="Times New Roman"/>
+          <w:color w:val="000000"/>
+          <w:kern w:val="0"/>
+          <w:sz w:val="21"/>
+          <w:szCs w:val="21"/>
+          <w14:ligatures w14:val="none"/>
+        </w:rPr>
+        <w:t>)-&gt;</w:t>
+      </w:r>
+      <w:proofErr w:type="gramStart"/>
       <w:r>
         <w:rPr>
           <w:rFonts w:ascii="Consolas" w:eastAsia="Times New Roman" w:hAnsi="Consolas" w:cs="Times New Roman"/>
@@ -8906,6 +9570,7 @@
         </w:rPr>
         <w:t>(</w:t>
       </w:r>
+      <w:proofErr w:type="gramEnd"/>
       <w:r>
         <w:rPr>
           <w:rFonts w:ascii="Consolas" w:eastAsia="Times New Roman" w:hAnsi="Consolas" w:cs="Times New Roman"/>
@@ -8997,6 +9662,7 @@
         </w:rPr>
         <w:t xml:space="preserve"> =&gt; </w:t>
       </w:r>
+      <w:proofErr w:type="gramStart"/>
       <w:r>
         <w:rPr>
           <w:rFonts w:ascii="Consolas" w:eastAsia="Times New Roman" w:hAnsi="Consolas" w:cs="Times New Roman"/>
@@ -9017,8 +9683,21 @@
           <w:szCs w:val="21"/>
           <w14:ligatures w14:val="none"/>
         </w:rPr>
-        <w:t>()-&gt;</w:t>
-      </w:r>
+        <w:t>(</w:t>
+      </w:r>
+      <w:proofErr w:type="gramEnd"/>
+      <w:r>
+        <w:rPr>
+          <w:rFonts w:ascii="Consolas" w:eastAsia="Times New Roman" w:hAnsi="Consolas" w:cs="Times New Roman"/>
+          <w:color w:val="000000"/>
+          <w:kern w:val="0"/>
+          <w:sz w:val="21"/>
+          <w:szCs w:val="21"/>
+          <w14:ligatures w14:val="none"/>
+        </w:rPr>
+        <w:t>)-&gt;</w:t>
+      </w:r>
+      <w:proofErr w:type="gramStart"/>
       <w:r>
         <w:rPr>
           <w:rFonts w:ascii="Consolas" w:eastAsia="Times New Roman" w:hAnsi="Consolas" w:cs="Times New Roman"/>
@@ -9041,6 +9720,7 @@
         </w:rPr>
         <w:t>(</w:t>
       </w:r>
+      <w:proofErr w:type="gramEnd"/>
       <w:r>
         <w:rPr>
           <w:rFonts w:ascii="Consolas" w:eastAsia="Times New Roman" w:hAnsi="Consolas" w:cs="Times New Roman"/>
@@ -9279,6 +9959,7 @@
           <w14:ligatures w14:val="none"/>
         </w:rPr>
       </w:pPr>
+      <w:proofErr w:type="gramStart"/>
       <w:r>
         <w:rPr>
           <w:rFonts w:ascii="Consolas" w:eastAsia="Times New Roman" w:hAnsi="Consolas" w:cs="Times New Roman"/>
@@ -9323,6 +10004,7 @@
         </w:rPr>
         <w:t>(</w:t>
       </w:r>
+      <w:proofErr w:type="gramEnd"/>
       <w:r>
         <w:rPr>
           <w:rFonts w:ascii="Consolas" w:eastAsia="Times New Roman" w:hAnsi="Consolas" w:cs="Times New Roman"/>
@@ -9414,6 +10096,7 @@
         </w:rPr>
         <w:t xml:space="preserve"> = </w:t>
       </w:r>
+      <w:proofErr w:type="gramStart"/>
       <w:r>
         <w:rPr>
           <w:rFonts w:ascii="Consolas" w:eastAsia="Times New Roman" w:hAnsi="Consolas" w:cs="Times New Roman"/>
@@ -9436,6 +10119,7 @@
         </w:rPr>
         <w:t>::</w:t>
       </w:r>
+      <w:proofErr w:type="gramEnd"/>
       <w:r>
         <w:rPr>
           <w:rFonts w:ascii="Consolas" w:eastAsia="Times New Roman" w:hAnsi="Consolas" w:cs="Times New Roman"/>
@@ -9549,6 +10233,7 @@
         </w:rPr>
         <w:t>-&gt;</w:t>
       </w:r>
+      <w:proofErr w:type="gramStart"/>
       <w:r>
         <w:rPr>
           <w:rFonts w:ascii="Consolas" w:eastAsia="Times New Roman" w:hAnsi="Consolas" w:cs="Times New Roman"/>
@@ -9571,6 +10256,7 @@
         </w:rPr>
         <w:t>(</w:t>
       </w:r>
+      <w:proofErr w:type="gramEnd"/>
       <w:r>
         <w:rPr>
           <w:rFonts w:ascii="Consolas" w:eastAsia="Times New Roman" w:hAnsi="Consolas" w:cs="Times New Roman"/>
@@ -9732,6 +10418,7 @@
           <w14:ligatures w14:val="none"/>
         </w:rPr>
       </w:pPr>
+      <w:proofErr w:type="gramStart"/>
       <w:r>
         <w:rPr>
           <w:rFonts w:ascii="Consolas" w:eastAsia="Times New Roman" w:hAnsi="Consolas" w:cs="Times New Roman"/>
@@ -9776,6 +10463,7 @@
         </w:rPr>
         <w:t>(</w:t>
       </w:r>
+      <w:proofErr w:type="gramEnd"/>
       <w:r>
         <w:rPr>
           <w:rFonts w:ascii="Consolas" w:eastAsia="Times New Roman" w:hAnsi="Consolas" w:cs="Times New Roman"/>
@@ -9867,6 +10555,7 @@
         </w:rPr>
         <w:t xml:space="preserve"> = </w:t>
       </w:r>
+      <w:proofErr w:type="gramStart"/>
       <w:r>
         <w:rPr>
           <w:rFonts w:ascii="Consolas" w:eastAsia="Times New Roman" w:hAnsi="Consolas" w:cs="Times New Roman"/>
@@ -9889,6 +10578,7 @@
         </w:rPr>
         <w:t>::</w:t>
       </w:r>
+      <w:proofErr w:type="gramEnd"/>
       <w:r>
         <w:rPr>
           <w:rFonts w:ascii="Consolas" w:eastAsia="Times New Roman" w:hAnsi="Consolas" w:cs="Times New Roman"/>
@@ -10345,7 +11035,19 @@
           <w:szCs w:val="21"/>
           <w14:ligatures w14:val="none"/>
         </w:rPr>
-        <w:t>$rows</w:t>
+        <w:t>$</w:t>
+      </w:r>
+      <w:proofErr w:type="gramStart"/>
+      <w:r>
+        <w:rPr>
+          <w:rFonts w:ascii="Consolas" w:eastAsia="Times New Roman" w:hAnsi="Consolas" w:cs="Times New Roman"/>
+          <w:color w:val="001080"/>
+          <w:kern w:val="0"/>
+          <w:sz w:val="21"/>
+          <w:szCs w:val="21"/>
+          <w14:ligatures w14:val="none"/>
+        </w:rPr>
+        <w:t>rows</w:t>
       </w:r>
       <w:r>
         <w:rPr>
@@ -10358,6 +11060,7 @@
         </w:rPr>
         <w:t>[</w:t>
       </w:r>
+      <w:proofErr w:type="gramEnd"/>
       <w:r>
         <w:rPr>
           <w:rFonts w:ascii="Consolas" w:eastAsia="Times New Roman" w:hAnsi="Consolas" w:cs="Times New Roman"/>
@@ -10625,6 +11328,7 @@
         </w:rPr>
         <w:t xml:space="preserve"> </w:t>
       </w:r>
+      <w:proofErr w:type="gramStart"/>
       <w:r>
         <w:rPr>
           <w:rFonts w:ascii="Sakkal Majalla" w:hAnsi="Sakkal Majalla" w:cs="Sakkal Majalla"/>
@@ -10634,7 +11338,19 @@
           <w:sz w:val="28"/>
           <w:szCs w:val="28"/>
         </w:rPr>
-        <w:t>App::make</w:t>
+        <w:t>App::</w:t>
+      </w:r>
+      <w:proofErr w:type="gramEnd"/>
+      <w:r>
+        <w:rPr>
+          <w:rFonts w:ascii="Sakkal Majalla" w:hAnsi="Sakkal Majalla" w:cs="Sakkal Majalla"/>
+          <w:b/>
+          <w:bCs/>
+          <w:color w:val="3A7C22" w:themeColor="accent6" w:themeShade="BF"/>
+          <w:sz w:val="28"/>
+          <w:szCs w:val="28"/>
+        </w:rPr>
+        <w:t>make</w:t>
       </w:r>
       <w:r>
         <w:rPr>
@@ -10672,6 +11388,7 @@
           <w14:ligatures w14:val="none"/>
         </w:rPr>
       </w:pPr>
+      <w:proofErr w:type="gramStart"/>
       <w:r>
         <w:rPr>
           <w:rFonts w:ascii="Consolas" w:eastAsia="Times New Roman" w:hAnsi="Consolas" w:cs="Times New Roman"/>
@@ -10716,6 +11433,7 @@
         </w:rPr>
         <w:t>(</w:t>
       </w:r>
+      <w:proofErr w:type="gramEnd"/>
       <w:r>
         <w:rPr>
           <w:rFonts w:ascii="Consolas" w:eastAsia="Times New Roman" w:hAnsi="Consolas" w:cs="Times New Roman"/>
@@ -10807,6 +11525,7 @@
         </w:rPr>
         <w:t xml:space="preserve"> = </w:t>
       </w:r>
+      <w:proofErr w:type="gramStart"/>
       <w:r>
         <w:rPr>
           <w:rFonts w:ascii="Consolas" w:eastAsia="Times New Roman" w:hAnsi="Consolas" w:cs="Times New Roman"/>
@@ -10849,7 +11568,31 @@
           <w:szCs w:val="21"/>
           <w14:ligatures w14:val="none"/>
         </w:rPr>
-        <w:t>(Swoole\Http\</w:t>
+        <w:t>(</w:t>
+      </w:r>
+      <w:proofErr w:type="gramEnd"/>
+      <w:r>
+        <w:rPr>
+          <w:rFonts w:ascii="Consolas" w:eastAsia="Times New Roman" w:hAnsi="Consolas" w:cs="Times New Roman"/>
+          <w:color w:val="000000"/>
+          <w:kern w:val="0"/>
+          <w:sz w:val="21"/>
+          <w:szCs w:val="21"/>
+          <w14:ligatures w14:val="none"/>
+        </w:rPr>
+        <w:t>Swoole</w:t>
+      </w:r>
+      <w:proofErr w:type="gramStart"/>
+      <w:r>
+        <w:rPr>
+          <w:rFonts w:ascii="Consolas" w:eastAsia="Times New Roman" w:hAnsi="Consolas" w:cs="Times New Roman"/>
+          <w:color w:val="000000"/>
+          <w:kern w:val="0"/>
+          <w:sz w:val="21"/>
+          <w:szCs w:val="21"/>
+          <w14:ligatures w14:val="none"/>
+        </w:rPr>
+        <w:t>\Http\</w:t>
       </w:r>
       <w:r>
         <w:rPr>
@@ -10873,6 +11616,7 @@
         </w:rPr>
         <w:t>::</w:t>
       </w:r>
+      <w:proofErr w:type="gramEnd"/>
       <w:r>
         <w:rPr>
           <w:rFonts w:ascii="Consolas" w:eastAsia="Times New Roman" w:hAnsi="Consolas" w:cs="Times New Roman"/>
@@ -10964,6 +11708,7 @@
         </w:rPr>
         <w:t>-&gt;</w:t>
       </w:r>
+      <w:proofErr w:type="gramStart"/>
       <w:r>
         <w:rPr>
           <w:rFonts w:ascii="Consolas" w:eastAsia="Times New Roman" w:hAnsi="Consolas" w:cs="Times New Roman"/>
@@ -10984,7 +11729,19 @@
           <w:szCs w:val="21"/>
           <w14:ligatures w14:val="none"/>
         </w:rPr>
-        <w:t>();</w:t>
+        <w:t>(</w:t>
+      </w:r>
+      <w:proofErr w:type="gramEnd"/>
+      <w:r>
+        <w:rPr>
+          <w:rFonts w:ascii="Consolas" w:eastAsia="Times New Roman" w:hAnsi="Consolas" w:cs="Times New Roman"/>
+          <w:color w:val="000000"/>
+          <w:kern w:val="0"/>
+          <w:sz w:val="21"/>
+          <w:szCs w:val="21"/>
+          <w14:ligatures w14:val="none"/>
+        </w:rPr>
+        <w:t>);</w:t>
       </w:r>
     </w:p>
     <w:p>
@@ -11115,6 +11872,7 @@
           <w14:ligatures w14:val="none"/>
         </w:rPr>
       </w:pPr>
+      <w:proofErr w:type="gramStart"/>
       <w:r>
         <w:rPr>
           <w:rFonts w:ascii="Consolas" w:eastAsia="Times New Roman" w:hAnsi="Consolas" w:cs="Times New Roman"/>
@@ -11159,6 +11917,7 @@
         </w:rPr>
         <w:t>(</w:t>
       </w:r>
+      <w:proofErr w:type="gramEnd"/>
       <w:r>
         <w:rPr>
           <w:rFonts w:ascii="Consolas" w:eastAsia="Times New Roman" w:hAnsi="Consolas" w:cs="Times New Roman"/>
@@ -11203,6 +11962,7 @@
         </w:rPr>
         <w:t xml:space="preserve">, </w:t>
       </w:r>
+      <w:proofErr w:type="gramStart"/>
       <w:r>
         <w:rPr>
           <w:rFonts w:ascii="Consolas" w:eastAsia="Times New Roman" w:hAnsi="Consolas" w:cs="Times New Roman"/>
@@ -11223,7 +11983,19 @@
           <w:szCs w:val="21"/>
           <w14:ligatures w14:val="none"/>
         </w:rPr>
-        <w:t>() {</w:t>
+        <w:t>(</w:t>
+      </w:r>
+      <w:proofErr w:type="gramEnd"/>
+      <w:r>
+        <w:rPr>
+          <w:rFonts w:ascii="Consolas" w:eastAsia="Times New Roman" w:hAnsi="Consolas" w:cs="Times New Roman"/>
+          <w:color w:val="000000"/>
+          <w:kern w:val="0"/>
+          <w:sz w:val="21"/>
+          <w:szCs w:val="21"/>
+          <w14:ligatures w14:val="none"/>
+        </w:rPr>
+        <w:t>) {</w:t>
       </w:r>
     </w:p>
     <w:p>
@@ -11294,6 +12066,7 @@
         </w:rPr>
         <w:t xml:space="preserve"> </w:t>
       </w:r>
+      <w:proofErr w:type="gramStart"/>
       <w:r>
         <w:rPr>
           <w:rFonts w:ascii="Consolas" w:eastAsia="Times New Roman" w:hAnsi="Consolas" w:cs="Times New Roman"/>
@@ -11314,7 +12087,19 @@
           <w:szCs w:val="21"/>
           <w14:ligatures w14:val="none"/>
         </w:rPr>
-        <w:t>((</w:t>
+        <w:t>(</w:t>
+      </w:r>
+      <w:proofErr w:type="gramEnd"/>
+      <w:r>
+        <w:rPr>
+          <w:rFonts w:ascii="Consolas" w:eastAsia="Times New Roman" w:hAnsi="Consolas" w:cs="Times New Roman"/>
+          <w:color w:val="000000"/>
+          <w:kern w:val="0"/>
+          <w:sz w:val="21"/>
+          <w:szCs w:val="21"/>
+          <w14:ligatures w14:val="none"/>
+        </w:rPr>
+        <w:t>(</w:t>
       </w:r>
       <w:r>
         <w:rPr>
@@ -11360,6 +12145,7 @@
         </w:rPr>
         <w:t>)-&gt;</w:t>
       </w:r>
+      <w:proofErr w:type="gramStart"/>
       <w:r>
         <w:rPr>
           <w:rFonts w:ascii="Consolas" w:eastAsia="Times New Roman" w:hAnsi="Consolas" w:cs="Times New Roman"/>
@@ -11380,7 +12166,19 @@
           <w:szCs w:val="21"/>
           <w14:ligatures w14:val="none"/>
         </w:rPr>
-        <w:t>());</w:t>
+        <w:t>(</w:t>
+      </w:r>
+      <w:proofErr w:type="gramEnd"/>
+      <w:r>
+        <w:rPr>
+          <w:rFonts w:ascii="Consolas" w:eastAsia="Times New Roman" w:hAnsi="Consolas" w:cs="Times New Roman"/>
+          <w:color w:val="000000"/>
+          <w:kern w:val="0"/>
+          <w:sz w:val="21"/>
+          <w:szCs w:val="21"/>
+          <w14:ligatures w14:val="none"/>
+        </w:rPr>
+        <w:t>));</w:t>
       </w:r>
     </w:p>
     <w:p>
@@ -11435,6 +12233,7 @@
           <w14:ligatures w14:val="none"/>
         </w:rPr>
       </w:pPr>
+      <w:proofErr w:type="gramStart"/>
       <w:r>
         <w:rPr>
           <w:rFonts w:ascii="Consolas" w:eastAsia="Times New Roman" w:hAnsi="Consolas" w:cs="Times New Roman"/>
@@ -11479,6 +12278,7 @@
         </w:rPr>
         <w:t>(</w:t>
       </w:r>
+      <w:proofErr w:type="gramEnd"/>
       <w:r>
         <w:rPr>
           <w:rFonts w:ascii="Consolas" w:eastAsia="Times New Roman" w:hAnsi="Consolas" w:cs="Times New Roman"/>
@@ -11523,6 +12323,7 @@
         </w:rPr>
         <w:t xml:space="preserve">, </w:t>
       </w:r>
+      <w:proofErr w:type="gramStart"/>
       <w:r>
         <w:rPr>
           <w:rFonts w:ascii="Consolas" w:eastAsia="Times New Roman" w:hAnsi="Consolas" w:cs="Times New Roman"/>
@@ -11543,7 +12344,19 @@
           <w:szCs w:val="21"/>
           <w14:ligatures w14:val="none"/>
         </w:rPr>
-        <w:t>() {</w:t>
+        <w:t>(</w:t>
+      </w:r>
+      <w:proofErr w:type="gramEnd"/>
+      <w:r>
+        <w:rPr>
+          <w:rFonts w:ascii="Consolas" w:eastAsia="Times New Roman" w:hAnsi="Consolas" w:cs="Times New Roman"/>
+          <w:color w:val="000000"/>
+          <w:kern w:val="0"/>
+          <w:sz w:val="21"/>
+          <w:szCs w:val="21"/>
+          <w14:ligatures w14:val="none"/>
+        </w:rPr>
+        <w:t>) {</w:t>
       </w:r>
     </w:p>
     <w:p>
@@ -11614,6 +12427,7 @@
         </w:rPr>
         <w:t xml:space="preserve"> </w:t>
       </w:r>
+      <w:proofErr w:type="gramStart"/>
       <w:r>
         <w:rPr>
           <w:rFonts w:ascii="Consolas" w:eastAsia="Times New Roman" w:hAnsi="Consolas" w:cs="Times New Roman"/>
@@ -11634,7 +12448,19 @@
           <w:szCs w:val="21"/>
           <w14:ligatures w14:val="none"/>
         </w:rPr>
-        <w:t>((</w:t>
+        <w:t>(</w:t>
+      </w:r>
+      <w:proofErr w:type="gramEnd"/>
+      <w:r>
+        <w:rPr>
+          <w:rFonts w:ascii="Consolas" w:eastAsia="Times New Roman" w:hAnsi="Consolas" w:cs="Times New Roman"/>
+          <w:color w:val="000000"/>
+          <w:kern w:val="0"/>
+          <w:sz w:val="21"/>
+          <w:szCs w:val="21"/>
+          <w14:ligatures w14:val="none"/>
+        </w:rPr>
+        <w:t>(</w:t>
       </w:r>
       <w:r>
         <w:rPr>
@@ -11680,6 +12506,7 @@
         </w:rPr>
         <w:t>)-&gt;</w:t>
       </w:r>
+      <w:proofErr w:type="gramStart"/>
       <w:r>
         <w:rPr>
           <w:rFonts w:ascii="Consolas" w:eastAsia="Times New Roman" w:hAnsi="Consolas" w:cs="Times New Roman"/>
@@ -11700,7 +12527,19 @@
           <w:szCs w:val="21"/>
           <w14:ligatures w14:val="none"/>
         </w:rPr>
-        <w:t>());</w:t>
+        <w:t>(</w:t>
+      </w:r>
+      <w:proofErr w:type="gramEnd"/>
+      <w:r>
+        <w:rPr>
+          <w:rFonts w:ascii="Consolas" w:eastAsia="Times New Roman" w:hAnsi="Consolas" w:cs="Times New Roman"/>
+          <w:color w:val="000000"/>
+          <w:kern w:val="0"/>
+          <w:sz w:val="21"/>
+          <w:szCs w:val="21"/>
+          <w14:ligatures w14:val="none"/>
+        </w:rPr>
+        <w:t>));</w:t>
       </w:r>
     </w:p>
     <w:p>
@@ -11975,6 +12814,7 @@
         </w:rPr>
         <w:t xml:space="preserve"> </w:t>
       </w:r>
+      <w:proofErr w:type="gramStart"/>
       <w:r>
         <w:rPr>
           <w:rFonts w:ascii="Consolas" w:eastAsia="Times New Roman" w:hAnsi="Consolas" w:cs="Times New Roman"/>
@@ -11997,6 +12837,7 @@
         </w:rPr>
         <w:t>(</w:t>
       </w:r>
+      <w:proofErr w:type="gramEnd"/>
       <w:r>
         <w:rPr>
           <w:rFonts w:ascii="Consolas" w:eastAsia="Times New Roman" w:hAnsi="Consolas" w:cs="Times New Roman"/>
@@ -12190,6 +13031,7 @@
         </w:rPr>
         <w:t>-&gt;</w:t>
       </w:r>
+      <w:proofErr w:type="gramStart"/>
       <w:r>
         <w:rPr>
           <w:rFonts w:ascii="Consolas" w:eastAsia="Times New Roman" w:hAnsi="Consolas" w:cs="Times New Roman"/>
@@ -12212,6 +13054,7 @@
         </w:rPr>
         <w:t>(</w:t>
       </w:r>
+      <w:proofErr w:type="gramEnd"/>
       <w:r>
         <w:rPr>
           <w:rFonts w:ascii="Consolas" w:eastAsia="Times New Roman" w:hAnsi="Consolas" w:cs="Times New Roman"/>
@@ -12256,6 +13099,7 @@
         </w:rPr>
         <w:t>)-&gt;</w:t>
       </w:r>
+      <w:proofErr w:type="gramStart"/>
       <w:r>
         <w:rPr>
           <w:rFonts w:ascii="Consolas" w:eastAsia="Times New Roman" w:hAnsi="Consolas" w:cs="Times New Roman"/>
@@ -12278,6 +13122,7 @@
         </w:rPr>
         <w:t>(</w:t>
       </w:r>
+      <w:proofErr w:type="gramEnd"/>
       <w:r>
         <w:rPr>
           <w:rFonts w:ascii="Consolas" w:eastAsia="Times New Roman" w:hAnsi="Consolas" w:cs="Times New Roman"/>
@@ -12388,6 +13233,7 @@
         </w:rPr>
         <w:t>)-&gt;</w:t>
       </w:r>
+      <w:proofErr w:type="gramStart"/>
       <w:r>
         <w:rPr>
           <w:rFonts w:ascii="Consolas" w:eastAsia="Times New Roman" w:hAnsi="Consolas" w:cs="Times New Roman"/>
@@ -12410,6 +13256,7 @@
         </w:rPr>
         <w:t>(</w:t>
       </w:r>
+      <w:proofErr w:type="gramEnd"/>
       <w:r>
         <w:rPr>
           <w:rFonts w:ascii="Consolas" w:eastAsia="Times New Roman" w:hAnsi="Consolas" w:cs="Times New Roman"/>
@@ -12565,6 +13412,7 @@
         </w:rPr>
         <w:t xml:space="preserve"> </w:t>
       </w:r>
+      <w:proofErr w:type="gramStart"/>
       <w:r>
         <w:rPr>
           <w:rFonts w:ascii="Consolas" w:eastAsia="Times New Roman" w:hAnsi="Consolas" w:cs="Times New Roman"/>
@@ -12585,7 +13433,19 @@
           <w:szCs w:val="21"/>
           <w14:ligatures w14:val="none"/>
         </w:rPr>
-        <w:t>() {</w:t>
+        <w:t>(</w:t>
+      </w:r>
+      <w:proofErr w:type="gramEnd"/>
+      <w:r>
+        <w:rPr>
+          <w:rFonts w:ascii="Consolas" w:eastAsia="Times New Roman" w:hAnsi="Consolas" w:cs="Times New Roman"/>
+          <w:color w:val="000000"/>
+          <w:kern w:val="0"/>
+          <w:sz w:val="21"/>
+          <w:szCs w:val="21"/>
+          <w14:ligatures w14:val="none"/>
+        </w:rPr>
+        <w:t>) {</w:t>
       </w:r>
     </w:p>
     <w:p>
@@ -12838,6 +13698,7 @@
         </w:rPr>
         <w:t xml:space="preserve">] = </w:t>
       </w:r>
+      <w:proofErr w:type="gramStart"/>
       <w:r>
         <w:rPr>
           <w:rFonts w:ascii="Consolas" w:eastAsia="Times New Roman" w:hAnsi="Consolas" w:cs="Times New Roman"/>
@@ -12880,7 +13741,19 @@
           <w:szCs w:val="21"/>
           <w14:ligatures w14:val="none"/>
         </w:rPr>
-        <w:t>([</w:t>
+        <w:t>(</w:t>
+      </w:r>
+      <w:proofErr w:type="gramEnd"/>
+      <w:r>
+        <w:rPr>
+          <w:rFonts w:ascii="Consolas" w:eastAsia="Times New Roman" w:hAnsi="Consolas" w:cs="Times New Roman"/>
+          <w:color w:val="000000"/>
+          <w:kern w:val="0"/>
+          <w:sz w:val="21"/>
+          <w:szCs w:val="21"/>
+          <w14:ligatures w14:val="none"/>
+        </w:rPr>
+        <w:t>[</w:t>
       </w:r>
     </w:p>
     <w:p>
@@ -12929,6 +13802,7 @@
         </w:rPr>
         <w:t xml:space="preserve"> () =&gt; </w:t>
       </w:r>
+      <w:proofErr w:type="gramStart"/>
       <w:r>
         <w:rPr>
           <w:rFonts w:ascii="Consolas" w:eastAsia="Times New Roman" w:hAnsi="Consolas" w:cs="Times New Roman"/>
@@ -12971,7 +13845,19 @@
           <w:szCs w:val="21"/>
           <w14:ligatures w14:val="none"/>
         </w:rPr>
-        <w:t>(),</w:t>
+        <w:t>(</w:t>
+      </w:r>
+      <w:proofErr w:type="gramEnd"/>
+      <w:r>
+        <w:rPr>
+          <w:rFonts w:ascii="Consolas" w:eastAsia="Times New Roman" w:hAnsi="Consolas" w:cs="Times New Roman"/>
+          <w:color w:val="000000"/>
+          <w:kern w:val="0"/>
+          <w:sz w:val="21"/>
+          <w:szCs w:val="21"/>
+          <w14:ligatures w14:val="none"/>
+        </w:rPr>
+        <w:t>),</w:t>
       </w:r>
     </w:p>
     <w:p>
@@ -13020,6 +13906,7 @@
         </w:rPr>
         <w:t xml:space="preserve"> () =&gt; </w:t>
       </w:r>
+      <w:proofErr w:type="gramStart"/>
       <w:r>
         <w:rPr>
           <w:rFonts w:ascii="Consolas" w:eastAsia="Times New Roman" w:hAnsi="Consolas" w:cs="Times New Roman"/>
@@ -13042,6 +13929,7 @@
         </w:rPr>
         <w:t>::</w:t>
       </w:r>
+      <w:proofErr w:type="gramEnd"/>
       <w:r>
         <w:rPr>
           <w:rFonts w:ascii="Consolas" w:eastAsia="Times New Roman" w:hAnsi="Consolas" w:cs="Times New Roman"/>
@@ -13086,6 +13974,7 @@
         </w:rPr>
         <w:t>)-&gt;</w:t>
       </w:r>
+      <w:proofErr w:type="gramStart"/>
       <w:r>
         <w:rPr>
           <w:rFonts w:ascii="Consolas" w:eastAsia="Times New Roman" w:hAnsi="Consolas" w:cs="Times New Roman"/>
@@ -13106,7 +13995,19 @@
           <w:szCs w:val="21"/>
           <w14:ligatures w14:val="none"/>
         </w:rPr>
-        <w:t>(),</w:t>
+        <w:t>(</w:t>
+      </w:r>
+      <w:proofErr w:type="gramEnd"/>
+      <w:r>
+        <w:rPr>
+          <w:rFonts w:ascii="Consolas" w:eastAsia="Times New Roman" w:hAnsi="Consolas" w:cs="Times New Roman"/>
+          <w:color w:val="000000"/>
+          <w:kern w:val="0"/>
+          <w:sz w:val="21"/>
+          <w:szCs w:val="21"/>
+          <w14:ligatures w14:val="none"/>
+        </w:rPr>
+        <w:t>),</w:t>
       </w:r>
     </w:p>
     <w:p>
@@ -13155,6 +14056,7 @@
         </w:rPr>
         <w:t xml:space="preserve"> () =&gt; </w:t>
       </w:r>
+      <w:proofErr w:type="gramStart"/>
       <w:r>
         <w:rPr>
           <w:rFonts w:ascii="Consolas" w:eastAsia="Times New Roman" w:hAnsi="Consolas" w:cs="Times New Roman"/>
@@ -13177,6 +14079,7 @@
         </w:rPr>
         <w:t>::</w:t>
       </w:r>
+      <w:proofErr w:type="gramEnd"/>
       <w:r>
         <w:rPr>
           <w:rFonts w:ascii="Consolas" w:eastAsia="Times New Roman" w:hAnsi="Consolas" w:cs="Times New Roman"/>
@@ -13221,6 +14124,7 @@
         </w:rPr>
         <w:t>)-&gt;</w:t>
       </w:r>
+      <w:proofErr w:type="gramStart"/>
       <w:r>
         <w:rPr>
           <w:rFonts w:ascii="Consolas" w:eastAsia="Times New Roman" w:hAnsi="Consolas" w:cs="Times New Roman"/>
@@ -13241,7 +14145,19 @@
           <w:szCs w:val="21"/>
           <w14:ligatures w14:val="none"/>
         </w:rPr>
-        <w:t>(),</w:t>
+        <w:t>(</w:t>
+      </w:r>
+      <w:proofErr w:type="gramEnd"/>
+      <w:r>
+        <w:rPr>
+          <w:rFonts w:ascii="Consolas" w:eastAsia="Times New Roman" w:hAnsi="Consolas" w:cs="Times New Roman"/>
+          <w:color w:val="000000"/>
+          <w:kern w:val="0"/>
+          <w:sz w:val="21"/>
+          <w:szCs w:val="21"/>
+          <w14:ligatures w14:val="none"/>
+        </w:rPr>
+        <w:t>),</w:t>
       </w:r>
     </w:p>
     <w:p>
@@ -13290,6 +14206,7 @@
         </w:rPr>
         <w:t xml:space="preserve"> () =&gt; </w:t>
       </w:r>
+      <w:proofErr w:type="gramStart"/>
       <w:r>
         <w:rPr>
           <w:rFonts w:ascii="Consolas" w:eastAsia="Times New Roman" w:hAnsi="Consolas" w:cs="Times New Roman"/>
@@ -13312,6 +14229,7 @@
         </w:rPr>
         <w:t>::</w:t>
       </w:r>
+      <w:proofErr w:type="gramEnd"/>
       <w:r>
         <w:rPr>
           <w:rFonts w:ascii="Consolas" w:eastAsia="Times New Roman" w:hAnsi="Consolas" w:cs="Times New Roman"/>
@@ -13356,6 +14274,7 @@
         </w:rPr>
         <w:t>)-&gt;</w:t>
       </w:r>
+      <w:proofErr w:type="gramStart"/>
       <w:r>
         <w:rPr>
           <w:rFonts w:ascii="Consolas" w:eastAsia="Times New Roman" w:hAnsi="Consolas" w:cs="Times New Roman"/>
@@ -13376,7 +14295,19 @@
           <w:szCs w:val="21"/>
           <w14:ligatures w14:val="none"/>
         </w:rPr>
-        <w:t>(),</w:t>
+        <w:t>(</w:t>
+      </w:r>
+      <w:proofErr w:type="gramEnd"/>
+      <w:r>
+        <w:rPr>
+          <w:rFonts w:ascii="Consolas" w:eastAsia="Times New Roman" w:hAnsi="Consolas" w:cs="Times New Roman"/>
+          <w:color w:val="000000"/>
+          <w:kern w:val="0"/>
+          <w:sz w:val="21"/>
+          <w:szCs w:val="21"/>
+          <w14:ligatures w14:val="none"/>
+        </w:rPr>
+        <w:t>),</w:t>
       </w:r>
     </w:p>
     <w:p>
@@ -13440,8 +14371,518 @@
           <w:szCs w:val="21"/>
           <w14:ligatures w14:val="none"/>
         </w:rPr>
+        <w:t xml:space="preserve">        </w:t>
+      </w:r>
+      <w:proofErr w:type="gramStart"/>
+      <w:r>
+        <w:rPr>
+          <w:rFonts w:ascii="Consolas" w:eastAsia="Times New Roman" w:hAnsi="Consolas" w:cs="Times New Roman"/>
+          <w:color w:val="000000"/>
+          <w:kern w:val="0"/>
+          <w:sz w:val="21"/>
+          <w:szCs w:val="21"/>
+          <w14:ligatures w14:val="none"/>
+        </w:rPr>
+        <w:t>}</w:t>
+      </w:r>
+      <w:r>
+        <w:rPr>
+          <w:rFonts w:ascii="Consolas" w:eastAsia="Times New Roman" w:hAnsi="Consolas" w:cs="Times New Roman"/>
+          <w:color w:val="AF00DB"/>
+          <w:kern w:val="0"/>
+          <w:sz w:val="21"/>
+          <w:szCs w:val="21"/>
+          <w14:ligatures w14:val="none"/>
+        </w:rPr>
+        <w:t>catch</w:t>
+      </w:r>
+      <w:proofErr w:type="gramEnd"/>
+      <w:r>
+        <w:rPr>
+          <w:rFonts w:ascii="Consolas" w:eastAsia="Times New Roman" w:hAnsi="Consolas" w:cs="Times New Roman"/>
+          <w:color w:val="000000"/>
+          <w:kern w:val="0"/>
+          <w:sz w:val="21"/>
+          <w:szCs w:val="21"/>
+          <w14:ligatures w14:val="none"/>
+        </w:rPr>
+        <w:t xml:space="preserve"> (</w:t>
+      </w:r>
+      <w:r>
+        <w:rPr>
+          <w:rFonts w:ascii="Consolas" w:eastAsia="Times New Roman" w:hAnsi="Consolas" w:cs="Times New Roman"/>
+          <w:color w:val="267F99"/>
+          <w:kern w:val="0"/>
+          <w:sz w:val="21"/>
+          <w:szCs w:val="21"/>
+          <w14:ligatures w14:val="none"/>
+        </w:rPr>
+        <w:t>TaskTimeoutException</w:t>
+      </w:r>
+      <w:r>
+        <w:rPr>
+          <w:rFonts w:ascii="Consolas" w:eastAsia="Times New Roman" w:hAnsi="Consolas" w:cs="Times New Roman"/>
+          <w:color w:val="000000"/>
+          <w:kern w:val="0"/>
+          <w:sz w:val="21"/>
+          <w:szCs w:val="21"/>
+          <w14:ligatures w14:val="none"/>
+        </w:rPr>
+        <w:t xml:space="preserve"> </w:t>
+      </w:r>
+      <w:r>
+        <w:rPr>
+          <w:rFonts w:ascii="Consolas" w:eastAsia="Times New Roman" w:hAnsi="Consolas" w:cs="Times New Roman"/>
+          <w:color w:val="001080"/>
+          <w:kern w:val="0"/>
+          <w:sz w:val="21"/>
+          <w:szCs w:val="21"/>
+          <w14:ligatures w14:val="none"/>
+        </w:rPr>
+        <w:t>$e</w:t>
+      </w:r>
+      <w:r>
+        <w:rPr>
+          <w:rFonts w:ascii="Consolas" w:eastAsia="Times New Roman" w:hAnsi="Consolas" w:cs="Times New Roman"/>
+          <w:color w:val="000000"/>
+          <w:kern w:val="0"/>
+          <w:sz w:val="21"/>
+          <w:szCs w:val="21"/>
+          <w14:ligatures w14:val="none"/>
+        </w:rPr>
+        <w:t>) {</w:t>
+      </w:r>
+    </w:p>
+    <w:p>
+      <w:pPr>
+        <w:shd w:val="clear" w:color="auto" w:fill="FFFFFF"/>
+        <w:spacing w:after="0" w:line="285" w:lineRule="atLeast"/>
+        <w:rPr>
+          <w:rFonts w:ascii="Consolas" w:eastAsia="Times New Roman" w:hAnsi="Consolas" w:cs="Times New Roman"/>
+          <w:color w:val="3B3B3B"/>
+          <w:kern w:val="0"/>
+          <w:sz w:val="21"/>
+          <w:szCs w:val="21"/>
+          <w14:ligatures w14:val="none"/>
+        </w:rPr>
+      </w:pPr>
+      <w:r>
+        <w:rPr>
+          <w:rFonts w:ascii="Consolas" w:eastAsia="Times New Roman" w:hAnsi="Consolas" w:cs="Times New Roman"/>
+          <w:color w:val="000000"/>
+          <w:kern w:val="0"/>
+          <w:sz w:val="21"/>
+          <w:szCs w:val="21"/>
+          <w14:ligatures w14:val="none"/>
+        </w:rPr>
+        <w:t xml:space="preserve">            </w:t>
+      </w:r>
+      <w:r>
+        <w:rPr>
+          <w:rFonts w:ascii="Consolas" w:eastAsia="Times New Roman" w:hAnsi="Consolas" w:cs="Times New Roman"/>
+          <w:color w:val="AF00DB"/>
+          <w:kern w:val="0"/>
+          <w:sz w:val="21"/>
+          <w:szCs w:val="21"/>
+          <w14:ligatures w14:val="none"/>
+        </w:rPr>
+        <w:t>return</w:t>
+      </w:r>
+      <w:r>
+        <w:rPr>
+          <w:rFonts w:ascii="Consolas" w:eastAsia="Times New Roman" w:hAnsi="Consolas" w:cs="Times New Roman"/>
+          <w:color w:val="000000"/>
+          <w:kern w:val="0"/>
+          <w:sz w:val="21"/>
+          <w:szCs w:val="21"/>
+          <w14:ligatures w14:val="none"/>
+        </w:rPr>
+        <w:t xml:space="preserve"> </w:t>
+      </w:r>
+      <w:proofErr w:type="gramStart"/>
+      <w:r>
+        <w:rPr>
+          <w:rFonts w:ascii="Consolas" w:eastAsia="Times New Roman" w:hAnsi="Consolas" w:cs="Times New Roman"/>
+          <w:color w:val="795E26"/>
+          <w:kern w:val="0"/>
+          <w:sz w:val="21"/>
+          <w:szCs w:val="21"/>
+          <w14:ligatures w14:val="none"/>
+        </w:rPr>
+        <w:t>response</w:t>
+      </w:r>
+      <w:r>
+        <w:rPr>
+          <w:rFonts w:ascii="Consolas" w:eastAsia="Times New Roman" w:hAnsi="Consolas" w:cs="Times New Roman"/>
+          <w:color w:val="000000"/>
+          <w:kern w:val="0"/>
+          <w:sz w:val="21"/>
+          <w:szCs w:val="21"/>
+          <w14:ligatures w14:val="none"/>
+        </w:rPr>
+        <w:t>(</w:t>
+      </w:r>
+      <w:proofErr w:type="gramEnd"/>
+      <w:r>
+        <w:rPr>
+          <w:rFonts w:ascii="Consolas" w:eastAsia="Times New Roman" w:hAnsi="Consolas" w:cs="Times New Roman"/>
+          <w:color w:val="000000"/>
+          <w:kern w:val="0"/>
+          <w:sz w:val="21"/>
+          <w:szCs w:val="21"/>
+          <w14:ligatures w14:val="none"/>
+        </w:rPr>
+        <w:t>)-&gt;</w:t>
+      </w:r>
+      <w:proofErr w:type="gramStart"/>
+      <w:r>
+        <w:rPr>
+          <w:rFonts w:ascii="Consolas" w:eastAsia="Times New Roman" w:hAnsi="Consolas" w:cs="Times New Roman"/>
+          <w:color w:val="795E26"/>
+          <w:kern w:val="0"/>
+          <w:sz w:val="21"/>
+          <w:szCs w:val="21"/>
+          <w14:ligatures w14:val="none"/>
+        </w:rPr>
+        <w:t>json</w:t>
+      </w:r>
+      <w:r>
+        <w:rPr>
+          <w:rFonts w:ascii="Consolas" w:eastAsia="Times New Roman" w:hAnsi="Consolas" w:cs="Times New Roman"/>
+          <w:color w:val="000000"/>
+          <w:kern w:val="0"/>
+          <w:sz w:val="21"/>
+          <w:szCs w:val="21"/>
+          <w14:ligatures w14:val="none"/>
+        </w:rPr>
+        <w:t>(</w:t>
+      </w:r>
+      <w:proofErr w:type="gramEnd"/>
+      <w:r>
+        <w:rPr>
+          <w:rFonts w:ascii="Consolas" w:eastAsia="Times New Roman" w:hAnsi="Consolas" w:cs="Times New Roman"/>
+          <w:color w:val="000000"/>
+          <w:kern w:val="0"/>
+          <w:sz w:val="21"/>
+          <w:szCs w:val="21"/>
+          <w14:ligatures w14:val="none"/>
+        </w:rPr>
+        <w:t>[</w:t>
+      </w:r>
+    </w:p>
+    <w:p>
+      <w:pPr>
+        <w:shd w:val="clear" w:color="auto" w:fill="FFFFFF"/>
+        <w:spacing w:after="0" w:line="285" w:lineRule="atLeast"/>
+        <w:rPr>
+          <w:rFonts w:ascii="Consolas" w:eastAsia="Times New Roman" w:hAnsi="Consolas" w:cs="Times New Roman"/>
+          <w:color w:val="3B3B3B"/>
+          <w:kern w:val="0"/>
+          <w:sz w:val="21"/>
+          <w:szCs w:val="21"/>
+          <w14:ligatures w14:val="none"/>
+        </w:rPr>
+      </w:pPr>
+      <w:r>
+        <w:rPr>
+          <w:rFonts w:ascii="Consolas" w:eastAsia="Times New Roman" w:hAnsi="Consolas" w:cs="Times New Roman"/>
+          <w:color w:val="000000"/>
+          <w:kern w:val="0"/>
+          <w:sz w:val="21"/>
+          <w:szCs w:val="21"/>
+          <w14:ligatures w14:val="none"/>
+        </w:rPr>
+        <w:t xml:space="preserve">                </w:t>
+      </w:r>
+      <w:r>
+        <w:rPr>
+          <w:rFonts w:ascii="Consolas" w:eastAsia="Times New Roman" w:hAnsi="Consolas" w:cs="Times New Roman"/>
+          <w:color w:val="A31515"/>
+          <w:kern w:val="0"/>
+          <w:sz w:val="21"/>
+          <w:szCs w:val="21"/>
+          <w14:ligatures w14:val="none"/>
+        </w:rPr>
+        <w:t>"msg"</w:t>
+      </w:r>
+      <w:r>
+        <w:rPr>
+          <w:rFonts w:ascii="Consolas" w:eastAsia="Times New Roman" w:hAnsi="Consolas" w:cs="Times New Roman"/>
+          <w:color w:val="000000"/>
+          <w:kern w:val="0"/>
+          <w:sz w:val="21"/>
+          <w:szCs w:val="21"/>
+          <w14:ligatures w14:val="none"/>
+        </w:rPr>
+        <w:t xml:space="preserve"> =&gt; </w:t>
+      </w:r>
+      <w:r>
+        <w:rPr>
+          <w:rFonts w:ascii="Consolas" w:eastAsia="Times New Roman" w:hAnsi="Consolas" w:cs="Times New Roman"/>
+          <w:color w:val="001080"/>
+          <w:kern w:val="0"/>
+          <w:sz w:val="21"/>
+          <w:szCs w:val="21"/>
+          <w14:ligatures w14:val="none"/>
+        </w:rPr>
+        <w:t>$e</w:t>
+      </w:r>
+      <w:r>
+        <w:rPr>
+          <w:rFonts w:ascii="Consolas" w:eastAsia="Times New Roman" w:hAnsi="Consolas" w:cs="Times New Roman"/>
+          <w:color w:val="000000"/>
+          <w:kern w:val="0"/>
+          <w:sz w:val="21"/>
+          <w:szCs w:val="21"/>
+          <w14:ligatures w14:val="none"/>
+        </w:rPr>
+        <w:t>-&gt;</w:t>
+      </w:r>
+      <w:proofErr w:type="gramStart"/>
+      <w:r>
+        <w:rPr>
+          <w:rFonts w:ascii="Consolas" w:eastAsia="Times New Roman" w:hAnsi="Consolas" w:cs="Times New Roman"/>
+          <w:color w:val="795E26"/>
+          <w:kern w:val="0"/>
+          <w:sz w:val="21"/>
+          <w:szCs w:val="21"/>
+          <w14:ligatures w14:val="none"/>
+        </w:rPr>
+        <w:t>getMessage</w:t>
+      </w:r>
+      <w:r>
+        <w:rPr>
+          <w:rFonts w:ascii="Consolas" w:eastAsia="Times New Roman" w:hAnsi="Consolas" w:cs="Times New Roman"/>
+          <w:color w:val="000000"/>
+          <w:kern w:val="0"/>
+          <w:sz w:val="21"/>
+          <w:szCs w:val="21"/>
+          <w14:ligatures w14:val="none"/>
+        </w:rPr>
+        <w:t>(</w:t>
+      </w:r>
+      <w:proofErr w:type="gramEnd"/>
+      <w:r>
+        <w:rPr>
+          <w:rFonts w:ascii="Consolas" w:eastAsia="Times New Roman" w:hAnsi="Consolas" w:cs="Times New Roman"/>
+          <w:color w:val="000000"/>
+          <w:kern w:val="0"/>
+          <w:sz w:val="21"/>
+          <w:szCs w:val="21"/>
+          <w14:ligatures w14:val="none"/>
+        </w:rPr>
+        <w:t>),</w:t>
+      </w:r>
+    </w:p>
+    <w:p>
+      <w:pPr>
+        <w:shd w:val="clear" w:color="auto" w:fill="FFFFFF"/>
+        <w:spacing w:after="0" w:line="285" w:lineRule="atLeast"/>
+        <w:rPr>
+          <w:rFonts w:ascii="Consolas" w:eastAsia="Times New Roman" w:hAnsi="Consolas" w:cs="Times New Roman"/>
+          <w:color w:val="3B3B3B"/>
+          <w:kern w:val="0"/>
+          <w:sz w:val="21"/>
+          <w:szCs w:val="21"/>
+          <w14:ligatures w14:val="none"/>
+        </w:rPr>
+      </w:pPr>
+      <w:r>
+        <w:rPr>
+          <w:rFonts w:ascii="Consolas" w:eastAsia="Times New Roman" w:hAnsi="Consolas" w:cs="Times New Roman"/>
+          <w:color w:val="000000"/>
+          <w:kern w:val="0"/>
+          <w:sz w:val="21"/>
+          <w:szCs w:val="21"/>
+          <w14:ligatures w14:val="none"/>
+        </w:rPr>
+        <w:t>            ]);</w:t>
+      </w:r>
+    </w:p>
+    <w:p>
+      <w:pPr>
+        <w:shd w:val="clear" w:color="auto" w:fill="FFFFFF"/>
+        <w:spacing w:after="0" w:line="285" w:lineRule="atLeast"/>
+        <w:rPr>
+          <w:rFonts w:ascii="Consolas" w:eastAsia="Times New Roman" w:hAnsi="Consolas" w:cs="Times New Roman"/>
+          <w:color w:val="3B3B3B"/>
+          <w:kern w:val="0"/>
+          <w:sz w:val="21"/>
+          <w:szCs w:val="21"/>
+          <w14:ligatures w14:val="none"/>
+        </w:rPr>
+      </w:pPr>
+      <w:r>
+        <w:rPr>
+          <w:rFonts w:ascii="Consolas" w:eastAsia="Times New Roman" w:hAnsi="Consolas" w:cs="Times New Roman"/>
+          <w:color w:val="000000"/>
+          <w:kern w:val="0"/>
+          <w:sz w:val="21"/>
+          <w:szCs w:val="21"/>
+          <w14:ligatures w14:val="none"/>
+        </w:rPr>
         <w:t>        }</w:t>
       </w:r>
+    </w:p>
+    <w:p>
+      <w:pPr>
+        <w:shd w:val="clear" w:color="auto" w:fill="FFFFFF"/>
+        <w:spacing w:after="0" w:line="285" w:lineRule="atLeast"/>
+        <w:rPr>
+          <w:rFonts w:ascii="Consolas" w:eastAsia="Times New Roman" w:hAnsi="Consolas" w:cs="Times New Roman"/>
+          <w:color w:val="3B3B3B"/>
+          <w:kern w:val="0"/>
+          <w:sz w:val="21"/>
+          <w:szCs w:val="21"/>
+          <w14:ligatures w14:val="none"/>
+        </w:rPr>
+      </w:pPr>
+      <w:r>
+        <w:rPr>
+          <w:rFonts w:ascii="Consolas" w:eastAsia="Times New Roman" w:hAnsi="Consolas" w:cs="Times New Roman"/>
+          <w:color w:val="000000"/>
+          <w:kern w:val="0"/>
+          <w:sz w:val="21"/>
+          <w:szCs w:val="21"/>
+          <w14:ligatures w14:val="none"/>
+        </w:rPr>
+        <w:t xml:space="preserve">        </w:t>
+      </w:r>
+      <w:r>
+        <w:rPr>
+          <w:rFonts w:ascii="Consolas" w:eastAsia="Times New Roman" w:hAnsi="Consolas" w:cs="Times New Roman"/>
+          <w:color w:val="001080"/>
+          <w:kern w:val="0"/>
+          <w:sz w:val="21"/>
+          <w:szCs w:val="21"/>
+          <w14:ligatures w14:val="none"/>
+        </w:rPr>
+        <w:t>$totalTime</w:t>
+      </w:r>
+      <w:r>
+        <w:rPr>
+          <w:rFonts w:ascii="Consolas" w:eastAsia="Times New Roman" w:hAnsi="Consolas" w:cs="Times New Roman"/>
+          <w:color w:val="000000"/>
+          <w:kern w:val="0"/>
+          <w:sz w:val="21"/>
+          <w:szCs w:val="21"/>
+          <w14:ligatures w14:val="none"/>
+        </w:rPr>
+        <w:t xml:space="preserve"> = (</w:t>
+      </w:r>
+      <w:r>
+        <w:rPr>
+          <w:rFonts w:ascii="Consolas" w:eastAsia="Times New Roman" w:hAnsi="Consolas" w:cs="Times New Roman"/>
+          <w:color w:val="795E26"/>
+          <w:kern w:val="0"/>
+          <w:sz w:val="21"/>
+          <w:szCs w:val="21"/>
+          <w14:ligatures w14:val="none"/>
+        </w:rPr>
+        <w:t>hrtime</w:t>
+      </w:r>
+      <w:r>
+        <w:rPr>
+          <w:rFonts w:ascii="Consolas" w:eastAsia="Times New Roman" w:hAnsi="Consolas" w:cs="Times New Roman"/>
+          <w:color w:val="000000"/>
+          <w:kern w:val="0"/>
+          <w:sz w:val="21"/>
+          <w:szCs w:val="21"/>
+          <w14:ligatures w14:val="none"/>
+        </w:rPr>
+        <w:t>(</w:t>
+      </w:r>
+      <w:r>
+        <w:rPr>
+          <w:rFonts w:ascii="Consolas" w:eastAsia="Times New Roman" w:hAnsi="Consolas" w:cs="Times New Roman"/>
+          <w:color w:val="0000FF"/>
+          <w:kern w:val="0"/>
+          <w:sz w:val="21"/>
+          <w:szCs w:val="21"/>
+          <w14:ligatures w14:val="none"/>
+        </w:rPr>
+        <w:t>true</w:t>
+      </w:r>
+      <w:r>
+        <w:rPr>
+          <w:rFonts w:ascii="Consolas" w:eastAsia="Times New Roman" w:hAnsi="Consolas" w:cs="Times New Roman"/>
+          <w:color w:val="000000"/>
+          <w:kern w:val="0"/>
+          <w:sz w:val="21"/>
+          <w:szCs w:val="21"/>
+          <w14:ligatures w14:val="none"/>
+        </w:rPr>
+        <w:t xml:space="preserve">) - </w:t>
+      </w:r>
+      <w:r>
+        <w:rPr>
+          <w:rFonts w:ascii="Consolas" w:eastAsia="Times New Roman" w:hAnsi="Consolas" w:cs="Times New Roman"/>
+          <w:color w:val="001080"/>
+          <w:kern w:val="0"/>
+          <w:sz w:val="21"/>
+          <w:szCs w:val="21"/>
+          <w14:ligatures w14:val="none"/>
+        </w:rPr>
+        <w:t>$time</w:t>
+      </w:r>
+      <w:r>
+        <w:rPr>
+          <w:rFonts w:ascii="Consolas" w:eastAsia="Times New Roman" w:hAnsi="Consolas" w:cs="Times New Roman"/>
+          <w:color w:val="000000"/>
+          <w:kern w:val="0"/>
+          <w:sz w:val="21"/>
+          <w:szCs w:val="21"/>
+          <w14:ligatures w14:val="none"/>
+        </w:rPr>
+        <w:t xml:space="preserve">) / </w:t>
+      </w:r>
+      <w:r>
+        <w:rPr>
+          <w:rFonts w:ascii="Consolas" w:eastAsia="Times New Roman" w:hAnsi="Consolas" w:cs="Times New Roman"/>
+          <w:color w:val="098658"/>
+          <w:kern w:val="0"/>
+          <w:sz w:val="21"/>
+          <w:szCs w:val="21"/>
+          <w14:ligatures w14:val="none"/>
+        </w:rPr>
+        <w:t>1_000_000</w:t>
+      </w:r>
+      <w:r>
+        <w:rPr>
+          <w:rFonts w:ascii="Consolas" w:eastAsia="Times New Roman" w:hAnsi="Consolas" w:cs="Times New Roman"/>
+          <w:color w:val="000000"/>
+          <w:kern w:val="0"/>
+          <w:sz w:val="21"/>
+          <w:szCs w:val="21"/>
+          <w14:ligatures w14:val="none"/>
+        </w:rPr>
+        <w:t>;</w:t>
+      </w:r>
+    </w:p>
+    <w:p>
+      <w:pPr>
+        <w:shd w:val="clear" w:color="auto" w:fill="FFFFFF"/>
+        <w:spacing w:after="0" w:line="285" w:lineRule="atLeast"/>
+        <w:rPr>
+          <w:rFonts w:ascii="Consolas" w:eastAsia="Times New Roman" w:hAnsi="Consolas" w:cs="Times New Roman"/>
+          <w:color w:val="3B3B3B"/>
+          <w:kern w:val="0"/>
+          <w:sz w:val="21"/>
+          <w:szCs w:val="21"/>
+          <w14:ligatures w14:val="none"/>
+        </w:rPr>
+      </w:pPr>
+      <w:r>
+        <w:rPr>
+          <w:rFonts w:ascii="Consolas" w:eastAsia="Times New Roman" w:hAnsi="Consolas" w:cs="Times New Roman"/>
+          <w:color w:val="000000"/>
+          <w:kern w:val="0"/>
+          <w:sz w:val="21"/>
+          <w:szCs w:val="21"/>
+          <w14:ligatures w14:val="none"/>
+        </w:rPr>
+        <w:t xml:space="preserve">        </w:t>
+      </w:r>
       <w:r>
         <w:rPr>
           <w:rFonts w:ascii="Consolas" w:eastAsia="Times New Roman" w:hAnsi="Consolas" w:cs="Times New Roman"/>
@@ -13451,29 +14892,7 @@
           <w:szCs w:val="21"/>
           <w14:ligatures w14:val="none"/>
         </w:rPr>
-        <w:t>catch</w:t>
-      </w:r>
-      <w:r>
-        <w:rPr>
-          <w:rFonts w:ascii="Consolas" w:eastAsia="Times New Roman" w:hAnsi="Consolas" w:cs="Times New Roman"/>
-          <w:color w:val="000000"/>
-          <w:kern w:val="0"/>
-          <w:sz w:val="21"/>
-          <w:szCs w:val="21"/>
-          <w14:ligatures w14:val="none"/>
-        </w:rPr>
-        <w:t xml:space="preserve"> (</w:t>
-      </w:r>
-      <w:r>
-        <w:rPr>
-          <w:rFonts w:ascii="Consolas" w:eastAsia="Times New Roman" w:hAnsi="Consolas" w:cs="Times New Roman"/>
-          <w:color w:val="267F99"/>
-          <w:kern w:val="0"/>
-          <w:sz w:val="21"/>
-          <w:szCs w:val="21"/>
-          <w14:ligatures w14:val="none"/>
-        </w:rPr>
-        <w:t>TaskTimeoutException</w:t>
+        <w:t>return</w:t>
       </w:r>
       <w:r>
         <w:rPr>
@@ -13486,75 +14905,7 @@
         </w:rPr>
         <w:t xml:space="preserve"> </w:t>
       </w:r>
-      <w:r>
-        <w:rPr>
-          <w:rFonts w:ascii="Consolas" w:eastAsia="Times New Roman" w:hAnsi="Consolas" w:cs="Times New Roman"/>
-          <w:color w:val="001080"/>
-          <w:kern w:val="0"/>
-          <w:sz w:val="21"/>
-          <w:szCs w:val="21"/>
-          <w14:ligatures w14:val="none"/>
-        </w:rPr>
-        <w:t>$e</w:t>
-      </w:r>
-      <w:r>
-        <w:rPr>
-          <w:rFonts w:ascii="Consolas" w:eastAsia="Times New Roman" w:hAnsi="Consolas" w:cs="Times New Roman"/>
-          <w:color w:val="000000"/>
-          <w:kern w:val="0"/>
-          <w:sz w:val="21"/>
-          <w:szCs w:val="21"/>
-          <w14:ligatures w14:val="none"/>
-        </w:rPr>
-        <w:t>) {</w:t>
-      </w:r>
-    </w:p>
-    <w:p>
-      <w:pPr>
-        <w:shd w:val="clear" w:color="auto" w:fill="FFFFFF"/>
-        <w:spacing w:after="0" w:line="285" w:lineRule="atLeast"/>
-        <w:rPr>
-          <w:rFonts w:ascii="Consolas" w:eastAsia="Times New Roman" w:hAnsi="Consolas" w:cs="Times New Roman"/>
-          <w:color w:val="3B3B3B"/>
-          <w:kern w:val="0"/>
-          <w:sz w:val="21"/>
-          <w:szCs w:val="21"/>
-          <w14:ligatures w14:val="none"/>
-        </w:rPr>
-      </w:pPr>
-      <w:r>
-        <w:rPr>
-          <w:rFonts w:ascii="Consolas" w:eastAsia="Times New Roman" w:hAnsi="Consolas" w:cs="Times New Roman"/>
-          <w:color w:val="000000"/>
-          <w:kern w:val="0"/>
-          <w:sz w:val="21"/>
-          <w:szCs w:val="21"/>
-          <w14:ligatures w14:val="none"/>
-        </w:rPr>
-        <w:t xml:space="preserve">            </w:t>
-      </w:r>
-      <w:r>
-        <w:rPr>
-          <w:rFonts w:ascii="Consolas" w:eastAsia="Times New Roman" w:hAnsi="Consolas" w:cs="Times New Roman"/>
-          <w:color w:val="AF00DB"/>
-          <w:kern w:val="0"/>
-          <w:sz w:val="21"/>
-          <w:szCs w:val="21"/>
-          <w14:ligatures w14:val="none"/>
-        </w:rPr>
-        <w:t>return</w:t>
-      </w:r>
-      <w:r>
-        <w:rPr>
-          <w:rFonts w:ascii="Consolas" w:eastAsia="Times New Roman" w:hAnsi="Consolas" w:cs="Times New Roman"/>
-          <w:color w:val="000000"/>
-          <w:kern w:val="0"/>
-          <w:sz w:val="21"/>
-          <w:szCs w:val="21"/>
-          <w14:ligatures w14:val="none"/>
-        </w:rPr>
-        <w:t xml:space="preserve"> </w:t>
-      </w:r>
+      <w:proofErr w:type="gramStart"/>
       <w:r>
         <w:rPr>
           <w:rFonts w:ascii="Consolas" w:eastAsia="Times New Roman" w:hAnsi="Consolas" w:cs="Times New Roman"/>
@@ -13575,8 +14926,21 @@
           <w:szCs w:val="21"/>
           <w14:ligatures w14:val="none"/>
         </w:rPr>
-        <w:t>()-&gt;</w:t>
-      </w:r>
+        <w:t>(</w:t>
+      </w:r>
+      <w:proofErr w:type="gramEnd"/>
+      <w:r>
+        <w:rPr>
+          <w:rFonts w:ascii="Consolas" w:eastAsia="Times New Roman" w:hAnsi="Consolas" w:cs="Times New Roman"/>
+          <w:color w:val="000000"/>
+          <w:kern w:val="0"/>
+          <w:sz w:val="21"/>
+          <w:szCs w:val="21"/>
+          <w14:ligatures w14:val="none"/>
+        </w:rPr>
+        <w:t>)-&gt;</w:t>
+      </w:r>
+      <w:proofErr w:type="gramStart"/>
       <w:r>
         <w:rPr>
           <w:rFonts w:ascii="Consolas" w:eastAsia="Times New Roman" w:hAnsi="Consolas" w:cs="Times New Roman"/>
@@ -13597,374 +14961,19 @@
           <w:szCs w:val="21"/>
           <w14:ligatures w14:val="none"/>
         </w:rPr>
-        <w:t>([</w:t>
-      </w:r>
-    </w:p>
-    <w:p>
-      <w:pPr>
-        <w:shd w:val="clear" w:color="auto" w:fill="FFFFFF"/>
-        <w:spacing w:after="0" w:line="285" w:lineRule="atLeast"/>
-        <w:rPr>
-          <w:rFonts w:ascii="Consolas" w:eastAsia="Times New Roman" w:hAnsi="Consolas" w:cs="Times New Roman"/>
-          <w:color w:val="3B3B3B"/>
-          <w:kern w:val="0"/>
-          <w:sz w:val="21"/>
-          <w:szCs w:val="21"/>
-          <w14:ligatures w14:val="none"/>
-        </w:rPr>
-      </w:pPr>
-      <w:r>
-        <w:rPr>
-          <w:rFonts w:ascii="Consolas" w:eastAsia="Times New Roman" w:hAnsi="Consolas" w:cs="Times New Roman"/>
-          <w:color w:val="000000"/>
-          <w:kern w:val="0"/>
-          <w:sz w:val="21"/>
-          <w:szCs w:val="21"/>
-          <w14:ligatures w14:val="none"/>
-        </w:rPr>
-        <w:t xml:space="preserve">                </w:t>
-      </w:r>
-      <w:r>
-        <w:rPr>
-          <w:rFonts w:ascii="Consolas" w:eastAsia="Times New Roman" w:hAnsi="Consolas" w:cs="Times New Roman"/>
-          <w:color w:val="A31515"/>
-          <w:kern w:val="0"/>
-          <w:sz w:val="21"/>
-          <w:szCs w:val="21"/>
-          <w14:ligatures w14:val="none"/>
-        </w:rPr>
-        <w:t>"msg"</w:t>
-      </w:r>
-      <w:r>
-        <w:rPr>
-          <w:rFonts w:ascii="Consolas" w:eastAsia="Times New Roman" w:hAnsi="Consolas" w:cs="Times New Roman"/>
-          <w:color w:val="000000"/>
-          <w:kern w:val="0"/>
-          <w:sz w:val="21"/>
-          <w:szCs w:val="21"/>
-          <w14:ligatures w14:val="none"/>
-        </w:rPr>
-        <w:t xml:space="preserve"> =&gt; </w:t>
-      </w:r>
-      <w:r>
-        <w:rPr>
-          <w:rFonts w:ascii="Consolas" w:eastAsia="Times New Roman" w:hAnsi="Consolas" w:cs="Times New Roman"/>
-          <w:color w:val="001080"/>
-          <w:kern w:val="0"/>
-          <w:sz w:val="21"/>
-          <w:szCs w:val="21"/>
-          <w14:ligatures w14:val="none"/>
-        </w:rPr>
-        <w:t>$e</w:t>
-      </w:r>
-      <w:r>
-        <w:rPr>
-          <w:rFonts w:ascii="Consolas" w:eastAsia="Times New Roman" w:hAnsi="Consolas" w:cs="Times New Roman"/>
-          <w:color w:val="000000"/>
-          <w:kern w:val="0"/>
-          <w:sz w:val="21"/>
-          <w:szCs w:val="21"/>
-          <w14:ligatures w14:val="none"/>
-        </w:rPr>
-        <w:t>-&gt;</w:t>
-      </w:r>
-      <w:r>
-        <w:rPr>
-          <w:rFonts w:ascii="Consolas" w:eastAsia="Times New Roman" w:hAnsi="Consolas" w:cs="Times New Roman"/>
-          <w:color w:val="795E26"/>
-          <w:kern w:val="0"/>
-          <w:sz w:val="21"/>
-          <w:szCs w:val="21"/>
-          <w14:ligatures w14:val="none"/>
-        </w:rPr>
-        <w:t>getMessage</w:t>
-      </w:r>
-      <w:r>
-        <w:rPr>
-          <w:rFonts w:ascii="Consolas" w:eastAsia="Times New Roman" w:hAnsi="Consolas" w:cs="Times New Roman"/>
-          <w:color w:val="000000"/>
-          <w:kern w:val="0"/>
-          <w:sz w:val="21"/>
-          <w:szCs w:val="21"/>
-          <w14:ligatures w14:val="none"/>
-        </w:rPr>
-        <w:t>(),</w:t>
-      </w:r>
-    </w:p>
-    <w:p>
-      <w:pPr>
-        <w:shd w:val="clear" w:color="auto" w:fill="FFFFFF"/>
-        <w:spacing w:after="0" w:line="285" w:lineRule="atLeast"/>
-        <w:rPr>
-          <w:rFonts w:ascii="Consolas" w:eastAsia="Times New Roman" w:hAnsi="Consolas" w:cs="Times New Roman"/>
-          <w:color w:val="3B3B3B"/>
-          <w:kern w:val="0"/>
-          <w:sz w:val="21"/>
-          <w:szCs w:val="21"/>
-          <w14:ligatures w14:val="none"/>
-        </w:rPr>
-      </w:pPr>
-      <w:r>
-        <w:rPr>
-          <w:rFonts w:ascii="Consolas" w:eastAsia="Times New Roman" w:hAnsi="Consolas" w:cs="Times New Roman"/>
-          <w:color w:val="000000"/>
-          <w:kern w:val="0"/>
-          <w:sz w:val="21"/>
-          <w:szCs w:val="21"/>
-          <w14:ligatures w14:val="none"/>
-        </w:rPr>
-        <w:t>            ]);</w:t>
-      </w:r>
-    </w:p>
-    <w:p>
-      <w:pPr>
-        <w:shd w:val="clear" w:color="auto" w:fill="FFFFFF"/>
-        <w:spacing w:after="0" w:line="285" w:lineRule="atLeast"/>
-        <w:rPr>
-          <w:rFonts w:ascii="Consolas" w:eastAsia="Times New Roman" w:hAnsi="Consolas" w:cs="Times New Roman"/>
-          <w:color w:val="3B3B3B"/>
-          <w:kern w:val="0"/>
-          <w:sz w:val="21"/>
-          <w:szCs w:val="21"/>
-          <w14:ligatures w14:val="none"/>
-        </w:rPr>
-      </w:pPr>
-      <w:r>
-        <w:rPr>
-          <w:rFonts w:ascii="Consolas" w:eastAsia="Times New Roman" w:hAnsi="Consolas" w:cs="Times New Roman"/>
-          <w:color w:val="000000"/>
-          <w:kern w:val="0"/>
-          <w:sz w:val="21"/>
-          <w:szCs w:val="21"/>
-          <w14:ligatures w14:val="none"/>
-        </w:rPr>
-        <w:t>        }</w:t>
-      </w:r>
-    </w:p>
-    <w:p>
-      <w:pPr>
-        <w:shd w:val="clear" w:color="auto" w:fill="FFFFFF"/>
-        <w:spacing w:after="0" w:line="285" w:lineRule="atLeast"/>
-        <w:rPr>
-          <w:rFonts w:ascii="Consolas" w:eastAsia="Times New Roman" w:hAnsi="Consolas" w:cs="Times New Roman"/>
-          <w:color w:val="3B3B3B"/>
-          <w:kern w:val="0"/>
-          <w:sz w:val="21"/>
-          <w:szCs w:val="21"/>
-          <w14:ligatures w14:val="none"/>
-        </w:rPr>
-      </w:pPr>
-      <w:r>
-        <w:rPr>
-          <w:rFonts w:ascii="Consolas" w:eastAsia="Times New Roman" w:hAnsi="Consolas" w:cs="Times New Roman"/>
-          <w:color w:val="000000"/>
-          <w:kern w:val="0"/>
-          <w:sz w:val="21"/>
-          <w:szCs w:val="21"/>
-          <w14:ligatures w14:val="none"/>
-        </w:rPr>
-        <w:t xml:space="preserve">        </w:t>
-      </w:r>
-      <w:r>
-        <w:rPr>
-          <w:rFonts w:ascii="Consolas" w:eastAsia="Times New Roman" w:hAnsi="Consolas" w:cs="Times New Roman"/>
-          <w:color w:val="001080"/>
-          <w:kern w:val="0"/>
-          <w:sz w:val="21"/>
-          <w:szCs w:val="21"/>
-          <w14:ligatures w14:val="none"/>
-        </w:rPr>
-        <w:t>$totalTime</w:t>
-      </w:r>
-      <w:r>
-        <w:rPr>
-          <w:rFonts w:ascii="Consolas" w:eastAsia="Times New Roman" w:hAnsi="Consolas" w:cs="Times New Roman"/>
-          <w:color w:val="000000"/>
-          <w:kern w:val="0"/>
-          <w:sz w:val="21"/>
-          <w:szCs w:val="21"/>
-          <w14:ligatures w14:val="none"/>
-        </w:rPr>
-        <w:t xml:space="preserve"> = (</w:t>
-      </w:r>
-      <w:r>
-        <w:rPr>
-          <w:rFonts w:ascii="Consolas" w:eastAsia="Times New Roman" w:hAnsi="Consolas" w:cs="Times New Roman"/>
-          <w:color w:val="795E26"/>
-          <w:kern w:val="0"/>
-          <w:sz w:val="21"/>
-          <w:szCs w:val="21"/>
-          <w14:ligatures w14:val="none"/>
-        </w:rPr>
-        <w:t>hrtime</w:t>
-      </w:r>
-      <w:r>
-        <w:rPr>
-          <w:rFonts w:ascii="Consolas" w:eastAsia="Times New Roman" w:hAnsi="Consolas" w:cs="Times New Roman"/>
-          <w:color w:val="000000"/>
-          <w:kern w:val="0"/>
-          <w:sz w:val="21"/>
-          <w:szCs w:val="21"/>
-          <w14:ligatures w14:val="none"/>
-        </w:rPr>
         <w:t>(</w:t>
       </w:r>
-      <w:r>
-        <w:rPr>
-          <w:rFonts w:ascii="Consolas" w:eastAsia="Times New Roman" w:hAnsi="Consolas" w:cs="Times New Roman"/>
-          <w:color w:val="0000FF"/>
-          <w:kern w:val="0"/>
-          <w:sz w:val="21"/>
-          <w:szCs w:val="21"/>
-          <w14:ligatures w14:val="none"/>
-        </w:rPr>
-        <w:t>true</w:t>
-      </w:r>
-      <w:r>
-        <w:rPr>
-          <w:rFonts w:ascii="Consolas" w:eastAsia="Times New Roman" w:hAnsi="Consolas" w:cs="Times New Roman"/>
-          <w:color w:val="000000"/>
-          <w:kern w:val="0"/>
-          <w:sz w:val="21"/>
-          <w:szCs w:val="21"/>
-          <w14:ligatures w14:val="none"/>
-        </w:rPr>
-        <w:t xml:space="preserve">) - </w:t>
-      </w:r>
-      <w:r>
-        <w:rPr>
-          <w:rFonts w:ascii="Consolas" w:eastAsia="Times New Roman" w:hAnsi="Consolas" w:cs="Times New Roman"/>
-          <w:color w:val="001080"/>
-          <w:kern w:val="0"/>
-          <w:sz w:val="21"/>
-          <w:szCs w:val="21"/>
-          <w14:ligatures w14:val="none"/>
-        </w:rPr>
-        <w:t>$time</w:t>
-      </w:r>
-      <w:r>
-        <w:rPr>
-          <w:rFonts w:ascii="Consolas" w:eastAsia="Times New Roman" w:hAnsi="Consolas" w:cs="Times New Roman"/>
-          <w:color w:val="000000"/>
-          <w:kern w:val="0"/>
-          <w:sz w:val="21"/>
-          <w:szCs w:val="21"/>
-          <w14:ligatures w14:val="none"/>
-        </w:rPr>
-        <w:t xml:space="preserve">) / </w:t>
-      </w:r>
-      <w:r>
-        <w:rPr>
-          <w:rFonts w:ascii="Consolas" w:eastAsia="Times New Roman" w:hAnsi="Consolas" w:cs="Times New Roman"/>
-          <w:color w:val="098658"/>
-          <w:kern w:val="0"/>
-          <w:sz w:val="21"/>
-          <w:szCs w:val="21"/>
-          <w14:ligatures w14:val="none"/>
-        </w:rPr>
-        <w:t>1_000_000</w:t>
-      </w:r>
-      <w:r>
-        <w:rPr>
-          <w:rFonts w:ascii="Consolas" w:eastAsia="Times New Roman" w:hAnsi="Consolas" w:cs="Times New Roman"/>
-          <w:color w:val="000000"/>
-          <w:kern w:val="0"/>
-          <w:sz w:val="21"/>
-          <w:szCs w:val="21"/>
-          <w14:ligatures w14:val="none"/>
-        </w:rPr>
-        <w:t>;</w:t>
-      </w:r>
-    </w:p>
-    <w:p>
-      <w:pPr>
-        <w:shd w:val="clear" w:color="auto" w:fill="FFFFFF"/>
-        <w:spacing w:after="0" w:line="285" w:lineRule="atLeast"/>
-        <w:rPr>
-          <w:rFonts w:ascii="Consolas" w:eastAsia="Times New Roman" w:hAnsi="Consolas" w:cs="Times New Roman"/>
-          <w:color w:val="3B3B3B"/>
-          <w:kern w:val="0"/>
-          <w:sz w:val="21"/>
-          <w:szCs w:val="21"/>
-          <w14:ligatures w14:val="none"/>
-        </w:rPr>
-      </w:pPr>
-      <w:r>
-        <w:rPr>
-          <w:rFonts w:ascii="Consolas" w:eastAsia="Times New Roman" w:hAnsi="Consolas" w:cs="Times New Roman"/>
-          <w:color w:val="000000"/>
-          <w:kern w:val="0"/>
-          <w:sz w:val="21"/>
-          <w:szCs w:val="21"/>
-          <w14:ligatures w14:val="none"/>
-        </w:rPr>
-        <w:t xml:space="preserve">        </w:t>
-      </w:r>
-      <w:r>
-        <w:rPr>
-          <w:rFonts w:ascii="Consolas" w:eastAsia="Times New Roman" w:hAnsi="Consolas" w:cs="Times New Roman"/>
-          <w:color w:val="AF00DB"/>
-          <w:kern w:val="0"/>
-          <w:sz w:val="21"/>
-          <w:szCs w:val="21"/>
-          <w14:ligatures w14:val="none"/>
-        </w:rPr>
-        <w:t>return</w:t>
-      </w:r>
-      <w:r>
-        <w:rPr>
-          <w:rFonts w:ascii="Consolas" w:eastAsia="Times New Roman" w:hAnsi="Consolas" w:cs="Times New Roman"/>
-          <w:color w:val="000000"/>
-          <w:kern w:val="0"/>
-          <w:sz w:val="21"/>
-          <w:szCs w:val="21"/>
-          <w14:ligatures w14:val="none"/>
-        </w:rPr>
-        <w:t xml:space="preserve"> </w:t>
-      </w:r>
-      <w:r>
-        <w:rPr>
-          <w:rFonts w:ascii="Consolas" w:eastAsia="Times New Roman" w:hAnsi="Consolas" w:cs="Times New Roman"/>
-          <w:color w:val="795E26"/>
-          <w:kern w:val="0"/>
-          <w:sz w:val="21"/>
-          <w:szCs w:val="21"/>
-          <w14:ligatures w14:val="none"/>
-        </w:rPr>
-        <w:t>response</w:t>
-      </w:r>
-      <w:r>
-        <w:rPr>
-          <w:rFonts w:ascii="Consolas" w:eastAsia="Times New Roman" w:hAnsi="Consolas" w:cs="Times New Roman"/>
-          <w:color w:val="000000"/>
-          <w:kern w:val="0"/>
-          <w:sz w:val="21"/>
-          <w:szCs w:val="21"/>
-          <w14:ligatures w14:val="none"/>
-        </w:rPr>
-        <w:t>()-&gt;</w:t>
-      </w:r>
-      <w:r>
-        <w:rPr>
-          <w:rFonts w:ascii="Consolas" w:eastAsia="Times New Roman" w:hAnsi="Consolas" w:cs="Times New Roman"/>
-          <w:color w:val="795E26"/>
-          <w:kern w:val="0"/>
-          <w:sz w:val="21"/>
-          <w:szCs w:val="21"/>
-          <w14:ligatures w14:val="none"/>
-        </w:rPr>
-        <w:t>json</w:t>
-      </w:r>
-      <w:r>
-        <w:rPr>
-          <w:rFonts w:ascii="Consolas" w:eastAsia="Times New Roman" w:hAnsi="Consolas" w:cs="Times New Roman"/>
-          <w:color w:val="000000"/>
-          <w:kern w:val="0"/>
-          <w:sz w:val="21"/>
-          <w:szCs w:val="21"/>
-          <w14:ligatures w14:val="none"/>
-        </w:rPr>
-        <w:t>([</w:t>
+      <w:proofErr w:type="gramEnd"/>
+      <w:r>
+        <w:rPr>
+          <w:rFonts w:ascii="Consolas" w:eastAsia="Times New Roman" w:hAnsi="Consolas" w:cs="Times New Roman"/>
+          <w:color w:val="000000"/>
+          <w:kern w:val="0"/>
+          <w:sz w:val="21"/>
+          <w:szCs w:val="21"/>
+          <w14:ligatures w14:val="none"/>
+        </w:rPr>
+        <w:t>[</w:t>
       </w:r>
     </w:p>
     <w:p>
@@ -14389,6 +15398,183 @@
           <w14:ligatures w14:val="none"/>
         </w:rPr>
       </w:pPr>
+      <w:r>
+        <w:rPr>
+          <w:rFonts w:ascii="Sakkal Majalla" w:eastAsia="Times New Roman" w:hAnsi="Sakkal Majalla" w:cs="Sakkal Majalla"/>
+          <w:b/>
+          <w:bCs/>
+          <w:color w:val="3A7C22" w:themeColor="accent6" w:themeShade="BF"/>
+          <w:kern w:val="0"/>
+          <w:sz w:val="28"/>
+          <w:szCs w:val="28"/>
+          <w14:ligatures w14:val="none"/>
+        </w:rPr>
+        <w:t>Route Caching</w:t>
+      </w:r>
+      <w:r>
+        <w:rPr>
+          <w:rFonts w:ascii="Sakkal Majalla" w:eastAsia="Times New Roman" w:hAnsi="Sakkal Majalla" w:cs="Sakkal Majalla"/>
+          <w:b/>
+          <w:bCs/>
+          <w:color w:val="3B3B3B"/>
+          <w:kern w:val="0"/>
+          <w:sz w:val="28"/>
+          <w:szCs w:val="28"/>
+          <w14:ligatures w14:val="none"/>
+        </w:rPr>
+        <w:t>:</w:t>
+      </w:r>
+      <w:r>
+        <w:rPr>
+          <w:rFonts w:ascii="Sakkal Majalla" w:eastAsia="Times New Roman" w:hAnsi="Sakkal Majalla" w:cs="Sakkal Majalla"/>
+          <w:color w:val="3B3B3B"/>
+          <w:kern w:val="0"/>
+          <w:sz w:val="28"/>
+          <w:szCs w:val="28"/>
+          <w14:ligatures w14:val="none"/>
+        </w:rPr>
+        <w:t xml:space="preserve"> If you define custom routes via </w:t>
+      </w:r>
+      <w:proofErr w:type="gramStart"/>
+      <w:r>
+        <w:rPr>
+          <w:rFonts w:ascii="Sakkal Majalla" w:eastAsia="Times New Roman" w:hAnsi="Sakkal Majalla" w:cs="Sakkal Majalla"/>
+          <w:color w:val="3B3B3B"/>
+          <w:kern w:val="0"/>
+          <w:sz w:val="28"/>
+          <w:szCs w:val="28"/>
+          <w14:ligatures w14:val="none"/>
+        </w:rPr>
+        <w:t>Octane::</w:t>
+      </w:r>
+      <w:proofErr w:type="gramEnd"/>
+      <w:r>
+        <w:rPr>
+          <w:rFonts w:ascii="Sakkal Majalla" w:eastAsia="Times New Roman" w:hAnsi="Sakkal Majalla" w:cs="Sakkal Majalla"/>
+          <w:color w:val="3B3B3B"/>
+          <w:kern w:val="0"/>
+          <w:sz w:val="28"/>
+          <w:szCs w:val="28"/>
+          <w14:ligatures w14:val="none"/>
+        </w:rPr>
+        <w:t xml:space="preserve">route or use dynamic routing, you should avoid using </w:t>
+      </w:r>
+      <w:r>
+        <w:rPr>
+          <w:rFonts w:ascii="Sakkal Majalla" w:eastAsia="Times New Roman" w:hAnsi="Sakkal Majalla" w:cs="Sakkal Majalla"/>
+          <w:b/>
+          <w:bCs/>
+          <w:color w:val="3A7C22" w:themeColor="accent6" w:themeShade="BF"/>
+          <w:kern w:val="0"/>
+          <w:sz w:val="28"/>
+          <w:szCs w:val="28"/>
+          <w14:ligatures w14:val="none"/>
+        </w:rPr>
+        <w:t xml:space="preserve">php </w:t>
+      </w:r>
+      <w:r>
+        <w:rPr>
+          <w:rFonts w:ascii="Sakkal Majalla" w:eastAsia="Times New Roman" w:hAnsi="Sakkal Majalla" w:cs="Sakkal Majalla"/>
+          <w:b/>
+          <w:bCs/>
+          <w:color w:val="C00000"/>
+          <w:kern w:val="0"/>
+          <w:sz w:val="28"/>
+          <w:szCs w:val="28"/>
+          <w14:ligatures w14:val="none"/>
+        </w:rPr>
+        <w:t xml:space="preserve">artisan </w:t>
+      </w:r>
+      <w:proofErr w:type="gramStart"/>
+      <w:r>
+        <w:rPr>
+          <w:rFonts w:ascii="Sakkal Majalla" w:eastAsia="Times New Roman" w:hAnsi="Sakkal Majalla" w:cs="Sakkal Majalla"/>
+          <w:b/>
+          <w:bCs/>
+          <w:color w:val="3A7C22" w:themeColor="accent6" w:themeShade="BF"/>
+          <w:kern w:val="0"/>
+          <w:sz w:val="28"/>
+          <w:szCs w:val="28"/>
+          <w14:ligatures w14:val="none"/>
+        </w:rPr>
+        <w:t>route</w:t>
+      </w:r>
+      <w:r>
+        <w:rPr>
+          <w:rFonts w:ascii="Sakkal Majalla" w:eastAsia="Times New Roman" w:hAnsi="Sakkal Majalla" w:cs="Sakkal Majalla"/>
+          <w:b/>
+          <w:bCs/>
+          <w:color w:val="00B050"/>
+          <w:kern w:val="0"/>
+          <w:sz w:val="28"/>
+          <w:szCs w:val="28"/>
+          <w14:ligatures w14:val="none"/>
+        </w:rPr>
+        <w:t>:</w:t>
+      </w:r>
+      <w:r>
+        <w:rPr>
+          <w:rFonts w:ascii="Sakkal Majalla" w:eastAsia="Times New Roman" w:hAnsi="Sakkal Majalla" w:cs="Sakkal Majalla"/>
+          <w:b/>
+          <w:bCs/>
+          <w:color w:val="002060"/>
+          <w:kern w:val="0"/>
+          <w:sz w:val="28"/>
+          <w:szCs w:val="28"/>
+          <w14:ligatures w14:val="none"/>
+        </w:rPr>
+        <w:t>cache</w:t>
+      </w:r>
+      <w:proofErr w:type="gramEnd"/>
+      <w:r>
+        <w:rPr>
+          <w:rFonts w:ascii="Sakkal Majalla" w:eastAsia="Times New Roman" w:hAnsi="Sakkal Majalla" w:cs="Sakkal Majalla"/>
+          <w:b/>
+          <w:bCs/>
+          <w:color w:val="002060"/>
+          <w:kern w:val="0"/>
+          <w:sz w:val="28"/>
+          <w:szCs w:val="28"/>
+          <w14:ligatures w14:val="none"/>
+        </w:rPr>
+        <w:t>,</w:t>
+      </w:r>
+      <w:r>
+        <w:rPr>
+          <w:rFonts w:ascii="Sakkal Majalla" w:eastAsia="Times New Roman" w:hAnsi="Sakkal Majalla" w:cs="Sakkal Majalla"/>
+          <w:color w:val="002060"/>
+          <w:kern w:val="0"/>
+          <w:sz w:val="28"/>
+          <w:szCs w:val="28"/>
+          <w14:ligatures w14:val="none"/>
+        </w:rPr>
+        <w:t xml:space="preserve"> </w:t>
+      </w:r>
+      <w:r>
+        <w:rPr>
+          <w:rFonts w:ascii="Sakkal Majalla" w:eastAsia="Times New Roman" w:hAnsi="Sakkal Majalla" w:cs="Sakkal Majalla"/>
+          <w:color w:val="3B3B3B"/>
+          <w:kern w:val="0"/>
+          <w:sz w:val="28"/>
+          <w:szCs w:val="28"/>
+          <w14:ligatures w14:val="none"/>
+        </w:rPr>
+        <w:t>as it will break these definitions.</w:t>
+      </w:r>
+    </w:p>
+    <w:p>
+      <w:pPr>
+        <w:ind w:left="720" w:firstLine="720"/>
+        <w:rPr>
+          <w:rFonts w:cs="Sakkal Majalla"/>
+        </w:rPr>
+      </w:pPr>
+      <w:r>
+        <w:rPr>
+          <w:rFonts w:cs="Sakkal Majalla"/>
+        </w:rPr>
+        <w:t>=========================================</w:t>
+      </w:r>
     </w:p>
     <w:p>
       <w:pPr>
@@ -14930,7 +16116,7 @@
   <w:style w:type="paragraph" w:default="1" w:styleId="Normal">
     <w:name w:val="Normal"/>
     <w:qFormat/>
-    <w:rsid w:val="00ED6026"/>
+    <w:rsid w:val="00157464"/>
   </w:style>
   <w:style w:type="paragraph" w:styleId="Heading1">
     <w:name w:val="heading 1"/>

</xml_diff>